<commit_message>
Add note icons per component, popup dialog, and config table generation in Word export
</commit_message>
<xml_diff>
--- a/bin/Debug/net10.0-windows/Marketing_Meeting_Summary_Template.docx
+++ b/bin/Debug/net10.0-windows/Marketing_Meeting_Summary_Template.docx
@@ -21,7 +21,7 @@
           <w:noProof/>
         </w:rPr>
         <w:drawing>
-          <wp:anchor distT="0" distB="0" distL="114300" distR="114300" simplePos="0" relativeHeight="251658240" behindDoc="0" locked="0" layoutInCell="1" allowOverlap="1" wp14:anchorId="4606FF2F" wp14:editId="1D0F78E8">
+          <wp:anchor distT="0" distB="0" distL="114300" distR="114300" simplePos="0" relativeHeight="251658240" behindDoc="0" locked="0" layoutInCell="1" allowOverlap="1" wp14:anchorId="4606FF2F" wp14:editId="0E8AFE38">
             <wp:simplePos x="0" y="0"/>
             <wp:positionH relativeFrom="margin">
               <wp:align>left</wp:align>
@@ -89,21 +89,23 @@
         <w:tabs>
           <w:tab w:val="left" w:pos="8064"/>
         </w:tabs>
-        <w:spacing w:after="80"/>
-        <w:rPr>
-          <w:b/>
-          <w:bCs/>
-          <w:color w:val="0F4761" w:themeColor="accent1" w:themeShade="BF"/>
+        <w:spacing w:after="80" w:line="276" w:lineRule="auto"/>
+        <w:rPr>
+          <w:rFonts w:asciiTheme="majorHAnsi" w:hAnsiTheme="majorHAnsi"/>
+          <w:b/>
+          <w:bCs/>
+          <w:color w:val="082B4D"/>
           <w:sz w:val="40"/>
           <w:szCs w:val="40"/>
         </w:rPr>
       </w:pPr>
       <w:r>
         <w:rPr>
+          <w:rFonts w:asciiTheme="majorHAnsi" w:hAnsiTheme="majorHAnsi"/>
           <w:b/>
           <w:bCs/>
           <w:noProof/>
-          <w:color w:val="156082" w:themeColor="accent1"/>
+          <w:color w:val="082B4D"/>
           <w:sz w:val="40"/>
           <w:szCs w:val="40"/>
         </w:rPr>
@@ -168,9 +170,10 @@
       </w:r>
       <w:r>
         <w:rPr>
-          <w:b/>
-          <w:bCs/>
-          <w:color w:val="0F4761" w:themeColor="accent1" w:themeShade="BF"/>
+          <w:rFonts w:asciiTheme="majorHAnsi" w:hAnsiTheme="majorHAnsi"/>
+          <w:b/>
+          <w:bCs/>
+          <w:color w:val="082B4D"/>
           <w:sz w:val="40"/>
           <w:szCs w:val="40"/>
         </w:rPr>
@@ -190,6 +193,9 @@
       </w:pPr>
       <w:r>
         <w:rPr>
+          <w:rFonts w:asciiTheme="minorHAnsi" w:hAnsiTheme="minorHAnsi"/>
+          <w:b/>
+          <w:bCs/>
           <w:sz w:val="22"/>
           <w:szCs w:val="22"/>
         </w:rPr>
@@ -276,6 +282,9 @@
       </w:r>
       <w:r>
         <w:rPr>
+          <w:rFonts w:asciiTheme="minorHAnsi" w:hAnsiTheme="minorHAnsi"/>
+          <w:b/>
+          <w:bCs/>
           <w:sz w:val="22"/>
           <w:szCs w:val="22"/>
         </w:rPr>
@@ -348,20 +357,33 @@
           <w:sz w:val="22"/>
           <w:szCs w:val="22"/>
         </w:rPr>
-        <w:t xml:space="preserve">  | </w:t>
+        <w:t xml:space="preserve">  </w:t>
       </w:r>
       <w:r>
         <w:rPr>
+          <w:rFonts w:asciiTheme="minorHAnsi" w:hAnsiTheme="minorHAnsi"/>
           <w:b/>
           <w:bCs/>
           <w:color w:val="EE0000"/>
           <w:sz w:val="22"/>
           <w:szCs w:val="22"/>
         </w:rPr>
+        <w:t xml:space="preserve">| </w:t>
+      </w:r>
+      <w:r>
+        <w:rPr>
+          <w:rFonts w:asciiTheme="minorHAnsi" w:hAnsiTheme="minorHAnsi"/>
+          <w:b/>
+          <w:bCs/>
+          <w:color w:val="EE0000"/>
+          <w:sz w:val="22"/>
+          <w:szCs w:val="22"/>
+        </w:rPr>
         <w:t xml:space="preserve">  </w:t>
       </w:r>
       <w:r>
         <w:rPr>
+          <w:rFonts w:asciiTheme="minorHAnsi" w:hAnsiTheme="minorHAnsi"/>
           <w:b/>
           <w:bCs/>
           <w:color w:val="EE0000"/>
@@ -372,6 +394,7 @@
       </w:r>
       <w:r>
         <w:rPr>
+          <w:rFonts w:asciiTheme="minorHAnsi" w:hAnsiTheme="minorHAnsi"/>
           <w:b/>
           <w:bCs/>
           <w:color w:val="EE0000"/>
@@ -382,6 +405,7 @@
       </w:r>
       <w:r>
         <w:rPr>
+          <w:rFonts w:asciiTheme="minorHAnsi" w:hAnsiTheme="minorHAnsi"/>
           <w:b/>
           <w:bCs/>
           <w:color w:val="EE0000"/>
@@ -392,6 +416,9 @@
       </w:r>
       <w:r>
         <w:rPr>
+          <w:rFonts w:asciiTheme="minorHAnsi" w:hAnsiTheme="minorHAnsi"/>
+          <w:b/>
+          <w:bCs/>
           <w:sz w:val="22"/>
           <w:szCs w:val="22"/>
         </w:rPr>
@@ -416,18 +443,6 @@
         </w:rPr>
         <w:t>Paka Number</w:t>
       </w:r>
-    </w:p>
-    <w:p>
-      <w:pPr>
-        <w:spacing w:after="80"/>
-        <w:rPr>
-          <w:b/>
-          <w:bCs/>
-          <w:color w:val="EE0000"/>
-          <w:sz w:val="16"/>
-          <w:szCs w:val="16"/>
-        </w:rPr>
-      </w:pPr>
     </w:p>
     <w:p>
       <w:pPr>
@@ -555,6 +570,9 @@
             </w:pPr>
             <w:r>
               <w:rPr>
+                <w:rFonts w:asciiTheme="minorHAnsi" w:hAnsiTheme="minorHAnsi"/>
+                <w:b/>
+                <w:bCs/>
                 <w:sz w:val="22"/>
                 <w:szCs w:val="22"/>
               </w:rPr>
@@ -562,6 +580,9 @@
             </w:r>
             <w:r>
               <w:rPr>
+                <w:rFonts w:asciiTheme="minorHAnsi" w:hAnsiTheme="minorHAnsi"/>
+                <w:b/>
+                <w:bCs/>
                 <w:sz w:val="22"/>
                 <w:szCs w:val="22"/>
               </w:rPr>
@@ -573,6 +594,13 @@
                 <w:szCs w:val="22"/>
               </w:rPr>
               <w:t xml:space="preserve"> </w:t>
+            </w:r>
+            <w:r>
+              <w:rPr>
+                <w:sz w:val="22"/>
+                <w:szCs w:val="22"/>
+              </w:rPr>
+              <w:t xml:space="preserve">        </w:t>
             </w:r>
             <w:r>
               <w:rPr>
@@ -613,6 +641,9 @@
             </w:pPr>
             <w:r>
               <w:rPr>
+                <w:rFonts w:asciiTheme="minorHAnsi" w:hAnsiTheme="minorHAnsi"/>
+                <w:b/>
+                <w:bCs/>
                 <w:sz w:val="22"/>
                 <w:szCs w:val="22"/>
               </w:rPr>
@@ -620,6 +651,9 @@
             </w:r>
             <w:r>
               <w:rPr>
+                <w:rFonts w:asciiTheme="minorHAnsi" w:hAnsiTheme="minorHAnsi"/>
+                <w:b/>
+                <w:bCs/>
                 <w:sz w:val="22"/>
                 <w:szCs w:val="22"/>
               </w:rPr>
@@ -631,6 +665,13 @@
                 <w:szCs w:val="22"/>
               </w:rPr>
               <w:t xml:space="preserve"> </w:t>
+            </w:r>
+            <w:r>
+              <w:rPr>
+                <w:sz w:val="22"/>
+                <w:szCs w:val="22"/>
+              </w:rPr>
+              <w:t xml:space="preserve">  </w:t>
             </w:r>
             <w:r>
               <w:rPr>
@@ -673,6 +714,9 @@
             </w:pPr>
             <w:r>
               <w:rPr>
+                <w:rFonts w:asciiTheme="minorHAnsi" w:hAnsiTheme="minorHAnsi"/>
+                <w:b/>
+                <w:bCs/>
                 <w:sz w:val="22"/>
                 <w:szCs w:val="22"/>
               </w:rPr>
@@ -680,6 +724,9 @@
             </w:r>
             <w:r>
               <w:rPr>
+                <w:rFonts w:asciiTheme="minorHAnsi" w:hAnsiTheme="minorHAnsi"/>
+                <w:b/>
+                <w:bCs/>
                 <w:sz w:val="22"/>
                 <w:szCs w:val="22"/>
               </w:rPr>
@@ -691,6 +738,13 @@
                 <w:szCs w:val="22"/>
               </w:rPr>
               <w:t xml:space="preserve"> </w:t>
+            </w:r>
+            <w:r>
+              <w:rPr>
+                <w:sz w:val="22"/>
+                <w:szCs w:val="22"/>
+              </w:rPr>
+              <w:t xml:space="preserve">     </w:t>
             </w:r>
             <w:r>
               <w:rPr>
@@ -731,10 +785,22 @@
             </w:pPr>
             <w:r>
               <w:rPr>
+                <w:rFonts w:asciiTheme="minorHAnsi" w:hAnsiTheme="minorHAnsi"/>
+                <w:b/>
+                <w:bCs/>
                 <w:sz w:val="22"/>
                 <w:szCs w:val="22"/>
               </w:rPr>
               <w:t>Penalties:</w:t>
+            </w:r>
+            <w:r>
+              <w:rPr>
+                <w:b/>
+                <w:bCs/>
+                <w:sz w:val="22"/>
+                <w:szCs w:val="22"/>
+              </w:rPr>
+              <w:t xml:space="preserve">           </w:t>
             </w:r>
             <w:r>
               <w:rPr>
@@ -784,10 +850,20 @@
             </w:pPr>
             <w:r>
               <w:rPr>
-                <w:sz w:val="22"/>
-                <w:szCs w:val="22"/>
-              </w:rPr>
-              <w:t xml:space="preserve">Reference Order: </w:t>
+                <w:rFonts w:asciiTheme="minorHAnsi" w:hAnsiTheme="minorHAnsi"/>
+                <w:b/>
+                <w:bCs/>
+                <w:sz w:val="22"/>
+                <w:szCs w:val="22"/>
+              </w:rPr>
+              <w:t>Reference Order:</w:t>
+            </w:r>
+            <w:r>
+              <w:rPr>
+                <w:sz w:val="22"/>
+                <w:szCs w:val="22"/>
+              </w:rPr>
+              <w:t xml:space="preserve"> </w:t>
             </w:r>
             <w:r>
               <w:rPr>
@@ -822,12 +898,18 @@
           <w:p>
             <w:pPr>
               <w:rPr>
+                <w:rFonts w:asciiTheme="minorHAnsi" w:hAnsiTheme="minorHAnsi"/>
+                <w:b/>
+                <w:bCs/>
                 <w:sz w:val="22"/>
                 <w:szCs w:val="22"/>
               </w:rPr>
             </w:pPr>
             <w:r>
               <w:rPr>
+                <w:rFonts w:asciiTheme="minorHAnsi" w:hAnsiTheme="minorHAnsi"/>
+                <w:b/>
+                <w:bCs/>
                 <w:sz w:val="22"/>
                 <w:szCs w:val="22"/>
               </w:rPr>
@@ -933,8 +1015,6 @@
                 <w:b/>
                 <w:bCs/>
                 <w:color w:val="153D63" w:themeColor="text2" w:themeTint="E6"/>
-                <w:sz w:val="22"/>
-                <w:szCs w:val="22"/>
               </w:rPr>
             </w:pPr>
             <w:r>
@@ -942,8 +1022,6 @@
                 <w:b/>
                 <w:bCs/>
                 <w:color w:val="153D63" w:themeColor="text2" w:themeTint="E6"/>
-                <w:sz w:val="22"/>
-                <w:szCs w:val="22"/>
               </w:rPr>
               <w:t>Component</w:t>
             </w:r>
@@ -974,8 +1052,6 @@
                 <w:b/>
                 <w:bCs/>
                 <w:color w:val="153D63" w:themeColor="text2" w:themeTint="E6"/>
-                <w:sz w:val="22"/>
-                <w:szCs w:val="22"/>
               </w:rPr>
             </w:pPr>
             <w:r>
@@ -983,8 +1059,6 @@
                 <w:b/>
                 <w:bCs/>
                 <w:color w:val="153D63" w:themeColor="text2" w:themeTint="E6"/>
-                <w:sz w:val="22"/>
-                <w:szCs w:val="22"/>
               </w:rPr>
               <w:t>Notes</w:t>
             </w:r>
@@ -1038,62 +1112,6 @@
               <w:top w:val="single" w:sz="2" w:space="0" w:color="AAAAAA"/>
               <w:left w:val="single" w:sz="4" w:space="0" w:color="auto"/>
               <w:bottom w:val="single" w:sz="2" w:space="0" w:color="AAAAAA"/>
-              <w:right w:val="single" w:sz="4" w:space="0" w:color="auto"/>
-            </w:tcBorders>
-            <w:shd w:val="clear" w:color="auto" w:fill="F7F7F7"/>
-            <w:tcMar>
-              <w:top w:w="80" w:type="dxa"/>
-              <w:left w:w="120" w:type="dxa"/>
-              <w:bottom w:w="80" w:type="dxa"/>
-              <w:right w:w="120" w:type="dxa"/>
-            </w:tcMar>
-            <w:vAlign w:val="center"/>
-          </w:tcPr>
-          <w:p>
-            <w:pPr>
-              <w:rPr>
-                <w:sz w:val="22"/>
-                <w:szCs w:val="22"/>
-              </w:rPr>
-            </w:pPr>
-          </w:p>
-        </w:tc>
-      </w:tr>
-      <w:tr>
-        <w:tc>
-          <w:tcPr>
-            <w:tcW w:w="4677" w:type="dxa"/>
-            <w:tcBorders>
-              <w:top w:val="single" w:sz="2" w:space="0" w:color="AAAAAA"/>
-              <w:left w:val="single" w:sz="4" w:space="0" w:color="auto"/>
-              <w:bottom w:val="single" w:sz="4" w:space="0" w:color="auto"/>
-              <w:right w:val="single" w:sz="4" w:space="0" w:color="auto"/>
-            </w:tcBorders>
-            <w:shd w:val="clear" w:color="auto" w:fill="F7F7F7"/>
-            <w:tcMar>
-              <w:top w:w="80" w:type="dxa"/>
-              <w:left w:w="120" w:type="dxa"/>
-              <w:bottom w:w="80" w:type="dxa"/>
-              <w:right w:w="120" w:type="dxa"/>
-            </w:tcMar>
-            <w:vAlign w:val="center"/>
-          </w:tcPr>
-          <w:p>
-            <w:pPr>
-              <w:rPr>
-                <w:sz w:val="22"/>
-                <w:szCs w:val="22"/>
-              </w:rPr>
-            </w:pPr>
-          </w:p>
-        </w:tc>
-        <w:tc>
-          <w:tcPr>
-            <w:tcW w:w="6095" w:type="dxa"/>
-            <w:tcBorders>
-              <w:top w:val="single" w:sz="2" w:space="0" w:color="AAAAAA"/>
-              <w:left w:val="single" w:sz="4" w:space="0" w:color="auto"/>
-              <w:bottom w:val="single" w:sz="4" w:space="0" w:color="auto"/>
               <w:right w:val="single" w:sz="4" w:space="0" w:color="auto"/>
             </w:tcBorders>
             <w:shd w:val="clear" w:color="auto" w:fill="F7F7F7"/>
@@ -1218,18 +1236,12 @@
           <w:p>
             <w:pPr>
               <w:jc w:val="center"/>
-              <w:rPr>
-                <w:sz w:val="22"/>
-                <w:szCs w:val="22"/>
-              </w:rPr>
             </w:pPr>
             <w:r>
               <w:rPr>
                 <w:b/>
                 <w:bCs/>
                 <w:color w:val="153D63" w:themeColor="text2" w:themeTint="E6"/>
-                <w:sz w:val="22"/>
-                <w:szCs w:val="22"/>
               </w:rPr>
               <w:t>Target</w:t>
             </w:r>
@@ -1255,18 +1267,12 @@
           <w:p>
             <w:pPr>
               <w:jc w:val="center"/>
-              <w:rPr>
-                <w:sz w:val="22"/>
-                <w:szCs w:val="22"/>
-              </w:rPr>
             </w:pPr>
             <w:r>
               <w:rPr>
                 <w:b/>
                 <w:bCs/>
                 <w:color w:val="153D63" w:themeColor="text2" w:themeTint="E6"/>
-                <w:sz w:val="22"/>
-                <w:szCs w:val="22"/>
               </w:rPr>
               <w:t>QTY</w:t>
             </w:r>
@@ -1287,18 +1293,12 @@
           <w:p>
             <w:pPr>
               <w:jc w:val="center"/>
-              <w:rPr>
-                <w:sz w:val="22"/>
-                <w:szCs w:val="22"/>
-              </w:rPr>
             </w:pPr>
             <w:r>
               <w:rPr>
                 <w:b/>
                 <w:bCs/>
                 <w:color w:val="153D63" w:themeColor="text2" w:themeTint="E6"/>
-                <w:sz w:val="22"/>
-                <w:szCs w:val="22"/>
               </w:rPr>
               <w:t>Size</w:t>
             </w:r>
@@ -1406,159 +1406,52 @@
           </w:p>
         </w:tc>
       </w:tr>
-      <w:tr>
-        <w:tc>
-          <w:tcPr>
-            <w:tcW w:w="4110" w:type="dxa"/>
-            <w:tcBorders>
-              <w:top w:val="single" w:sz="2" w:space="0" w:color="AAAAAA"/>
-              <w:left w:val="single" w:sz="4" w:space="0" w:color="auto"/>
-              <w:bottom w:val="single" w:sz="2" w:space="0" w:color="AAAAAA"/>
-              <w:right w:val="single" w:sz="4" w:space="0" w:color="auto"/>
-            </w:tcBorders>
-            <w:shd w:val="clear" w:color="auto" w:fill="F7F7F7"/>
-            <w:tcMar>
-              <w:top w:w="80" w:type="dxa"/>
-              <w:left w:w="120" w:type="dxa"/>
-              <w:bottom w:w="80" w:type="dxa"/>
-              <w:right w:w="120" w:type="dxa"/>
-            </w:tcMar>
-            <w:vAlign w:val="center"/>
-          </w:tcPr>
-          <w:p>
-            <w:pPr>
-              <w:rPr>
-                <w:sz w:val="22"/>
-                <w:szCs w:val="22"/>
-              </w:rPr>
-            </w:pPr>
-          </w:p>
-        </w:tc>
-        <w:tc>
-          <w:tcPr>
-            <w:tcW w:w="2126" w:type="dxa"/>
-            <w:tcBorders>
-              <w:top w:val="single" w:sz="2" w:space="0" w:color="AAAAAA"/>
-              <w:left w:val="single" w:sz="4" w:space="0" w:color="auto"/>
-              <w:bottom w:val="single" w:sz="2" w:space="0" w:color="AAAAAA"/>
-              <w:right w:val="single" w:sz="4" w:space="0" w:color="auto"/>
-            </w:tcBorders>
-            <w:shd w:val="clear" w:color="auto" w:fill="F7F7F7"/>
-            <w:tcMar>
-              <w:top w:w="80" w:type="dxa"/>
-              <w:left w:w="120" w:type="dxa"/>
-              <w:bottom w:w="80" w:type="dxa"/>
-              <w:right w:w="120" w:type="dxa"/>
-            </w:tcMar>
-            <w:vAlign w:val="center"/>
-          </w:tcPr>
-          <w:p>
-            <w:pPr>
-              <w:rPr>
-                <w:sz w:val="22"/>
-                <w:szCs w:val="22"/>
-              </w:rPr>
-            </w:pPr>
-          </w:p>
-        </w:tc>
-        <w:tc>
-          <w:tcPr>
-            <w:tcW w:w="4536" w:type="dxa"/>
-            <w:tcBorders>
-              <w:top w:val="single" w:sz="2" w:space="0" w:color="AAAAAA"/>
-              <w:left w:val="single" w:sz="4" w:space="0" w:color="auto"/>
-              <w:bottom w:val="single" w:sz="2" w:space="0" w:color="AAAAAA"/>
-              <w:right w:val="single" w:sz="4" w:space="0" w:color="auto"/>
-            </w:tcBorders>
-            <w:shd w:val="clear" w:color="auto" w:fill="F7F7F7"/>
-          </w:tcPr>
-          <w:p>
-            <w:pPr>
-              <w:rPr>
-                <w:sz w:val="22"/>
-                <w:szCs w:val="22"/>
-              </w:rPr>
-            </w:pPr>
-          </w:p>
-        </w:tc>
-      </w:tr>
-      <w:tr>
-        <w:tc>
-          <w:tcPr>
-            <w:tcW w:w="4110" w:type="dxa"/>
-            <w:tcBorders>
-              <w:top w:val="single" w:sz="2" w:space="0" w:color="AAAAAA"/>
-              <w:left w:val="single" w:sz="4" w:space="0" w:color="auto"/>
-              <w:bottom w:val="single" w:sz="4" w:space="0" w:color="auto"/>
-              <w:right w:val="single" w:sz="4" w:space="0" w:color="auto"/>
-            </w:tcBorders>
-            <w:shd w:val="clear" w:color="auto" w:fill="F7F7F7"/>
-            <w:tcMar>
-              <w:top w:w="80" w:type="dxa"/>
-              <w:left w:w="120" w:type="dxa"/>
-              <w:bottom w:w="80" w:type="dxa"/>
-              <w:right w:w="120" w:type="dxa"/>
-            </w:tcMar>
-            <w:vAlign w:val="center"/>
-          </w:tcPr>
-          <w:p>
-            <w:pPr>
-              <w:rPr>
-                <w:sz w:val="22"/>
-                <w:szCs w:val="22"/>
-              </w:rPr>
-            </w:pPr>
-          </w:p>
-        </w:tc>
-        <w:tc>
-          <w:tcPr>
-            <w:tcW w:w="2126" w:type="dxa"/>
-            <w:tcBorders>
-              <w:top w:val="single" w:sz="2" w:space="0" w:color="AAAAAA"/>
-              <w:left w:val="single" w:sz="4" w:space="0" w:color="auto"/>
-              <w:bottom w:val="single" w:sz="4" w:space="0" w:color="auto"/>
-              <w:right w:val="single" w:sz="4" w:space="0" w:color="auto"/>
-            </w:tcBorders>
-            <w:shd w:val="clear" w:color="auto" w:fill="F7F7F7"/>
-            <w:tcMar>
-              <w:top w:w="80" w:type="dxa"/>
-              <w:left w:w="120" w:type="dxa"/>
-              <w:bottom w:w="80" w:type="dxa"/>
-              <w:right w:w="120" w:type="dxa"/>
-            </w:tcMar>
-            <w:vAlign w:val="center"/>
-          </w:tcPr>
-          <w:p>
-            <w:pPr>
-              <w:rPr>
-                <w:sz w:val="22"/>
-                <w:szCs w:val="22"/>
-              </w:rPr>
-            </w:pPr>
-          </w:p>
-        </w:tc>
-        <w:tc>
-          <w:tcPr>
-            <w:tcW w:w="4536" w:type="dxa"/>
-            <w:tcBorders>
-              <w:top w:val="single" w:sz="2" w:space="0" w:color="AAAAAA"/>
-              <w:left w:val="single" w:sz="4" w:space="0" w:color="auto"/>
-              <w:bottom w:val="single" w:sz="4" w:space="0" w:color="auto"/>
-              <w:right w:val="single" w:sz="4" w:space="0" w:color="auto"/>
-            </w:tcBorders>
-            <w:shd w:val="clear" w:color="auto" w:fill="F7F7F7"/>
-          </w:tcPr>
-          <w:p>
-            <w:pPr>
-              <w:rPr>
-                <w:sz w:val="22"/>
-                <w:szCs w:val="22"/>
-              </w:rPr>
-            </w:pPr>
-          </w:p>
-        </w:tc>
-      </w:tr>
     </w:tbl>
+    <w:p>
+      <w:pPr>
+        <w:pBdr>
+          <w:bottom w:val="single" w:sz="10" w:space="4" w:color="1F4E79"/>
+        </w:pBdr>
+        <w:spacing w:before="320" w:after="160"/>
+        <w:rPr>
+          <w:b/>
+          <w:bCs/>
+          <w:color w:val="1F4E79"/>
+          <w:sz w:val="26"/>
+          <w:szCs w:val="26"/>
+        </w:rPr>
+      </w:pPr>
+    </w:p>
+    <w:p>
+      <w:pPr>
+        <w:pBdr>
+          <w:bottom w:val="single" w:sz="10" w:space="4" w:color="1F4E79"/>
+        </w:pBdr>
+        <w:spacing w:before="320" w:after="160"/>
+        <w:rPr>
+          <w:b/>
+          <w:bCs/>
+          <w:color w:val="1F4E79"/>
+          <w:sz w:val="26"/>
+          <w:szCs w:val="26"/>
+        </w:rPr>
+      </w:pPr>
+    </w:p>
+    <w:p>
+      <w:pPr>
+        <w:pBdr>
+          <w:bottom w:val="single" w:sz="10" w:space="4" w:color="1F4E79"/>
+        </w:pBdr>
+        <w:spacing w:before="320" w:after="160"/>
+        <w:rPr>
+          <w:b/>
+          <w:bCs/>
+          <w:color w:val="1F4E79"/>
+          <w:sz w:val="26"/>
+          <w:szCs w:val="26"/>
+        </w:rPr>
+      </w:pPr>
+    </w:p>
     <w:p>
       <w:pPr>
         <w:pBdr>
@@ -3160,12 +3053,8 @@
       </w:pPr>
     </w:p>
     <w:sectPr>
-      <w:headerReference w:type="even" r:id="rId8"/>
-      <w:headerReference w:type="default" r:id="rId9"/>
-      <w:footerReference w:type="even" r:id="rId10"/>
-      <w:footerReference w:type="default" r:id="rId11"/>
-      <w:headerReference w:type="first" r:id="rId12"/>
-      <w:footerReference w:type="first" r:id="rId13"/>
+      <w:headerReference w:type="default" r:id="rId8"/>
+      <w:footerReference w:type="default" r:id="rId9"/>
       <w:pgSz w:w="11906" w:h="16838"/>
       <w:pgMar w:top="567" w:right="567" w:bottom="1134" w:left="567" w:header="340" w:footer="454" w:gutter="0"/>
       <w:cols w:space="720"/>
@@ -3195,16 +3084,6 @@
 </file>
 
 <file path=word/footer1.xml><?xml version="1.0" encoding="utf-8"?>
-<w:ftr xmlns:wpc="http://schemas.microsoft.com/office/word/2010/wordprocessingCanvas" xmlns:cx="http://schemas.microsoft.com/office/drawing/2014/chartex" xmlns:cx1="http://schemas.microsoft.com/office/drawing/2015/9/8/chartex" xmlns:cx2="http://schemas.microsoft.com/office/drawing/2015/10/21/chartex" xmlns:cx3="http://schemas.microsoft.com/office/drawing/2016/5/9/chartex" xmlns:cx4="http://schemas.microsoft.com/office/drawing/2016/5/10/chartex" xmlns:cx5="http://schemas.microsoft.com/office/drawing/2016/5/11/chartex" xmlns:cx6="http://schemas.microsoft.com/office/drawing/2016/5/12/chartex" xmlns:cx7="http://schemas.microsoft.com/office/drawing/2016/5/13/chartex" xmlns:cx8="http://schemas.microsoft.com/office/drawing/2016/5/14/chartex" xmlns:mc="http://schemas.openxmlformats.org/markup-compatibility/2006" xmlns:aink="http://schemas.microsoft.com/office/drawing/2016/ink" xmlns:am3d="http://schemas.microsoft.com/office/drawing/2017/model3d" xmlns:o="urn:schemas-microsoft-com:office:office" xmlns:oel="http://schemas.microsoft.com/office/2019/extlst" xmlns:r="http://schemas.openxmlformats.org/officeDocument/2006/relationships" xmlns:m="http://schemas.openxmlformats.org/officeDocument/2006/math" xmlns:v="urn:schemas-microsoft-com:vml" xmlns:wp14="http://schemas.microsoft.com/office/word/2010/wordprocessingDrawing" xmlns:wp="http://schemas.openxmlformats.org/drawingml/2006/wordprocessingDrawing" xmlns:w10="urn:schemas-microsoft-com:office:word" xmlns:w="http://schemas.openxmlformats.org/wordprocessingml/2006/main" xmlns:w14="http://schemas.microsoft.com/office/word/2010/wordml" xmlns:w15="http://schemas.microsoft.com/office/word/2012/wordml" xmlns:w16cex="http://schemas.microsoft.com/office/word/2018/wordml/cex" xmlns:w16cid="http://schemas.microsoft.com/office/word/2016/wordml/cid" xmlns:w16="http://schemas.microsoft.com/office/word/2018/wordml" xmlns:w16du="http://schemas.microsoft.com/office/word/2023/wordml/word16du" xmlns:w16sdtdh="http://schemas.microsoft.com/office/word/2020/wordml/sdtdatahash" xmlns:w16sdtfl="http://schemas.microsoft.com/office/word/2024/wordml/sdtformatlock" xmlns:w16se="http://schemas.microsoft.com/office/word/2015/wordml/symex" xmlns:wpg="http://schemas.microsoft.com/office/word/2010/wordprocessingGroup" xmlns:wpi="http://schemas.microsoft.com/office/word/2010/wordprocessingInk" xmlns:wne="http://schemas.microsoft.com/office/word/2006/wordml" xmlns:wps="http://schemas.microsoft.com/office/word/2010/wordprocessingShape" mc:Ignorable="w14 w15 w16se w16cid w16 w16cex w16sdtdh w16sdtfl w16du wp14">
-  <w:p>
-    <w:pPr>
-      <w:pStyle w:val="Footer"/>
-    </w:pPr>
-  </w:p>
-</w:ftr>
-</file>
-
-<file path=word/footer2.xml><?xml version="1.0" encoding="utf-8"?>
 <w:ftr xmlns:wpc="http://schemas.microsoft.com/office/word/2010/wordprocessingCanvas" xmlns:cx="http://schemas.microsoft.com/office/drawing/2014/chartex" xmlns:cx1="http://schemas.microsoft.com/office/drawing/2015/9/8/chartex" xmlns:cx2="http://schemas.microsoft.com/office/drawing/2015/10/21/chartex" xmlns:cx3="http://schemas.microsoft.com/office/drawing/2016/5/9/chartex" xmlns:cx4="http://schemas.microsoft.com/office/drawing/2016/5/10/chartex" xmlns:cx5="http://schemas.microsoft.com/office/drawing/2016/5/11/chartex" xmlns:cx6="http://schemas.microsoft.com/office/drawing/2016/5/12/chartex" xmlns:cx7="http://schemas.microsoft.com/office/drawing/2016/5/13/chartex" xmlns:cx8="http://schemas.microsoft.com/office/drawing/2016/5/14/chartex" xmlns:mc="http://schemas.openxmlformats.org/markup-compatibility/2006" xmlns:aink="http://schemas.microsoft.com/office/drawing/2016/ink" xmlns:am3d="http://schemas.microsoft.com/office/drawing/2017/model3d" xmlns:o="urn:schemas-microsoft-com:office:office" xmlns:oel="http://schemas.microsoft.com/office/2019/extlst" xmlns:r="http://schemas.openxmlformats.org/officeDocument/2006/relationships" xmlns:m="http://schemas.openxmlformats.org/officeDocument/2006/math" xmlns:v="urn:schemas-microsoft-com:vml" xmlns:wp14="http://schemas.microsoft.com/office/word/2010/wordprocessingDrawing" xmlns:wp="http://schemas.openxmlformats.org/drawingml/2006/wordprocessingDrawing" xmlns:w10="urn:schemas-microsoft-com:office:word" xmlns:w="http://schemas.openxmlformats.org/wordprocessingml/2006/main" xmlns:w14="http://schemas.microsoft.com/office/word/2010/wordml" xmlns:w15="http://schemas.microsoft.com/office/word/2012/wordml" xmlns:w16cex="http://schemas.microsoft.com/office/word/2018/wordml/cex" xmlns:w16cid="http://schemas.microsoft.com/office/word/2016/wordml/cid" xmlns:w16="http://schemas.microsoft.com/office/word/2018/wordml" xmlns:w16du="http://schemas.microsoft.com/office/word/2023/wordml/word16du" xmlns:w16sdtdh="http://schemas.microsoft.com/office/word/2020/wordml/sdtdatahash" xmlns:w16sdtfl="http://schemas.microsoft.com/office/word/2024/wordml/sdtformatlock" xmlns:w16se="http://schemas.microsoft.com/office/word/2015/wordml/symex" xmlns:wpg="http://schemas.microsoft.com/office/word/2010/wordprocessingGroup" xmlns:wpi="http://schemas.microsoft.com/office/word/2010/wordprocessingInk" xmlns:wne="http://schemas.microsoft.com/office/word/2006/wordml" xmlns:wps="http://schemas.microsoft.com/office/word/2010/wordprocessingShape" mc:Ignorable="w14 w15 w16se w16cid w16 w16cex w16sdtdh w16sdtfl w16du wp14">
   <w:p>
     <w:pPr>
@@ -3352,16 +3231,6 @@
 </w:ftr>
 </file>
 
-<file path=word/footer3.xml><?xml version="1.0" encoding="utf-8"?>
-<w:ftr xmlns:wpc="http://schemas.microsoft.com/office/word/2010/wordprocessingCanvas" xmlns:cx="http://schemas.microsoft.com/office/drawing/2014/chartex" xmlns:cx1="http://schemas.microsoft.com/office/drawing/2015/9/8/chartex" xmlns:cx2="http://schemas.microsoft.com/office/drawing/2015/10/21/chartex" xmlns:cx3="http://schemas.microsoft.com/office/drawing/2016/5/9/chartex" xmlns:cx4="http://schemas.microsoft.com/office/drawing/2016/5/10/chartex" xmlns:cx5="http://schemas.microsoft.com/office/drawing/2016/5/11/chartex" xmlns:cx6="http://schemas.microsoft.com/office/drawing/2016/5/12/chartex" xmlns:cx7="http://schemas.microsoft.com/office/drawing/2016/5/13/chartex" xmlns:cx8="http://schemas.microsoft.com/office/drawing/2016/5/14/chartex" xmlns:mc="http://schemas.openxmlformats.org/markup-compatibility/2006" xmlns:aink="http://schemas.microsoft.com/office/drawing/2016/ink" xmlns:am3d="http://schemas.microsoft.com/office/drawing/2017/model3d" xmlns:o="urn:schemas-microsoft-com:office:office" xmlns:oel="http://schemas.microsoft.com/office/2019/extlst" xmlns:r="http://schemas.openxmlformats.org/officeDocument/2006/relationships" xmlns:m="http://schemas.openxmlformats.org/officeDocument/2006/math" xmlns:v="urn:schemas-microsoft-com:vml" xmlns:wp14="http://schemas.microsoft.com/office/word/2010/wordprocessingDrawing" xmlns:wp="http://schemas.openxmlformats.org/drawingml/2006/wordprocessingDrawing" xmlns:w10="urn:schemas-microsoft-com:office:word" xmlns:w="http://schemas.openxmlformats.org/wordprocessingml/2006/main" xmlns:w14="http://schemas.microsoft.com/office/word/2010/wordml" xmlns:w15="http://schemas.microsoft.com/office/word/2012/wordml" xmlns:w16cex="http://schemas.microsoft.com/office/word/2018/wordml/cex" xmlns:w16cid="http://schemas.microsoft.com/office/word/2016/wordml/cid" xmlns:w16="http://schemas.microsoft.com/office/word/2018/wordml" xmlns:w16du="http://schemas.microsoft.com/office/word/2023/wordml/word16du" xmlns:w16sdtdh="http://schemas.microsoft.com/office/word/2020/wordml/sdtdatahash" xmlns:w16sdtfl="http://schemas.microsoft.com/office/word/2024/wordml/sdtformatlock" xmlns:w16se="http://schemas.microsoft.com/office/word/2015/wordml/symex" xmlns:wpg="http://schemas.microsoft.com/office/word/2010/wordprocessingGroup" xmlns:wpi="http://schemas.microsoft.com/office/word/2010/wordprocessingInk" xmlns:wne="http://schemas.microsoft.com/office/word/2006/wordml" xmlns:wps="http://schemas.microsoft.com/office/word/2010/wordprocessingShape" mc:Ignorable="w14 w15 w16se w16cid w16 w16cex w16sdtdh w16sdtfl w16du wp14">
-  <w:p>
-    <w:pPr>
-      <w:pStyle w:val="Footer"/>
-    </w:pPr>
-  </w:p>
-</w:ftr>
-</file>
-
 <file path=word/footnotes.xml><?xml version="1.0" encoding="utf-8"?>
 <w:footnotes xmlns:wpc="http://schemas.microsoft.com/office/word/2010/wordprocessingCanvas" xmlns:cx="http://schemas.microsoft.com/office/drawing/2014/chartex" xmlns:cx1="http://schemas.microsoft.com/office/drawing/2015/9/8/chartex" xmlns:cx2="http://schemas.microsoft.com/office/drawing/2015/10/21/chartex" xmlns:cx3="http://schemas.microsoft.com/office/drawing/2016/5/9/chartex" xmlns:cx4="http://schemas.microsoft.com/office/drawing/2016/5/10/chartex" xmlns:cx5="http://schemas.microsoft.com/office/drawing/2016/5/11/chartex" xmlns:cx6="http://schemas.microsoft.com/office/drawing/2016/5/12/chartex" xmlns:cx7="http://schemas.microsoft.com/office/drawing/2016/5/13/chartex" xmlns:cx8="http://schemas.microsoft.com/office/drawing/2016/5/14/chartex" xmlns:mc="http://schemas.openxmlformats.org/markup-compatibility/2006" xmlns:aink="http://schemas.microsoft.com/office/drawing/2016/ink" xmlns:am3d="http://schemas.microsoft.com/office/drawing/2017/model3d" xmlns:o="urn:schemas-microsoft-com:office:office" xmlns:oel="http://schemas.microsoft.com/office/2019/extlst" xmlns:r="http://schemas.openxmlformats.org/officeDocument/2006/relationships" xmlns:m="http://schemas.openxmlformats.org/officeDocument/2006/math" xmlns:v="urn:schemas-microsoft-com:vml" xmlns:wp14="http://schemas.microsoft.com/office/word/2010/wordprocessingDrawing" xmlns:wp="http://schemas.openxmlformats.org/drawingml/2006/wordprocessingDrawing" xmlns:w10="urn:schemas-microsoft-com:office:word" xmlns:w="http://schemas.openxmlformats.org/wordprocessingml/2006/main" xmlns:w14="http://schemas.microsoft.com/office/word/2010/wordml" xmlns:w15="http://schemas.microsoft.com/office/word/2012/wordml" xmlns:w16cex="http://schemas.microsoft.com/office/word/2018/wordml/cex" xmlns:w16cid="http://schemas.microsoft.com/office/word/2016/wordml/cid" xmlns:w16="http://schemas.microsoft.com/office/word/2018/wordml" xmlns:w16du="http://schemas.microsoft.com/office/word/2023/wordml/word16du" xmlns:w16sdtdh="http://schemas.microsoft.com/office/word/2020/wordml/sdtdatahash" xmlns:w16sdtfl="http://schemas.microsoft.com/office/word/2024/wordml/sdtformatlock" xmlns:w16se="http://schemas.microsoft.com/office/word/2015/wordml/symex" xmlns:wpg="http://schemas.microsoft.com/office/word/2010/wordprocessingGroup" xmlns:wpi="http://schemas.microsoft.com/office/word/2010/wordprocessingInk" xmlns:wne="http://schemas.microsoft.com/office/word/2006/wordml" xmlns:wps="http://schemas.microsoft.com/office/word/2010/wordprocessingShape" mc:Ignorable="w14 w15 w16se w16cid w16 w16cex w16sdtdh w16sdtfl w16du wp14">
   <w:footnote w:type="separator" w:id="-1">
@@ -3383,28 +3252,10 @@
 
 <file path=word/header1.xml><?xml version="1.0" encoding="utf-8"?>
 <w:hdr xmlns:wpc="http://schemas.microsoft.com/office/word/2010/wordprocessingCanvas" xmlns:cx="http://schemas.microsoft.com/office/drawing/2014/chartex" xmlns:cx1="http://schemas.microsoft.com/office/drawing/2015/9/8/chartex" xmlns:cx2="http://schemas.microsoft.com/office/drawing/2015/10/21/chartex" xmlns:cx3="http://schemas.microsoft.com/office/drawing/2016/5/9/chartex" xmlns:cx4="http://schemas.microsoft.com/office/drawing/2016/5/10/chartex" xmlns:cx5="http://schemas.microsoft.com/office/drawing/2016/5/11/chartex" xmlns:cx6="http://schemas.microsoft.com/office/drawing/2016/5/12/chartex" xmlns:cx7="http://schemas.microsoft.com/office/drawing/2016/5/13/chartex" xmlns:cx8="http://schemas.microsoft.com/office/drawing/2016/5/14/chartex" xmlns:mc="http://schemas.openxmlformats.org/markup-compatibility/2006" xmlns:aink="http://schemas.microsoft.com/office/drawing/2016/ink" xmlns:am3d="http://schemas.microsoft.com/office/drawing/2017/model3d" xmlns:o="urn:schemas-microsoft-com:office:office" xmlns:oel="http://schemas.microsoft.com/office/2019/extlst" xmlns:r="http://schemas.openxmlformats.org/officeDocument/2006/relationships" xmlns:m="http://schemas.openxmlformats.org/officeDocument/2006/math" xmlns:v="urn:schemas-microsoft-com:vml" xmlns:wp14="http://schemas.microsoft.com/office/word/2010/wordprocessingDrawing" xmlns:wp="http://schemas.openxmlformats.org/drawingml/2006/wordprocessingDrawing" xmlns:w10="urn:schemas-microsoft-com:office:word" xmlns:w="http://schemas.openxmlformats.org/wordprocessingml/2006/main" xmlns:w14="http://schemas.microsoft.com/office/word/2010/wordml" xmlns:w15="http://schemas.microsoft.com/office/word/2012/wordml" xmlns:w16cex="http://schemas.microsoft.com/office/word/2018/wordml/cex" xmlns:w16cid="http://schemas.microsoft.com/office/word/2016/wordml/cid" xmlns:w16="http://schemas.microsoft.com/office/word/2018/wordml" xmlns:w16du="http://schemas.microsoft.com/office/word/2023/wordml/word16du" xmlns:w16sdtdh="http://schemas.microsoft.com/office/word/2020/wordml/sdtdatahash" xmlns:w16sdtfl="http://schemas.microsoft.com/office/word/2024/wordml/sdtformatlock" xmlns:w16se="http://schemas.microsoft.com/office/word/2015/wordml/symex" xmlns:wpg="http://schemas.microsoft.com/office/word/2010/wordprocessingGroup" xmlns:wpi="http://schemas.microsoft.com/office/word/2010/wordprocessingInk" xmlns:wne="http://schemas.microsoft.com/office/word/2006/wordml" xmlns:wps="http://schemas.microsoft.com/office/word/2010/wordprocessingShape" mc:Ignorable="w14 w15 w16se w16cid w16 w16cex w16sdtdh w16sdtfl w16du wp14">
-  <w:p>
-    <w:pPr>
-      <w:pStyle w:val="Header"/>
-    </w:pPr>
-  </w:p>
-</w:hdr>
-</file>
-
-<file path=word/header2.xml><?xml version="1.0" encoding="utf-8"?>
-<w:hdr xmlns:wpc="http://schemas.microsoft.com/office/word/2010/wordprocessingCanvas" xmlns:cx="http://schemas.microsoft.com/office/drawing/2014/chartex" xmlns:cx1="http://schemas.microsoft.com/office/drawing/2015/9/8/chartex" xmlns:cx2="http://schemas.microsoft.com/office/drawing/2015/10/21/chartex" xmlns:cx3="http://schemas.microsoft.com/office/drawing/2016/5/9/chartex" xmlns:cx4="http://schemas.microsoft.com/office/drawing/2016/5/10/chartex" xmlns:cx5="http://schemas.microsoft.com/office/drawing/2016/5/11/chartex" xmlns:cx6="http://schemas.microsoft.com/office/drawing/2016/5/12/chartex" xmlns:cx7="http://schemas.microsoft.com/office/drawing/2016/5/13/chartex" xmlns:cx8="http://schemas.microsoft.com/office/drawing/2016/5/14/chartex" xmlns:mc="http://schemas.openxmlformats.org/markup-compatibility/2006" xmlns:aink="http://schemas.microsoft.com/office/drawing/2016/ink" xmlns:am3d="http://schemas.microsoft.com/office/drawing/2017/model3d" xmlns:o="urn:schemas-microsoft-com:office:office" xmlns:oel="http://schemas.microsoft.com/office/2019/extlst" xmlns:r="http://schemas.openxmlformats.org/officeDocument/2006/relationships" xmlns:m="http://schemas.openxmlformats.org/officeDocument/2006/math" xmlns:v="urn:schemas-microsoft-com:vml" xmlns:wp14="http://schemas.microsoft.com/office/word/2010/wordprocessingDrawing" xmlns:wp="http://schemas.openxmlformats.org/drawingml/2006/wordprocessingDrawing" xmlns:w10="urn:schemas-microsoft-com:office:word" xmlns:w="http://schemas.openxmlformats.org/wordprocessingml/2006/main" xmlns:w14="http://schemas.microsoft.com/office/word/2010/wordml" xmlns:w15="http://schemas.microsoft.com/office/word/2012/wordml" xmlns:w16cex="http://schemas.microsoft.com/office/word/2018/wordml/cex" xmlns:w16cid="http://schemas.microsoft.com/office/word/2016/wordml/cid" xmlns:w16="http://schemas.microsoft.com/office/word/2018/wordml" xmlns:w16du="http://schemas.microsoft.com/office/word/2023/wordml/word16du" xmlns:w16sdtdh="http://schemas.microsoft.com/office/word/2020/wordml/sdtdatahash" xmlns:w16sdtfl="http://schemas.microsoft.com/office/word/2024/wordml/sdtformatlock" xmlns:w16se="http://schemas.microsoft.com/office/word/2015/wordml/symex" xmlns:wpg="http://schemas.microsoft.com/office/word/2010/wordprocessingGroup" xmlns:wpi="http://schemas.microsoft.com/office/word/2010/wordprocessingInk" xmlns:wne="http://schemas.microsoft.com/office/word/2006/wordml" xmlns:wps="http://schemas.microsoft.com/office/word/2010/wordprocessingShape" mc:Ignorable="w14 w15 w16se w16cid w16 w16cex w16sdtdh w16sdtfl w16du wp14">
   <w:tbl>
     <w:tblPr>
       <w:tblW w:w="10773" w:type="dxa"/>
       <w:tblInd w:w="-1" w:type="dxa"/>
-      <w:tblBorders>
-        <w:top w:val="single" w:sz="4" w:space="0" w:color="auto"/>
-        <w:left w:val="single" w:sz="4" w:space="0" w:color="auto"/>
-        <w:bottom w:val="single" w:sz="4" w:space="0" w:color="auto"/>
-        <w:right w:val="single" w:sz="4" w:space="0" w:color="auto"/>
-        <w:insideH w:val="single" w:sz="4" w:space="0" w:color="auto"/>
-        <w:insideV w:val="single" w:sz="4" w:space="0" w:color="auto"/>
-      </w:tblBorders>
       <w:tblCellMar>
         <w:left w:w="10" w:type="dxa"/>
         <w:right w:w="10" w:type="dxa"/>
@@ -3415,16 +3266,13 @@
       <w:gridCol w:w="10773"/>
     </w:tblGrid>
     <w:tr>
+      <w:trPr>
+        <w:trHeight w:val="68"/>
+      </w:trPr>
       <w:tc>
         <w:tcPr>
           <w:tcW w:w="10773" w:type="dxa"/>
-          <w:tcBorders>
-            <w:top w:val="single" w:sz="1" w:space="0" w:color="AAAAAA"/>
-            <w:left w:val="single" w:sz="1" w:space="0" w:color="AAAAAA"/>
-            <w:bottom w:val="single" w:sz="1" w:space="0" w:color="AAAAAA"/>
-            <w:right w:val="single" w:sz="1" w:space="0" w:color="AAAAAA"/>
-          </w:tcBorders>
-          <w:shd w:val="clear" w:color="auto" w:fill="D6E4F0"/>
+          <w:shd w:val="clear" w:color="auto" w:fill="D9D9D9" w:themeFill="background1" w:themeFillShade="D9"/>
           <w:tcMar>
             <w:top w:w="80" w:type="dxa"/>
             <w:left w:w="120" w:type="dxa"/>
@@ -3537,16 +3385,6 @@
       </w:tc>
     </w:tr>
   </w:tbl>
-  <w:p>
-    <w:pPr>
-      <w:pStyle w:val="Header"/>
-    </w:pPr>
-  </w:p>
-</w:hdr>
-</file>
-
-<file path=word/header3.xml><?xml version="1.0" encoding="utf-8"?>
-<w:hdr xmlns:wpc="http://schemas.microsoft.com/office/word/2010/wordprocessingCanvas" xmlns:cx="http://schemas.microsoft.com/office/drawing/2014/chartex" xmlns:cx1="http://schemas.microsoft.com/office/drawing/2015/9/8/chartex" xmlns:cx2="http://schemas.microsoft.com/office/drawing/2015/10/21/chartex" xmlns:cx3="http://schemas.microsoft.com/office/drawing/2016/5/9/chartex" xmlns:cx4="http://schemas.microsoft.com/office/drawing/2016/5/10/chartex" xmlns:cx5="http://schemas.microsoft.com/office/drawing/2016/5/11/chartex" xmlns:cx6="http://schemas.microsoft.com/office/drawing/2016/5/12/chartex" xmlns:cx7="http://schemas.microsoft.com/office/drawing/2016/5/13/chartex" xmlns:cx8="http://schemas.microsoft.com/office/drawing/2016/5/14/chartex" xmlns:mc="http://schemas.openxmlformats.org/markup-compatibility/2006" xmlns:aink="http://schemas.microsoft.com/office/drawing/2016/ink" xmlns:am3d="http://schemas.microsoft.com/office/drawing/2017/model3d" xmlns:o="urn:schemas-microsoft-com:office:office" xmlns:oel="http://schemas.microsoft.com/office/2019/extlst" xmlns:r="http://schemas.openxmlformats.org/officeDocument/2006/relationships" xmlns:m="http://schemas.openxmlformats.org/officeDocument/2006/math" xmlns:v="urn:schemas-microsoft-com:vml" xmlns:wp14="http://schemas.microsoft.com/office/word/2010/wordprocessingDrawing" xmlns:wp="http://schemas.openxmlformats.org/drawingml/2006/wordprocessingDrawing" xmlns:w10="urn:schemas-microsoft-com:office:word" xmlns:w="http://schemas.openxmlformats.org/wordprocessingml/2006/main" xmlns:w14="http://schemas.microsoft.com/office/word/2010/wordml" xmlns:w15="http://schemas.microsoft.com/office/word/2012/wordml" xmlns:w16cex="http://schemas.microsoft.com/office/word/2018/wordml/cex" xmlns:w16cid="http://schemas.microsoft.com/office/word/2016/wordml/cid" xmlns:w16="http://schemas.microsoft.com/office/word/2018/wordml" xmlns:w16du="http://schemas.microsoft.com/office/word/2023/wordml/word16du" xmlns:w16sdtdh="http://schemas.microsoft.com/office/word/2020/wordml/sdtdatahash" xmlns:w16sdtfl="http://schemas.microsoft.com/office/word/2024/wordml/sdtformatlock" xmlns:w16se="http://schemas.microsoft.com/office/word/2015/wordml/symex" xmlns:wpg="http://schemas.microsoft.com/office/word/2010/wordprocessingGroup" xmlns:wpi="http://schemas.microsoft.com/office/word/2010/wordprocessingInk" xmlns:wne="http://schemas.microsoft.com/office/word/2006/wordml" xmlns:wps="http://schemas.microsoft.com/office/word/2010/wordprocessingShape" mc:Ignorable="w14 w15 w16se w16cid w16 w16cex w16sdtdh w16sdtfl w16du wp14">
   <w:p>
     <w:pPr>
       <w:pStyle w:val="Header"/>

</xml_diff>

<commit_message>
Disable inline controls until checkbox checked; Gimbal redesign (+Joystick, Load Capacity, Accuracy); bold component names in export; fix tab switch state loss; fix combobox hover text disappear; fix BB Type empty on check
</commit_message>
<xml_diff>
--- a/bin/Debug/net10.0-windows/Marketing_Meeting_Summary_Template.docx
+++ b/bin/Debug/net10.0-windows/Marketing_Meeting_Summary_Template.docx
@@ -21,7 +21,7 @@
           <w:noProof/>
         </w:rPr>
         <w:drawing>
-          <wp:anchor distT="0" distB="0" distL="114300" distR="114300" simplePos="0" relativeHeight="251658240" behindDoc="0" locked="0" layoutInCell="1" allowOverlap="1" wp14:anchorId="4606FF2F" wp14:editId="0E8AFE38">
+          <wp:anchor distT="0" distB="0" distL="114300" distR="114300" simplePos="0" relativeHeight="251658240" behindDoc="0" locked="0" layoutInCell="1" allowOverlap="1" wp14:anchorId="4606FF2F" wp14:editId="62828B0C">
             <wp:simplePos x="0" y="0"/>
             <wp:positionH relativeFrom="margin">
               <wp:align>left</wp:align>
@@ -612,6 +612,23 @@
               </w:rPr>
               <w:t>Selling Price</w:t>
             </w:r>
+            <w:r>
+              <w:rPr>
+                <w:b/>
+                <w:bCs/>
+                <w:color w:val="EE0000"/>
+                <w:sz w:val="22"/>
+                <w:szCs w:val="22"/>
+              </w:rPr>
+              <w:t xml:space="preserve"> </w:t>
+            </w:r>
+            <w:r>
+              <w:rPr>
+                <w:sz w:val="22"/>
+                <w:szCs w:val="22"/>
+              </w:rPr>
+              <w:t>$</w:t>
+            </w:r>
           </w:p>
         </w:tc>
         <w:tc>
@@ -682,6 +699,23 @@
                 <w:szCs w:val="22"/>
               </w:rPr>
               <w:t>Material Cost</w:t>
+            </w:r>
+            <w:r>
+              <w:rPr>
+                <w:b/>
+                <w:bCs/>
+                <w:color w:val="EE0000"/>
+                <w:sz w:val="22"/>
+                <w:szCs w:val="22"/>
+              </w:rPr>
+              <w:t xml:space="preserve"> </w:t>
+            </w:r>
+            <w:r>
+              <w:rPr>
+                <w:sz w:val="22"/>
+                <w:szCs w:val="22"/>
+              </w:rPr>
+              <w:t>$</w:t>
             </w:r>
           </w:p>
         </w:tc>
@@ -1590,7 +1624,6 @@
         <w:lastRenderedPageBreak/>
         <w:t>5</w:t>
       </w:r>
-      <w:proofErr w:type="gramStart"/>
       <w:r>
         <w:rPr>
           <w:b/>
@@ -1599,9 +1632,8 @@
           <w:sz w:val="26"/>
           <w:szCs w:val="26"/>
         </w:rPr>
-        <w:t>.  PM</w:t>
+        <w:t xml:space="preserve">.  Meeting </w:t>
       </w:r>
-      <w:proofErr w:type="gramEnd"/>
       <w:r>
         <w:rPr>
           <w:b/>
@@ -1610,7 +1642,36 @@
           <w:sz w:val="26"/>
           <w:szCs w:val="26"/>
         </w:rPr>
-        <w:t xml:space="preserve"> Questions</w:t>
+        <w:t>Questions</w:t>
+      </w:r>
+    </w:p>
+    <w:p>
+      <w:pPr>
+        <w:spacing w:before="160" w:after="80"/>
+      </w:pPr>
+      <w:r>
+        <w:rPr>
+          <w:b/>
+          <w:bCs/>
+          <w:color w:val="2E75B6"/>
+        </w:rPr>
+        <w:t xml:space="preserve">Marketing </w:t>
+      </w:r>
+      <w:r>
+        <w:rPr>
+          <w:b/>
+          <w:bCs/>
+          <w:color w:val="2E75B6"/>
+        </w:rPr>
+        <w:t>Questions</w:t>
+      </w:r>
+      <w:r>
+        <w:rPr>
+          <w:b/>
+          <w:bCs/>
+          <w:color w:val="2E75B6"/>
+        </w:rPr>
+        <w:t>:</w:t>
       </w:r>
     </w:p>
     <w:tbl>
@@ -1791,42 +1852,31 @@
     </w:tbl>
     <w:p>
       <w:pPr>
-        <w:pBdr>
-          <w:bottom w:val="single" w:sz="10" w:space="4" w:color="1F4E79"/>
-        </w:pBdr>
-        <w:spacing w:before="320" w:after="160"/>
+        <w:spacing w:before="160" w:after="80"/>
       </w:pPr>
       <w:r>
         <w:rPr>
           <w:b/>
           <w:bCs/>
-          <w:color w:val="1F4E79"/>
-          <w:sz w:val="26"/>
-          <w:szCs w:val="26"/>
-        </w:rPr>
-        <w:t>6</w:t>
+          <w:color w:val="2E75B6"/>
+        </w:rPr>
+        <w:t xml:space="preserve">PM </w:t>
       </w:r>
-      <w:proofErr w:type="gramStart"/>
       <w:r>
         <w:rPr>
           <w:b/>
           <w:bCs/>
-          <w:color w:val="1F4E79"/>
-          <w:sz w:val="26"/>
-          <w:szCs w:val="26"/>
-        </w:rPr>
-        <w:t>.  Marketing</w:t>
+          <w:color w:val="2E75B6"/>
+        </w:rPr>
+        <w:t>Questions</w:t>
       </w:r>
-      <w:proofErr w:type="gramEnd"/>
       <w:r>
         <w:rPr>
           <w:b/>
           <w:bCs/>
-          <w:color w:val="1F4E79"/>
-          <w:sz w:val="26"/>
-          <w:szCs w:val="26"/>
-        </w:rPr>
-        <w:t xml:space="preserve"> Questions</w:t>
+          <w:color w:val="2E75B6"/>
+        </w:rPr>
+        <w:t>:</w:t>
       </w:r>
     </w:p>
     <w:tbl>
@@ -2036,9 +2086,8 @@
           <w:sz w:val="26"/>
           <w:szCs w:val="26"/>
         </w:rPr>
-        <w:t>7</w:t>
+        <w:t>6</w:t>
       </w:r>
-      <w:proofErr w:type="gramStart"/>
       <w:r>
         <w:rPr>
           <w:b/>
@@ -2047,18 +2096,7 @@
           <w:sz w:val="26"/>
           <w:szCs w:val="26"/>
         </w:rPr>
-        <w:t>.  Meeting</w:t>
-      </w:r>
-      <w:proofErr w:type="gramEnd"/>
-      <w:r>
-        <w:rPr>
-          <w:b/>
-          <w:bCs/>
-          <w:color w:val="1F4E79"/>
-          <w:sz w:val="26"/>
-          <w:szCs w:val="26"/>
-        </w:rPr>
-        <w:t xml:space="preserve"> Notes</w:t>
+        <w:t>.  Meeting Notes</w:t>
       </w:r>
     </w:p>
     <w:p>
@@ -2425,9 +2463,8 @@
           <w:sz w:val="26"/>
           <w:szCs w:val="26"/>
         </w:rPr>
-        <w:t>8</w:t>
+        <w:t>7</w:t>
       </w:r>
-      <w:proofErr w:type="gramStart"/>
       <w:r>
         <w:rPr>
           <w:b/>
@@ -2436,18 +2473,7 @@
           <w:sz w:val="26"/>
           <w:szCs w:val="26"/>
         </w:rPr>
-        <w:t>.  Action</w:t>
-      </w:r>
-      <w:proofErr w:type="gramEnd"/>
-      <w:r>
-        <w:rPr>
-          <w:b/>
-          <w:bCs/>
-          <w:color w:val="1F4E79"/>
-          <w:sz w:val="26"/>
-          <w:szCs w:val="26"/>
-        </w:rPr>
-        <w:t xml:space="preserve"> Items</w:t>
+        <w:t>.  Action Items</w:t>
       </w:r>
     </w:p>
     <w:tbl>
@@ -3099,43 +3125,7 @@
         <w:sz w:val="18"/>
         <w:szCs w:val="18"/>
       </w:rPr>
-      <w:t xml:space="preserve">Marketing </w:t>
-    </w:r>
-    <w:proofErr w:type="gramStart"/>
-    <w:r>
-      <w:rPr>
-        <w:color w:val="888888"/>
-        <w:sz w:val="18"/>
-        <w:szCs w:val="18"/>
-      </w:rPr>
-      <w:t>Department  |</w:t>
-    </w:r>
-    <w:proofErr w:type="gramEnd"/>
-    <w:r>
-      <w:rPr>
-        <w:color w:val="888888"/>
-        <w:sz w:val="18"/>
-        <w:szCs w:val="18"/>
-      </w:rPr>
-      <w:t xml:space="preserve">  Marketing Kickoff Meeting </w:t>
-    </w:r>
-    <w:proofErr w:type="gramStart"/>
-    <w:r>
-      <w:rPr>
-        <w:color w:val="888888"/>
-        <w:sz w:val="18"/>
-        <w:szCs w:val="18"/>
-      </w:rPr>
-      <w:t>Summary  |</w:t>
-    </w:r>
-    <w:proofErr w:type="gramEnd"/>
-    <w:r>
-      <w:rPr>
-        <w:color w:val="888888"/>
-        <w:sz w:val="18"/>
-        <w:szCs w:val="18"/>
-      </w:rPr>
-      <w:t xml:space="preserve">  Page </w:t>
+      <w:t xml:space="preserve">Marketing Department  |  Marketing Kickoff Meeting Summary  |  Page </w:t>
     </w:r>
     <w:r>
       <w:rPr>
@@ -4436,7 +4426,7 @@
   <w:style w:type="paragraph" w:default="1" w:styleId="Normal">
     <w:name w:val="Normal"/>
     <w:qFormat/>
-    <w:rsid w:val="000F74F9"/>
+    <w:rsid w:val="00360CD8"/>
   </w:style>
   <w:style w:type="paragraph" w:styleId="Heading1">
     <w:name w:val="heading 1"/>

</xml_diff>

<commit_message>
Fix Outlook email: use Interop COM, LTR HTML body, auto-attach file, prevent duplicate Outlook window
</commit_message>
<xml_diff>
--- a/bin/Debug/net10.0-windows/Marketing_Meeting_Summary_Template.docx
+++ b/bin/Debug/net10.0-windows/Marketing_Meeting_Summary_Template.docx
@@ -21,7 +21,7 @@
           <w:noProof/>
         </w:rPr>
         <w:drawing>
-          <wp:anchor distT="0" distB="0" distL="114300" distR="114300" simplePos="0" relativeHeight="251658240" behindDoc="0" locked="0" layoutInCell="1" allowOverlap="1" wp14:anchorId="4606FF2F" wp14:editId="62828B0C">
+          <wp:anchor distT="0" distB="0" distL="114300" distR="114300" simplePos="0" relativeHeight="251658240" behindDoc="0" locked="0" layoutInCell="1" allowOverlap="1" wp14:anchorId="4606FF2F" wp14:editId="6B3A193E">
             <wp:simplePos x="0" y="0"/>
             <wp:positionH relativeFrom="margin">
               <wp:align>left</wp:align>
@@ -960,7 +960,7 @@
     </w:p>
     <w:tbl>
       <w:tblPr>
-        <w:tblW w:w="10772" w:type="dxa"/>
+        <w:tblW w:w="10488" w:type="dxa"/>
         <w:tblBorders>
           <w:top w:val="single" w:sz="4" w:space="0" w:color="auto"/>
           <w:left w:val="single" w:sz="4" w:space="0" w:color="auto"/>
@@ -976,14 +976,15 @@
         <w:tblLook w:val="04A0" w:firstRow="1" w:lastRow="0" w:firstColumn="1" w:lastColumn="0" w:noHBand="0" w:noVBand="1"/>
       </w:tblPr>
       <w:tblGrid>
-        <w:gridCol w:w="4677"/>
-        <w:gridCol w:w="6095"/>
+        <w:gridCol w:w="2551"/>
+        <w:gridCol w:w="4252"/>
+        <w:gridCol w:w="3685"/>
       </w:tblGrid>
       <w:tr>
         <w:tc>
           <w:tcPr>
-            <w:tcW w:w="10772" w:type="dxa"/>
-            <w:gridSpan w:val="2"/>
+            <w:tcW w:w="10488" w:type="dxa"/>
+            <w:gridSpan w:val="3"/>
             <w:tcBorders>
               <w:top w:val="single" w:sz="1" w:space="0" w:color="AAAAAA"/>
               <w:left w:val="single" w:sz="1" w:space="0" w:color="AAAAAA"/>
@@ -1026,7 +1027,7 @@
       <w:tr>
         <w:tc>
           <w:tcPr>
-            <w:tcW w:w="4677" w:type="dxa"/>
+            <w:tcW w:w="2551" w:type="dxa"/>
             <w:tcBorders>
               <w:top w:val="single" w:sz="4" w:space="0" w:color="auto"/>
               <w:left w:val="single" w:sz="4" w:space="0" w:color="auto"/>
@@ -1063,7 +1064,7 @@
         </w:tc>
         <w:tc>
           <w:tcPr>
-            <w:tcW w:w="6095" w:type="dxa"/>
+            <w:tcW w:w="4252" w:type="dxa"/>
             <w:tcBorders>
               <w:top w:val="single" w:sz="4" w:space="0" w:color="auto"/>
               <w:left w:val="single" w:sz="4" w:space="0" w:color="auto"/>
@@ -1094,6 +1095,36 @@
                 <w:bCs/>
                 <w:color w:val="153D63" w:themeColor="text2" w:themeTint="E6"/>
               </w:rPr>
+              <w:t>Configuration</w:t>
+            </w:r>
+          </w:p>
+        </w:tc>
+        <w:tc>
+          <w:tcPr>
+            <w:tcW w:w="3685" w:type="dxa"/>
+            <w:tcBorders>
+              <w:top w:val="single" w:sz="4" w:space="0" w:color="auto"/>
+              <w:left w:val="single" w:sz="4" w:space="0" w:color="auto"/>
+              <w:bottom w:val="single" w:sz="2" w:space="0" w:color="AAAAAA"/>
+              <w:right w:val="single" w:sz="4" w:space="0" w:color="auto"/>
+            </w:tcBorders>
+            <w:shd w:val="clear" w:color="auto" w:fill="D9D9D9" w:themeFill="background1" w:themeFillShade="D9"/>
+          </w:tcPr>
+          <w:p>
+            <w:pPr>
+              <w:jc w:val="center"/>
+              <w:rPr>
+                <w:b/>
+                <w:bCs/>
+                <w:color w:val="153D63" w:themeColor="text2" w:themeTint="E6"/>
+              </w:rPr>
+            </w:pPr>
+            <w:r>
+              <w:rPr>
+                <w:b/>
+                <w:bCs/>
+                <w:color w:val="153D63" w:themeColor="text2" w:themeTint="E6"/>
+              </w:rPr>
               <w:t>Notes</w:t>
             </w:r>
           </w:p>
@@ -1102,7 +1133,7 @@
       <w:tr>
         <w:tc>
           <w:tcPr>
-            <w:tcW w:w="4677" w:type="dxa"/>
+            <w:tcW w:w="2551" w:type="dxa"/>
             <w:tcBorders>
               <w:top w:val="single" w:sz="2" w:space="0" w:color="AAAAAA"/>
               <w:left w:val="single" w:sz="4" w:space="0" w:color="auto"/>
@@ -1141,7 +1172,7 @@
         </w:tc>
         <w:tc>
           <w:tcPr>
-            <w:tcW w:w="6095" w:type="dxa"/>
+            <w:tcW w:w="4252" w:type="dxa"/>
             <w:tcBorders>
               <w:top w:val="single" w:sz="2" w:space="0" w:color="AAAAAA"/>
               <w:left w:val="single" w:sz="4" w:space="0" w:color="auto"/>
@@ -1156,6 +1187,26 @@
               <w:right w:w="120" w:type="dxa"/>
             </w:tcMar>
             <w:vAlign w:val="center"/>
+          </w:tcPr>
+          <w:p>
+            <w:pPr>
+              <w:rPr>
+                <w:sz w:val="22"/>
+                <w:szCs w:val="22"/>
+              </w:rPr>
+            </w:pPr>
+          </w:p>
+        </w:tc>
+        <w:tc>
+          <w:tcPr>
+            <w:tcW w:w="3685" w:type="dxa"/>
+            <w:tcBorders>
+              <w:top w:val="single" w:sz="2" w:space="0" w:color="AAAAAA"/>
+              <w:left w:val="single" w:sz="4" w:space="0" w:color="auto"/>
+              <w:bottom w:val="single" w:sz="2" w:space="0" w:color="AAAAAA"/>
+              <w:right w:val="single" w:sz="4" w:space="0" w:color="auto"/>
+            </w:tcBorders>
+            <w:shd w:val="clear" w:color="auto" w:fill="F7F7F7"/>
           </w:tcPr>
           <w:p>
             <w:pPr>
@@ -1308,7 +1359,7 @@
                 <w:bCs/>
                 <w:color w:val="153D63" w:themeColor="text2" w:themeTint="E6"/>
               </w:rPr>
-              <w:t>QTY</w:t>
+              <w:t>Size</w:t>
             </w:r>
           </w:p>
         </w:tc>
@@ -1334,7 +1385,7 @@
                 <w:bCs/>
                 <w:color w:val="153D63" w:themeColor="text2" w:themeTint="E6"/>
               </w:rPr>
-              <w:t>Size</w:t>
+              <w:t>Unit</w:t>
             </w:r>
           </w:p>
         </w:tc>
@@ -1399,11 +1450,24 @@
           </w:tcPr>
           <w:p>
             <w:pPr>
-              <w:rPr>
+              <w:jc w:val="center"/>
+              <w:rPr>
+                <w:b/>
+                <w:bCs/>
                 <w:sz w:val="22"/>
                 <w:szCs w:val="22"/>
               </w:rPr>
             </w:pPr>
+            <w:r>
+              <w:rPr>
+                <w:b/>
+                <w:bCs/>
+                <w:color w:val="EE0000"/>
+                <w:sz w:val="22"/>
+                <w:szCs w:val="22"/>
+              </w:rPr>
+              <w:t>Size</w:t>
+            </w:r>
           </w:p>
         </w:tc>
         <w:tc>
@@ -1597,6 +1661,8 @@
           <w:bottom w:val="single" w:sz="10" w:space="4" w:color="1F4E79"/>
         </w:pBdr>
         <w:spacing w:before="320" w:after="160"/>
+      </w:pPr>
+      <w:r>
         <w:rPr>
           <w:b/>
           <w:bCs/>
@@ -1604,15 +1670,10 @@
           <w:sz w:val="26"/>
           <w:szCs w:val="26"/>
         </w:rPr>
-      </w:pPr>
-    </w:p>
-    <w:p>
-      <w:pPr>
-        <w:pBdr>
-          <w:bottom w:val="single" w:sz="10" w:space="4" w:color="1F4E79"/>
-        </w:pBdr>
-        <w:spacing w:before="320" w:after="160"/>
-      </w:pPr>
+        <w:lastRenderedPageBreak/>
+        <w:t>4</w:t>
+      </w:r>
+      <w:proofErr w:type="gramStart"/>
       <w:r>
         <w:rPr>
           <w:b/>
@@ -1621,9 +1682,9 @@
           <w:sz w:val="26"/>
           <w:szCs w:val="26"/>
         </w:rPr>
-        <w:lastRenderedPageBreak/>
-        <w:t>5</w:t>
+        <w:t>.  Meeting</w:t>
       </w:r>
+      <w:proofErr w:type="gramEnd"/>
       <w:r>
         <w:rPr>
           <w:b/>
@@ -1632,46 +1693,7 @@
           <w:sz w:val="26"/>
           <w:szCs w:val="26"/>
         </w:rPr>
-        <w:t xml:space="preserve">.  Meeting </w:t>
-      </w:r>
-      <w:r>
-        <w:rPr>
-          <w:b/>
-          <w:bCs/>
-          <w:color w:val="1F4E79"/>
-          <w:sz w:val="26"/>
-          <w:szCs w:val="26"/>
-        </w:rPr>
-        <w:t>Questions</w:t>
-      </w:r>
-    </w:p>
-    <w:p>
-      <w:pPr>
-        <w:spacing w:before="160" w:after="80"/>
-      </w:pPr>
-      <w:r>
-        <w:rPr>
-          <w:b/>
-          <w:bCs/>
-          <w:color w:val="2E75B6"/>
-        </w:rPr>
-        <w:t xml:space="preserve">Marketing </w:t>
-      </w:r>
-      <w:r>
-        <w:rPr>
-          <w:b/>
-          <w:bCs/>
-          <w:color w:val="2E75B6"/>
-        </w:rPr>
-        <w:t>Questions</w:t>
-      </w:r>
-      <w:r>
-        <w:rPr>
-          <w:b/>
-          <w:bCs/>
-          <w:color w:val="2E75B6"/>
-        </w:rPr>
-        <w:t>:</w:t>
+        <w:t xml:space="preserve"> Questions</w:t>
       </w:r>
     </w:p>
     <w:tbl>
@@ -1785,6 +1807,7 @@
               <w:bottom w:val="single" w:sz="1" w:space="0" w:color="AAAAAA"/>
               <w:right w:val="single" w:sz="1" w:space="0" w:color="AAAAAA"/>
             </w:tcBorders>
+            <w:shd w:val="clear" w:color="auto" w:fill="F2F2F2" w:themeFill="background1" w:themeFillShade="F2"/>
             <w:tcMar>
               <w:top w:w="80" w:type="dxa"/>
               <w:left w:w="120" w:type="dxa"/>
@@ -1813,6 +1836,7 @@
               <w:bottom w:val="single" w:sz="1" w:space="0" w:color="AAAAAA"/>
               <w:right w:val="single" w:sz="1" w:space="0" w:color="AAAAAA"/>
             </w:tcBorders>
+            <w:shd w:val="clear" w:color="auto" w:fill="F2F2F2" w:themeFill="background1" w:themeFillShade="F2"/>
             <w:tcMar>
               <w:top w:w="80" w:type="dxa"/>
               <w:left w:w="120" w:type="dxa"/>
@@ -1853,30 +1877,259 @@
     <w:p>
       <w:pPr>
         <w:spacing w:before="160" w:after="80"/>
+        <w:rPr>
+          <w:sz w:val="16"/>
+          <w:szCs w:val="16"/>
+        </w:rPr>
+      </w:pPr>
+    </w:p>
+    <w:tbl>
+      <w:tblPr>
+        <w:tblW w:w="10772" w:type="dxa"/>
+        <w:tblBorders>
+          <w:top w:val="single" w:sz="4" w:space="0" w:color="auto"/>
+          <w:left w:val="single" w:sz="4" w:space="0" w:color="auto"/>
+          <w:bottom w:val="single" w:sz="4" w:space="0" w:color="auto"/>
+          <w:right w:val="single" w:sz="4" w:space="0" w:color="auto"/>
+          <w:insideH w:val="single" w:sz="4" w:space="0" w:color="auto"/>
+          <w:insideV w:val="single" w:sz="4" w:space="0" w:color="auto"/>
+        </w:tblBorders>
+        <w:tblCellMar>
+          <w:left w:w="10" w:type="dxa"/>
+          <w:right w:w="10" w:type="dxa"/>
+        </w:tblCellMar>
+        <w:tblLook w:val="04A0" w:firstRow="1" w:lastRow="0" w:firstColumn="1" w:lastColumn="0" w:noHBand="0" w:noVBand="1"/>
+      </w:tblPr>
+      <w:tblGrid>
+        <w:gridCol w:w="500"/>
+        <w:gridCol w:w="10272"/>
+      </w:tblGrid>
+      <w:tr>
+        <w:tc>
+          <w:tcPr>
+            <w:tcW w:w="500" w:type="dxa"/>
+            <w:tcBorders>
+              <w:top w:val="single" w:sz="1" w:space="0" w:color="AAAAAA"/>
+              <w:left w:val="single" w:sz="1" w:space="0" w:color="AAAAAA"/>
+              <w:bottom w:val="single" w:sz="1" w:space="0" w:color="AAAAAA"/>
+              <w:right w:val="single" w:sz="1" w:space="0" w:color="AAAAAA"/>
+            </w:tcBorders>
+            <w:shd w:val="clear" w:color="auto" w:fill="1F4E79"/>
+            <w:tcMar>
+              <w:top w:w="80" w:type="dxa"/>
+              <w:left w:w="120" w:type="dxa"/>
+              <w:bottom w:w="80" w:type="dxa"/>
+              <w:right w:w="120" w:type="dxa"/>
+            </w:tcMar>
+            <w:vAlign w:val="center"/>
+          </w:tcPr>
+          <w:p>
+            <w:pPr>
+              <w:jc w:val="center"/>
+            </w:pPr>
+            <w:r>
+              <w:rPr>
+                <w:b/>
+                <w:bCs/>
+                <w:color w:val="FFFFFF"/>
+                <w:sz w:val="22"/>
+                <w:szCs w:val="22"/>
+              </w:rPr>
+              <w:t>#</w:t>
+            </w:r>
+          </w:p>
+        </w:tc>
+        <w:tc>
+          <w:tcPr>
+            <w:tcW w:w="10272" w:type="dxa"/>
+            <w:tcBorders>
+              <w:top w:val="single" w:sz="1" w:space="0" w:color="AAAAAA"/>
+              <w:left w:val="single" w:sz="1" w:space="0" w:color="AAAAAA"/>
+              <w:bottom w:val="single" w:sz="1" w:space="0" w:color="AAAAAA"/>
+              <w:right w:val="single" w:sz="1" w:space="0" w:color="AAAAAA"/>
+            </w:tcBorders>
+            <w:shd w:val="clear" w:color="auto" w:fill="1F4E79"/>
+            <w:tcMar>
+              <w:top w:w="80" w:type="dxa"/>
+              <w:left w:w="120" w:type="dxa"/>
+              <w:bottom w:w="80" w:type="dxa"/>
+              <w:right w:w="120" w:type="dxa"/>
+            </w:tcMar>
+            <w:vAlign w:val="center"/>
+          </w:tcPr>
+          <w:p>
+            <w:pPr>
+              <w:jc w:val="center"/>
+            </w:pPr>
+            <w:r>
+              <w:rPr>
+                <w:b/>
+                <w:bCs/>
+                <w:color w:val="FFFFFF"/>
+                <w:sz w:val="22"/>
+                <w:szCs w:val="22"/>
+              </w:rPr>
+              <w:t xml:space="preserve">Marketing </w:t>
+            </w:r>
+            <w:r>
+              <w:rPr>
+                <w:b/>
+                <w:bCs/>
+                <w:color w:val="FFFFFF"/>
+                <w:sz w:val="22"/>
+                <w:szCs w:val="22"/>
+              </w:rPr>
+              <w:t>Question</w:t>
+            </w:r>
+          </w:p>
+        </w:tc>
+      </w:tr>
+      <w:tr>
+        <w:tc>
+          <w:tcPr>
+            <w:tcW w:w="500" w:type="dxa"/>
+            <w:tcBorders>
+              <w:top w:val="single" w:sz="1" w:space="0" w:color="AAAAAA"/>
+              <w:left w:val="single" w:sz="1" w:space="0" w:color="AAAAAA"/>
+              <w:bottom w:val="single" w:sz="1" w:space="0" w:color="AAAAAA"/>
+              <w:right w:val="single" w:sz="1" w:space="0" w:color="AAAAAA"/>
+            </w:tcBorders>
+            <w:shd w:val="clear" w:color="auto" w:fill="F2F2F2" w:themeFill="background1" w:themeFillShade="F2"/>
+            <w:tcMar>
+              <w:top w:w="80" w:type="dxa"/>
+              <w:left w:w="120" w:type="dxa"/>
+              <w:bottom w:w="80" w:type="dxa"/>
+              <w:right w:w="120" w:type="dxa"/>
+            </w:tcMar>
+            <w:vAlign w:val="center"/>
+          </w:tcPr>
+          <w:p>
+            <w:r>
+              <w:rPr>
+                <w:color w:val="000000"/>
+                <w:sz w:val="22"/>
+                <w:szCs w:val="22"/>
+              </w:rPr>
+              <w:t>1</w:t>
+            </w:r>
+          </w:p>
+        </w:tc>
+        <w:tc>
+          <w:tcPr>
+            <w:tcW w:w="10272" w:type="dxa"/>
+            <w:tcBorders>
+              <w:top w:val="single" w:sz="1" w:space="0" w:color="AAAAAA"/>
+              <w:left w:val="single" w:sz="1" w:space="0" w:color="AAAAAA"/>
+              <w:bottom w:val="single" w:sz="1" w:space="0" w:color="AAAAAA"/>
+              <w:right w:val="single" w:sz="1" w:space="0" w:color="AAAAAA"/>
+            </w:tcBorders>
+            <w:shd w:val="clear" w:color="auto" w:fill="F2F2F2" w:themeFill="background1" w:themeFillShade="F2"/>
+            <w:tcMar>
+              <w:top w:w="80" w:type="dxa"/>
+              <w:left w:w="120" w:type="dxa"/>
+              <w:bottom w:w="80" w:type="dxa"/>
+              <w:right w:w="120" w:type="dxa"/>
+            </w:tcMar>
+            <w:vAlign w:val="center"/>
+          </w:tcPr>
+          <w:p>
+            <w:r>
+              <w:rPr>
+                <w:b/>
+                <w:bCs/>
+                <w:color w:val="EE0000"/>
+              </w:rPr>
+              <w:t xml:space="preserve">Start inserting </w:t>
+            </w:r>
+            <w:r>
+              <w:rPr>
+                <w:b/>
+                <w:bCs/>
+                <w:color w:val="EE0000"/>
+              </w:rPr>
+              <w:t>Marketing</w:t>
+            </w:r>
+            <w:r>
+              <w:rPr>
+                <w:b/>
+                <w:bCs/>
+                <w:color w:val="EE0000"/>
+              </w:rPr>
+              <w:t xml:space="preserve"> </w:t>
+            </w:r>
+            <w:r>
+              <w:rPr>
+                <w:b/>
+                <w:bCs/>
+                <w:color w:val="EE0000"/>
+              </w:rPr>
+              <w:t>questions</w:t>
+            </w:r>
+            <w:r>
+              <w:rPr>
+                <w:b/>
+                <w:bCs/>
+                <w:color w:val="EE0000"/>
+              </w:rPr>
+              <w:t xml:space="preserve"> from here!</w:t>
+            </w:r>
+          </w:p>
+        </w:tc>
+      </w:tr>
+    </w:tbl>
+    <w:p>
+      <w:pPr>
+        <w:pBdr>
+          <w:bottom w:val="single" w:sz="10" w:space="4" w:color="1F4E79"/>
+        </w:pBdr>
+        <w:spacing w:before="320" w:after="160"/>
+        <w:rPr>
+          <w:b/>
+          <w:bCs/>
+          <w:color w:val="1F4E79"/>
+          <w:sz w:val="26"/>
+          <w:szCs w:val="26"/>
+        </w:rPr>
+      </w:pPr>
+    </w:p>
+    <w:p>
+      <w:pPr>
+        <w:pBdr>
+          <w:bottom w:val="single" w:sz="10" w:space="4" w:color="1F4E79"/>
+        </w:pBdr>
+        <w:spacing w:before="320" w:after="160"/>
       </w:pPr>
       <w:r>
         <w:rPr>
           <w:b/>
           <w:bCs/>
-          <w:color w:val="2E75B6"/>
-        </w:rPr>
-        <w:t xml:space="preserve">PM </w:t>
+          <w:color w:val="1F4E79"/>
+          <w:sz w:val="26"/>
+          <w:szCs w:val="26"/>
+        </w:rPr>
+        <w:t>5</w:t>
       </w:r>
+      <w:proofErr w:type="gramStart"/>
       <w:r>
         <w:rPr>
           <w:b/>
           <w:bCs/>
-          <w:color w:val="2E75B6"/>
-        </w:rPr>
-        <w:t>Questions</w:t>
+          <w:color w:val="1F4E79"/>
+          <w:sz w:val="26"/>
+          <w:szCs w:val="26"/>
+        </w:rPr>
+        <w:t>.  Meeting</w:t>
       </w:r>
+      <w:proofErr w:type="gramEnd"/>
       <w:r>
         <w:rPr>
           <w:b/>
           <w:bCs/>
-          <w:color w:val="2E75B6"/>
-        </w:rPr>
-        <w:t>:</w:t>
+          <w:color w:val="1F4E79"/>
+          <w:sz w:val="26"/>
+          <w:szCs w:val="26"/>
+        </w:rPr>
+        <w:t xml:space="preserve"> Notes</w:t>
       </w:r>
     </w:p>
     <w:tbl>
@@ -1965,17 +2218,7 @@
                 <w:sz w:val="22"/>
                 <w:szCs w:val="22"/>
               </w:rPr>
-              <w:t xml:space="preserve">Marketing </w:t>
-            </w:r>
-            <w:r>
-              <w:rPr>
-                <w:b/>
-                <w:bCs/>
-                <w:color w:val="FFFFFF"/>
-                <w:sz w:val="22"/>
-                <w:szCs w:val="22"/>
-              </w:rPr>
-              <w:t>Question</w:t>
+              <w:t>PM Notes</w:t>
             </w:r>
           </w:p>
         </w:tc>
@@ -1990,6 +2233,7 @@
               <w:bottom w:val="single" w:sz="1" w:space="0" w:color="AAAAAA"/>
               <w:right w:val="single" w:sz="1" w:space="0" w:color="AAAAAA"/>
             </w:tcBorders>
+            <w:shd w:val="clear" w:color="auto" w:fill="F2F2F2" w:themeFill="background1" w:themeFillShade="F2"/>
             <w:tcMar>
               <w:top w:w="80" w:type="dxa"/>
               <w:left w:w="120" w:type="dxa"/>
@@ -2018,6 +2262,7 @@
               <w:bottom w:val="single" w:sz="1" w:space="0" w:color="AAAAAA"/>
               <w:right w:val="single" w:sz="1" w:space="0" w:color="AAAAAA"/>
             </w:tcBorders>
+            <w:shd w:val="clear" w:color="auto" w:fill="F2F2F2" w:themeFill="background1" w:themeFillShade="F2"/>
             <w:tcMar>
               <w:top w:w="80" w:type="dxa"/>
               <w:left w:w="120" w:type="dxa"/>
@@ -2041,7 +2286,7 @@
                 <w:bCs/>
                 <w:color w:val="EE0000"/>
               </w:rPr>
-              <w:t>marketing</w:t>
+              <w:t>PM</w:t>
             </w:r>
             <w:r>
               <w:rPr>
@@ -2049,23 +2294,7 @@
                 <w:bCs/>
                 <w:color w:val="EE0000"/>
               </w:rPr>
-              <w:t xml:space="preserve"> </w:t>
-            </w:r>
-            <w:r>
-              <w:rPr>
-                <w:b/>
-                <w:bCs/>
-                <w:color w:val="EE0000"/>
-              </w:rPr>
-              <w:t>questions</w:t>
-            </w:r>
-            <w:r>
-              <w:rPr>
-                <w:b/>
-                <w:bCs/>
-                <w:color w:val="EE0000"/>
-              </w:rPr>
-              <w:t xml:space="preserve"> from here!</w:t>
+              <w:t xml:space="preserve"> notes from here!</w:t>
             </w:r>
           </w:p>
         </w:tc>
@@ -2073,44 +2302,8 @@
     </w:tbl>
     <w:p>
       <w:pPr>
-        <w:pBdr>
-          <w:bottom w:val="single" w:sz="10" w:space="4" w:color="1F4E79"/>
-        </w:pBdr>
-        <w:spacing w:before="320" w:after="160"/>
-      </w:pPr>
-      <w:r>
-        <w:rPr>
-          <w:b/>
-          <w:bCs/>
-          <w:color w:val="1F4E79"/>
-          <w:sz w:val="26"/>
-          <w:szCs w:val="26"/>
-        </w:rPr>
-        <w:t>6</w:t>
-      </w:r>
-      <w:r>
-        <w:rPr>
-          <w:b/>
-          <w:bCs/>
-          <w:color w:val="1F4E79"/>
-          <w:sz w:val="26"/>
-          <w:szCs w:val="26"/>
-        </w:rPr>
-        <w:t>.  Meeting Notes</w:t>
-      </w:r>
-    </w:p>
-    <w:p>
-      <w:pPr>
         <w:spacing w:before="160" w:after="80"/>
       </w:pPr>
-      <w:r>
-        <w:rPr>
-          <w:b/>
-          <w:bCs/>
-          <w:color w:val="2E75B6"/>
-        </w:rPr>
-        <w:t>Marketing Notes:</w:t>
-      </w:r>
     </w:p>
     <w:tbl>
       <w:tblPr>
@@ -2198,7 +2391,7 @@
                 <w:sz w:val="22"/>
                 <w:szCs w:val="22"/>
               </w:rPr>
-              <w:t>Note</w:t>
+              <w:t>Marketing Notes</w:t>
             </w:r>
           </w:p>
         </w:tc>
@@ -2213,6 +2406,7 @@
               <w:bottom w:val="single" w:sz="1" w:space="0" w:color="AAAAAA"/>
               <w:right w:val="single" w:sz="1" w:space="0" w:color="AAAAAA"/>
             </w:tcBorders>
+            <w:shd w:val="clear" w:color="auto" w:fill="F2F2F2" w:themeFill="background1" w:themeFillShade="F2"/>
             <w:tcMar>
               <w:top w:w="80" w:type="dxa"/>
               <w:left w:w="120" w:type="dxa"/>
@@ -2241,88 +2435,7 @@
               <w:bottom w:val="single" w:sz="1" w:space="0" w:color="AAAAAA"/>
               <w:right w:val="single" w:sz="1" w:space="0" w:color="AAAAAA"/>
             </w:tcBorders>
-            <w:tcMar>
-              <w:top w:w="80" w:type="dxa"/>
-              <w:left w:w="120" w:type="dxa"/>
-              <w:bottom w:w="80" w:type="dxa"/>
-              <w:right w:w="120" w:type="dxa"/>
-            </w:tcMar>
-            <w:vAlign w:val="center"/>
-          </w:tcPr>
-          <w:p>
-            <w:r>
-              <w:rPr>
-                <w:b/>
-                <w:bCs/>
-                <w:color w:val="EE0000"/>
-              </w:rPr>
-              <w:t xml:space="preserve">Start inserting </w:t>
-            </w:r>
-            <w:r>
-              <w:rPr>
-                <w:b/>
-                <w:bCs/>
-                <w:color w:val="EE0000"/>
-              </w:rPr>
-              <w:t>marketing</w:t>
-            </w:r>
-            <w:r>
-              <w:rPr>
-                <w:b/>
-                <w:bCs/>
-                <w:color w:val="EE0000"/>
-              </w:rPr>
-              <w:t xml:space="preserve"> notes from here!</w:t>
-            </w:r>
-          </w:p>
-        </w:tc>
-      </w:tr>
-    </w:tbl>
-    <w:p>
-      <w:pPr>
-        <w:spacing w:before="160" w:after="80"/>
-      </w:pPr>
-      <w:r>
-        <w:rPr>
-          <w:b/>
-          <w:bCs/>
-          <w:color w:val="2E75B6"/>
-        </w:rPr>
-        <w:t>PM Notes:</w:t>
-      </w:r>
-    </w:p>
-    <w:tbl>
-      <w:tblPr>
-        <w:tblW w:w="10772" w:type="dxa"/>
-        <w:tblBorders>
-          <w:top w:val="single" w:sz="4" w:space="0" w:color="auto"/>
-          <w:left w:val="single" w:sz="4" w:space="0" w:color="auto"/>
-          <w:bottom w:val="single" w:sz="4" w:space="0" w:color="auto"/>
-          <w:right w:val="single" w:sz="4" w:space="0" w:color="auto"/>
-          <w:insideH w:val="single" w:sz="4" w:space="0" w:color="auto"/>
-          <w:insideV w:val="single" w:sz="4" w:space="0" w:color="auto"/>
-        </w:tblBorders>
-        <w:tblCellMar>
-          <w:left w:w="10" w:type="dxa"/>
-          <w:right w:w="10" w:type="dxa"/>
-        </w:tblCellMar>
-        <w:tblLook w:val="04A0" w:firstRow="1" w:lastRow="0" w:firstColumn="1" w:lastColumn="0" w:noHBand="0" w:noVBand="1"/>
-      </w:tblPr>
-      <w:tblGrid>
-        <w:gridCol w:w="500"/>
-        <w:gridCol w:w="10272"/>
-      </w:tblGrid>
-      <w:tr>
-        <w:tc>
-          <w:tcPr>
-            <w:tcW w:w="500" w:type="dxa"/>
-            <w:tcBorders>
-              <w:top w:val="single" w:sz="1" w:space="0" w:color="AAAAAA"/>
-              <w:left w:val="single" w:sz="1" w:space="0" w:color="AAAAAA"/>
-              <w:bottom w:val="single" w:sz="1" w:space="0" w:color="AAAAAA"/>
-              <w:right w:val="single" w:sz="1" w:space="0" w:color="AAAAAA"/>
-            </w:tcBorders>
-            <w:shd w:val="clear" w:color="auto" w:fill="1F4E79"/>
+            <w:shd w:val="clear" w:color="auto" w:fill="F2F2F2" w:themeFill="background1" w:themeFillShade="F2"/>
             <w:tcMar>
               <w:top w:w="80" w:type="dxa"/>
               <w:left w:w="120" w:type="dxa"/>
@@ -2333,116 +2446,51 @@
           </w:tcPr>
           <w:p>
             <w:pPr>
-              <w:jc w:val="center"/>
+              <w:rPr>
+                <w:b/>
+                <w:bCs/>
+                <w:color w:val="EE0000"/>
+              </w:rPr>
             </w:pPr>
             <w:r>
               <w:rPr>
                 <w:b/>
                 <w:bCs/>
-                <w:color w:val="FFFFFF"/>
-                <w:sz w:val="22"/>
-                <w:szCs w:val="22"/>
-              </w:rPr>
-              <w:t>#</w:t>
-            </w:r>
-          </w:p>
-        </w:tc>
-        <w:tc>
-          <w:tcPr>
-            <w:tcW w:w="10272" w:type="dxa"/>
-            <w:tcBorders>
-              <w:top w:val="single" w:sz="1" w:space="0" w:color="AAAAAA"/>
-              <w:left w:val="single" w:sz="1" w:space="0" w:color="AAAAAA"/>
-              <w:bottom w:val="single" w:sz="1" w:space="0" w:color="AAAAAA"/>
-              <w:right w:val="single" w:sz="1" w:space="0" w:color="AAAAAA"/>
-            </w:tcBorders>
-            <w:shd w:val="clear" w:color="auto" w:fill="1F4E79"/>
-            <w:tcMar>
-              <w:top w:w="80" w:type="dxa"/>
-              <w:left w:w="120" w:type="dxa"/>
-              <w:bottom w:w="80" w:type="dxa"/>
-              <w:right w:w="120" w:type="dxa"/>
-            </w:tcMar>
-            <w:vAlign w:val="center"/>
-          </w:tcPr>
-          <w:p>
-            <w:pPr>
-              <w:jc w:val="center"/>
-            </w:pPr>
-            <w:r>
-              <w:rPr>
-                <w:b/>
-                <w:bCs/>
-                <w:color w:val="FFFFFF"/>
-                <w:sz w:val="22"/>
-                <w:szCs w:val="22"/>
-              </w:rPr>
-              <w:t>Note</w:t>
-            </w:r>
-          </w:p>
-        </w:tc>
-      </w:tr>
-      <w:tr>
-        <w:tc>
-          <w:tcPr>
-            <w:tcW w:w="500" w:type="dxa"/>
-            <w:tcBorders>
-              <w:top w:val="single" w:sz="1" w:space="0" w:color="AAAAAA"/>
-              <w:left w:val="single" w:sz="1" w:space="0" w:color="AAAAAA"/>
-              <w:bottom w:val="single" w:sz="1" w:space="0" w:color="AAAAAA"/>
-              <w:right w:val="single" w:sz="1" w:space="0" w:color="AAAAAA"/>
-            </w:tcBorders>
-            <w:tcMar>
-              <w:top w:w="80" w:type="dxa"/>
-              <w:left w:w="120" w:type="dxa"/>
-              <w:bottom w:w="80" w:type="dxa"/>
-              <w:right w:w="120" w:type="dxa"/>
-            </w:tcMar>
-            <w:vAlign w:val="center"/>
-          </w:tcPr>
-          <w:p>
-            <w:r>
-              <w:rPr>
-                <w:color w:val="000000"/>
-                <w:sz w:val="22"/>
-                <w:szCs w:val="22"/>
-              </w:rPr>
-              <w:t>1</w:t>
-            </w:r>
-          </w:p>
-        </w:tc>
-        <w:tc>
-          <w:tcPr>
-            <w:tcW w:w="10272" w:type="dxa"/>
-            <w:tcBorders>
-              <w:top w:val="single" w:sz="1" w:space="0" w:color="AAAAAA"/>
-              <w:left w:val="single" w:sz="1" w:space="0" w:color="AAAAAA"/>
-              <w:bottom w:val="single" w:sz="1" w:space="0" w:color="AAAAAA"/>
-              <w:right w:val="single" w:sz="1" w:space="0" w:color="AAAAAA"/>
-            </w:tcBorders>
-            <w:tcMar>
-              <w:top w:w="80" w:type="dxa"/>
-              <w:left w:w="120" w:type="dxa"/>
-              <w:bottom w:w="80" w:type="dxa"/>
-              <w:right w:w="120" w:type="dxa"/>
-            </w:tcMar>
-            <w:vAlign w:val="center"/>
-          </w:tcPr>
-          <w:p>
-            <w:pPr>
-              <w:rPr>
-                <w:b/>
-                <w:bCs/>
                 <w:color w:val="EE0000"/>
               </w:rPr>
-            </w:pPr>
+              <w:t xml:space="preserve">Start inserting </w:t>
+            </w:r>
             <w:r>
               <w:rPr>
                 <w:b/>
                 <w:bCs/>
                 <w:color w:val="EE0000"/>
               </w:rPr>
-              <w:t>Start inserting PM notes from here!</w:t>
+              <w:t>M</w:t>
+            </w:r>
+            <w:r>
+              <w:rPr>
+                <w:b/>
+                <w:bCs/>
+                <w:color w:val="EE0000"/>
+              </w:rPr>
+              <w:t>a</w:t>
+            </w:r>
+            <w:r>
+              <w:rPr>
+                <w:b/>
+                <w:bCs/>
+                <w:color w:val="EE0000"/>
+              </w:rPr>
+              <w:t>rketing</w:t>
+            </w:r>
+            <w:r>
+              <w:rPr>
+                <w:b/>
+                <w:bCs/>
+                <w:color w:val="EE0000"/>
+              </w:rPr>
+              <w:t xml:space="preserve"> notes from here!</w:t>
             </w:r>
           </w:p>
         </w:tc>
@@ -2454,628 +2502,6 @@
           <w:bottom w:val="single" w:sz="10" w:space="4" w:color="1F4E79"/>
         </w:pBdr>
         <w:spacing w:before="320" w:after="160"/>
-      </w:pPr>
-      <w:r>
-        <w:rPr>
-          <w:b/>
-          <w:bCs/>
-          <w:color w:val="1F4E79"/>
-          <w:sz w:val="26"/>
-          <w:szCs w:val="26"/>
-        </w:rPr>
-        <w:t>7</w:t>
-      </w:r>
-      <w:r>
-        <w:rPr>
-          <w:b/>
-          <w:bCs/>
-          <w:color w:val="1F4E79"/>
-          <w:sz w:val="26"/>
-          <w:szCs w:val="26"/>
-        </w:rPr>
-        <w:t>.  Action Items</w:t>
-      </w:r>
-    </w:p>
-    <w:tbl>
-      <w:tblPr>
-        <w:tblW w:w="10772" w:type="dxa"/>
-        <w:tblBorders>
-          <w:top w:val="single" w:sz="4" w:space="0" w:color="auto"/>
-          <w:left w:val="single" w:sz="4" w:space="0" w:color="auto"/>
-          <w:bottom w:val="single" w:sz="4" w:space="0" w:color="auto"/>
-          <w:right w:val="single" w:sz="4" w:space="0" w:color="auto"/>
-          <w:insideH w:val="single" w:sz="4" w:space="0" w:color="auto"/>
-          <w:insideV w:val="single" w:sz="4" w:space="0" w:color="auto"/>
-        </w:tblBorders>
-        <w:tblCellMar>
-          <w:left w:w="10" w:type="dxa"/>
-          <w:right w:w="10" w:type="dxa"/>
-        </w:tblCellMar>
-        <w:tblLook w:val="04A0" w:firstRow="1" w:lastRow="0" w:firstColumn="1" w:lastColumn="0" w:noHBand="0" w:noVBand="1"/>
-      </w:tblPr>
-      <w:tblGrid>
-        <w:gridCol w:w="500"/>
-        <w:gridCol w:w="7012"/>
-        <w:gridCol w:w="1701"/>
-        <w:gridCol w:w="1559"/>
-      </w:tblGrid>
-      <w:tr>
-        <w:tc>
-          <w:tcPr>
-            <w:tcW w:w="500" w:type="dxa"/>
-            <w:tcBorders>
-              <w:top w:val="single" w:sz="1" w:space="0" w:color="AAAAAA"/>
-              <w:left w:val="single" w:sz="1" w:space="0" w:color="AAAAAA"/>
-              <w:bottom w:val="single" w:sz="1" w:space="0" w:color="AAAAAA"/>
-              <w:right w:val="single" w:sz="1" w:space="0" w:color="AAAAAA"/>
-            </w:tcBorders>
-            <w:shd w:val="clear" w:color="auto" w:fill="1F4E79"/>
-            <w:tcMar>
-              <w:top w:w="80" w:type="dxa"/>
-              <w:left w:w="120" w:type="dxa"/>
-              <w:bottom w:w="80" w:type="dxa"/>
-              <w:right w:w="120" w:type="dxa"/>
-            </w:tcMar>
-            <w:vAlign w:val="center"/>
-          </w:tcPr>
-          <w:p>
-            <w:pPr>
-              <w:jc w:val="center"/>
-            </w:pPr>
-            <w:r>
-              <w:rPr>
-                <w:b/>
-                <w:bCs/>
-                <w:color w:val="FFFFFF"/>
-                <w:sz w:val="22"/>
-                <w:szCs w:val="22"/>
-              </w:rPr>
-              <w:t>#</w:t>
-            </w:r>
-          </w:p>
-        </w:tc>
-        <w:tc>
-          <w:tcPr>
-            <w:tcW w:w="7012" w:type="dxa"/>
-            <w:tcBorders>
-              <w:top w:val="single" w:sz="1" w:space="0" w:color="AAAAAA"/>
-              <w:left w:val="single" w:sz="1" w:space="0" w:color="AAAAAA"/>
-              <w:bottom w:val="single" w:sz="1" w:space="0" w:color="AAAAAA"/>
-              <w:right w:val="single" w:sz="1" w:space="0" w:color="AAAAAA"/>
-            </w:tcBorders>
-            <w:shd w:val="clear" w:color="auto" w:fill="1F4E79"/>
-            <w:tcMar>
-              <w:top w:w="80" w:type="dxa"/>
-              <w:left w:w="120" w:type="dxa"/>
-              <w:bottom w:w="80" w:type="dxa"/>
-              <w:right w:w="120" w:type="dxa"/>
-            </w:tcMar>
-            <w:vAlign w:val="center"/>
-          </w:tcPr>
-          <w:p>
-            <w:pPr>
-              <w:jc w:val="center"/>
-            </w:pPr>
-            <w:r>
-              <w:rPr>
-                <w:b/>
-                <w:bCs/>
-                <w:color w:val="FFFFFF"/>
-                <w:sz w:val="22"/>
-                <w:szCs w:val="22"/>
-              </w:rPr>
-              <w:t>Action</w:t>
-            </w:r>
-          </w:p>
-        </w:tc>
-        <w:tc>
-          <w:tcPr>
-            <w:tcW w:w="1701" w:type="dxa"/>
-            <w:tcBorders>
-              <w:top w:val="single" w:sz="1" w:space="0" w:color="AAAAAA"/>
-              <w:left w:val="single" w:sz="1" w:space="0" w:color="AAAAAA"/>
-              <w:bottom w:val="single" w:sz="1" w:space="0" w:color="AAAAAA"/>
-              <w:right w:val="single" w:sz="1" w:space="0" w:color="AAAAAA"/>
-            </w:tcBorders>
-            <w:shd w:val="clear" w:color="auto" w:fill="1F4E79"/>
-            <w:tcMar>
-              <w:top w:w="80" w:type="dxa"/>
-              <w:left w:w="120" w:type="dxa"/>
-              <w:bottom w:w="80" w:type="dxa"/>
-              <w:right w:w="120" w:type="dxa"/>
-            </w:tcMar>
-            <w:vAlign w:val="center"/>
-          </w:tcPr>
-          <w:p>
-            <w:pPr>
-              <w:jc w:val="center"/>
-            </w:pPr>
-            <w:r>
-              <w:rPr>
-                <w:b/>
-                <w:bCs/>
-                <w:color w:val="FFFFFF"/>
-                <w:sz w:val="22"/>
-                <w:szCs w:val="22"/>
-              </w:rPr>
-              <w:t>Owner</w:t>
-            </w:r>
-          </w:p>
-        </w:tc>
-        <w:tc>
-          <w:tcPr>
-            <w:tcW w:w="1559" w:type="dxa"/>
-            <w:tcBorders>
-              <w:top w:val="single" w:sz="1" w:space="0" w:color="AAAAAA"/>
-              <w:left w:val="single" w:sz="1" w:space="0" w:color="AAAAAA"/>
-              <w:bottom w:val="single" w:sz="1" w:space="0" w:color="AAAAAA"/>
-              <w:right w:val="single" w:sz="1" w:space="0" w:color="AAAAAA"/>
-            </w:tcBorders>
-            <w:shd w:val="clear" w:color="auto" w:fill="1F4E79"/>
-            <w:tcMar>
-              <w:top w:w="80" w:type="dxa"/>
-              <w:left w:w="120" w:type="dxa"/>
-              <w:bottom w:w="80" w:type="dxa"/>
-              <w:right w:w="120" w:type="dxa"/>
-            </w:tcMar>
-            <w:vAlign w:val="center"/>
-          </w:tcPr>
-          <w:p>
-            <w:pPr>
-              <w:jc w:val="center"/>
-            </w:pPr>
-            <w:r>
-              <w:rPr>
-                <w:b/>
-                <w:bCs/>
-                <w:color w:val="FFFFFF"/>
-                <w:sz w:val="22"/>
-                <w:szCs w:val="22"/>
-              </w:rPr>
-              <w:t>Due Date</w:t>
-            </w:r>
-          </w:p>
-        </w:tc>
-      </w:tr>
-      <w:tr>
-        <w:tc>
-          <w:tcPr>
-            <w:tcW w:w="500" w:type="dxa"/>
-            <w:tcBorders>
-              <w:top w:val="single" w:sz="1" w:space="0" w:color="AAAAAA"/>
-              <w:left w:val="single" w:sz="1" w:space="0" w:color="AAAAAA"/>
-              <w:bottom w:val="single" w:sz="1" w:space="0" w:color="AAAAAA"/>
-              <w:right w:val="single" w:sz="1" w:space="0" w:color="AAAAAA"/>
-            </w:tcBorders>
-            <w:tcMar>
-              <w:top w:w="80" w:type="dxa"/>
-              <w:left w:w="120" w:type="dxa"/>
-              <w:bottom w:w="80" w:type="dxa"/>
-              <w:right w:w="120" w:type="dxa"/>
-            </w:tcMar>
-            <w:vAlign w:val="center"/>
-          </w:tcPr>
-          <w:p>
-            <w:r>
-              <w:rPr>
-                <w:color w:val="000000"/>
-                <w:sz w:val="22"/>
-                <w:szCs w:val="22"/>
-              </w:rPr>
-              <w:t>1</w:t>
-            </w:r>
-          </w:p>
-        </w:tc>
-        <w:tc>
-          <w:tcPr>
-            <w:tcW w:w="7012" w:type="dxa"/>
-            <w:tcBorders>
-              <w:top w:val="single" w:sz="1" w:space="0" w:color="AAAAAA"/>
-              <w:left w:val="single" w:sz="1" w:space="0" w:color="AAAAAA"/>
-              <w:bottom w:val="single" w:sz="1" w:space="0" w:color="AAAAAA"/>
-              <w:right w:val="single" w:sz="1" w:space="0" w:color="AAAAAA"/>
-            </w:tcBorders>
-            <w:tcMar>
-              <w:top w:w="80" w:type="dxa"/>
-              <w:left w:w="120" w:type="dxa"/>
-              <w:bottom w:w="80" w:type="dxa"/>
-              <w:right w:w="120" w:type="dxa"/>
-            </w:tcMar>
-            <w:vAlign w:val="center"/>
-          </w:tcPr>
-          <w:p/>
-        </w:tc>
-        <w:tc>
-          <w:tcPr>
-            <w:tcW w:w="1701" w:type="dxa"/>
-            <w:tcBorders>
-              <w:top w:val="single" w:sz="1" w:space="0" w:color="AAAAAA"/>
-              <w:left w:val="single" w:sz="1" w:space="0" w:color="AAAAAA"/>
-              <w:bottom w:val="single" w:sz="1" w:space="0" w:color="AAAAAA"/>
-              <w:right w:val="single" w:sz="1" w:space="0" w:color="AAAAAA"/>
-            </w:tcBorders>
-            <w:tcMar>
-              <w:top w:w="80" w:type="dxa"/>
-              <w:left w:w="120" w:type="dxa"/>
-              <w:bottom w:w="80" w:type="dxa"/>
-              <w:right w:w="120" w:type="dxa"/>
-            </w:tcMar>
-            <w:vAlign w:val="center"/>
-          </w:tcPr>
-          <w:p/>
-        </w:tc>
-        <w:tc>
-          <w:tcPr>
-            <w:tcW w:w="1559" w:type="dxa"/>
-            <w:tcBorders>
-              <w:top w:val="single" w:sz="1" w:space="0" w:color="AAAAAA"/>
-              <w:left w:val="single" w:sz="1" w:space="0" w:color="AAAAAA"/>
-              <w:bottom w:val="single" w:sz="1" w:space="0" w:color="AAAAAA"/>
-              <w:right w:val="single" w:sz="1" w:space="0" w:color="AAAAAA"/>
-            </w:tcBorders>
-            <w:tcMar>
-              <w:top w:w="80" w:type="dxa"/>
-              <w:left w:w="120" w:type="dxa"/>
-              <w:bottom w:w="80" w:type="dxa"/>
-              <w:right w:w="120" w:type="dxa"/>
-            </w:tcMar>
-            <w:vAlign w:val="center"/>
-          </w:tcPr>
-          <w:p/>
-        </w:tc>
-      </w:tr>
-      <w:tr>
-        <w:tc>
-          <w:tcPr>
-            <w:tcW w:w="500" w:type="dxa"/>
-            <w:tcBorders>
-              <w:top w:val="single" w:sz="1" w:space="0" w:color="AAAAAA"/>
-              <w:left w:val="single" w:sz="1" w:space="0" w:color="AAAAAA"/>
-              <w:bottom w:val="single" w:sz="1" w:space="0" w:color="AAAAAA"/>
-              <w:right w:val="single" w:sz="1" w:space="0" w:color="AAAAAA"/>
-            </w:tcBorders>
-            <w:tcMar>
-              <w:top w:w="80" w:type="dxa"/>
-              <w:left w:w="120" w:type="dxa"/>
-              <w:bottom w:w="80" w:type="dxa"/>
-              <w:right w:w="120" w:type="dxa"/>
-            </w:tcMar>
-            <w:vAlign w:val="center"/>
-          </w:tcPr>
-          <w:p>
-            <w:r>
-              <w:rPr>
-                <w:color w:val="000000"/>
-                <w:sz w:val="22"/>
-                <w:szCs w:val="22"/>
-              </w:rPr>
-              <w:t>2</w:t>
-            </w:r>
-          </w:p>
-        </w:tc>
-        <w:tc>
-          <w:tcPr>
-            <w:tcW w:w="7012" w:type="dxa"/>
-            <w:tcBorders>
-              <w:top w:val="single" w:sz="1" w:space="0" w:color="AAAAAA"/>
-              <w:left w:val="single" w:sz="1" w:space="0" w:color="AAAAAA"/>
-              <w:bottom w:val="single" w:sz="1" w:space="0" w:color="AAAAAA"/>
-              <w:right w:val="single" w:sz="1" w:space="0" w:color="AAAAAA"/>
-            </w:tcBorders>
-            <w:tcMar>
-              <w:top w:w="80" w:type="dxa"/>
-              <w:left w:w="120" w:type="dxa"/>
-              <w:bottom w:w="80" w:type="dxa"/>
-              <w:right w:w="120" w:type="dxa"/>
-            </w:tcMar>
-            <w:vAlign w:val="center"/>
-          </w:tcPr>
-          <w:p/>
-        </w:tc>
-        <w:tc>
-          <w:tcPr>
-            <w:tcW w:w="1701" w:type="dxa"/>
-            <w:tcBorders>
-              <w:top w:val="single" w:sz="1" w:space="0" w:color="AAAAAA"/>
-              <w:left w:val="single" w:sz="1" w:space="0" w:color="AAAAAA"/>
-              <w:bottom w:val="single" w:sz="1" w:space="0" w:color="AAAAAA"/>
-              <w:right w:val="single" w:sz="1" w:space="0" w:color="AAAAAA"/>
-            </w:tcBorders>
-            <w:tcMar>
-              <w:top w:w="80" w:type="dxa"/>
-              <w:left w:w="120" w:type="dxa"/>
-              <w:bottom w:w="80" w:type="dxa"/>
-              <w:right w:w="120" w:type="dxa"/>
-            </w:tcMar>
-            <w:vAlign w:val="center"/>
-          </w:tcPr>
-          <w:p/>
-        </w:tc>
-        <w:tc>
-          <w:tcPr>
-            <w:tcW w:w="1559" w:type="dxa"/>
-            <w:tcBorders>
-              <w:top w:val="single" w:sz="1" w:space="0" w:color="AAAAAA"/>
-              <w:left w:val="single" w:sz="1" w:space="0" w:color="AAAAAA"/>
-              <w:bottom w:val="single" w:sz="1" w:space="0" w:color="AAAAAA"/>
-              <w:right w:val="single" w:sz="1" w:space="0" w:color="AAAAAA"/>
-            </w:tcBorders>
-            <w:tcMar>
-              <w:top w:w="80" w:type="dxa"/>
-              <w:left w:w="120" w:type="dxa"/>
-              <w:bottom w:w="80" w:type="dxa"/>
-              <w:right w:w="120" w:type="dxa"/>
-            </w:tcMar>
-            <w:vAlign w:val="center"/>
-          </w:tcPr>
-          <w:p/>
-        </w:tc>
-      </w:tr>
-      <w:tr>
-        <w:tc>
-          <w:tcPr>
-            <w:tcW w:w="500" w:type="dxa"/>
-            <w:tcBorders>
-              <w:top w:val="single" w:sz="1" w:space="0" w:color="AAAAAA"/>
-              <w:left w:val="single" w:sz="1" w:space="0" w:color="AAAAAA"/>
-              <w:bottom w:val="single" w:sz="1" w:space="0" w:color="AAAAAA"/>
-              <w:right w:val="single" w:sz="1" w:space="0" w:color="AAAAAA"/>
-            </w:tcBorders>
-            <w:tcMar>
-              <w:top w:w="80" w:type="dxa"/>
-              <w:left w:w="120" w:type="dxa"/>
-              <w:bottom w:w="80" w:type="dxa"/>
-              <w:right w:w="120" w:type="dxa"/>
-            </w:tcMar>
-            <w:vAlign w:val="center"/>
-          </w:tcPr>
-          <w:p>
-            <w:r>
-              <w:rPr>
-                <w:color w:val="000000"/>
-                <w:sz w:val="22"/>
-                <w:szCs w:val="22"/>
-              </w:rPr>
-              <w:t>3</w:t>
-            </w:r>
-          </w:p>
-        </w:tc>
-        <w:tc>
-          <w:tcPr>
-            <w:tcW w:w="7012" w:type="dxa"/>
-            <w:tcBorders>
-              <w:top w:val="single" w:sz="1" w:space="0" w:color="AAAAAA"/>
-              <w:left w:val="single" w:sz="1" w:space="0" w:color="AAAAAA"/>
-              <w:bottom w:val="single" w:sz="1" w:space="0" w:color="AAAAAA"/>
-              <w:right w:val="single" w:sz="1" w:space="0" w:color="AAAAAA"/>
-            </w:tcBorders>
-            <w:tcMar>
-              <w:top w:w="80" w:type="dxa"/>
-              <w:left w:w="120" w:type="dxa"/>
-              <w:bottom w:w="80" w:type="dxa"/>
-              <w:right w:w="120" w:type="dxa"/>
-            </w:tcMar>
-            <w:vAlign w:val="center"/>
-          </w:tcPr>
-          <w:p/>
-        </w:tc>
-        <w:tc>
-          <w:tcPr>
-            <w:tcW w:w="1701" w:type="dxa"/>
-            <w:tcBorders>
-              <w:top w:val="single" w:sz="1" w:space="0" w:color="AAAAAA"/>
-              <w:left w:val="single" w:sz="1" w:space="0" w:color="AAAAAA"/>
-              <w:bottom w:val="single" w:sz="1" w:space="0" w:color="AAAAAA"/>
-              <w:right w:val="single" w:sz="1" w:space="0" w:color="AAAAAA"/>
-            </w:tcBorders>
-            <w:tcMar>
-              <w:top w:w="80" w:type="dxa"/>
-              <w:left w:w="120" w:type="dxa"/>
-              <w:bottom w:w="80" w:type="dxa"/>
-              <w:right w:w="120" w:type="dxa"/>
-            </w:tcMar>
-            <w:vAlign w:val="center"/>
-          </w:tcPr>
-          <w:p/>
-        </w:tc>
-        <w:tc>
-          <w:tcPr>
-            <w:tcW w:w="1559" w:type="dxa"/>
-            <w:tcBorders>
-              <w:top w:val="single" w:sz="1" w:space="0" w:color="AAAAAA"/>
-              <w:left w:val="single" w:sz="1" w:space="0" w:color="AAAAAA"/>
-              <w:bottom w:val="single" w:sz="1" w:space="0" w:color="AAAAAA"/>
-              <w:right w:val="single" w:sz="1" w:space="0" w:color="AAAAAA"/>
-            </w:tcBorders>
-            <w:tcMar>
-              <w:top w:w="80" w:type="dxa"/>
-              <w:left w:w="120" w:type="dxa"/>
-              <w:bottom w:w="80" w:type="dxa"/>
-              <w:right w:w="120" w:type="dxa"/>
-            </w:tcMar>
-            <w:vAlign w:val="center"/>
-          </w:tcPr>
-          <w:p/>
-        </w:tc>
-      </w:tr>
-      <w:tr>
-        <w:tc>
-          <w:tcPr>
-            <w:tcW w:w="500" w:type="dxa"/>
-            <w:tcBorders>
-              <w:top w:val="single" w:sz="1" w:space="0" w:color="AAAAAA"/>
-              <w:left w:val="single" w:sz="1" w:space="0" w:color="AAAAAA"/>
-              <w:bottom w:val="single" w:sz="1" w:space="0" w:color="AAAAAA"/>
-              <w:right w:val="single" w:sz="1" w:space="0" w:color="AAAAAA"/>
-            </w:tcBorders>
-            <w:tcMar>
-              <w:top w:w="80" w:type="dxa"/>
-              <w:left w:w="120" w:type="dxa"/>
-              <w:bottom w:w="80" w:type="dxa"/>
-              <w:right w:w="120" w:type="dxa"/>
-            </w:tcMar>
-            <w:vAlign w:val="center"/>
-          </w:tcPr>
-          <w:p>
-            <w:r>
-              <w:rPr>
-                <w:color w:val="000000"/>
-                <w:sz w:val="22"/>
-                <w:szCs w:val="22"/>
-              </w:rPr>
-              <w:t>4</w:t>
-            </w:r>
-          </w:p>
-        </w:tc>
-        <w:tc>
-          <w:tcPr>
-            <w:tcW w:w="7012" w:type="dxa"/>
-            <w:tcBorders>
-              <w:top w:val="single" w:sz="1" w:space="0" w:color="AAAAAA"/>
-              <w:left w:val="single" w:sz="1" w:space="0" w:color="AAAAAA"/>
-              <w:bottom w:val="single" w:sz="1" w:space="0" w:color="AAAAAA"/>
-              <w:right w:val="single" w:sz="1" w:space="0" w:color="AAAAAA"/>
-            </w:tcBorders>
-            <w:tcMar>
-              <w:top w:w="80" w:type="dxa"/>
-              <w:left w:w="120" w:type="dxa"/>
-              <w:bottom w:w="80" w:type="dxa"/>
-              <w:right w:w="120" w:type="dxa"/>
-            </w:tcMar>
-            <w:vAlign w:val="center"/>
-          </w:tcPr>
-          <w:p/>
-        </w:tc>
-        <w:tc>
-          <w:tcPr>
-            <w:tcW w:w="1701" w:type="dxa"/>
-            <w:tcBorders>
-              <w:top w:val="single" w:sz="1" w:space="0" w:color="AAAAAA"/>
-              <w:left w:val="single" w:sz="1" w:space="0" w:color="AAAAAA"/>
-              <w:bottom w:val="single" w:sz="1" w:space="0" w:color="AAAAAA"/>
-              <w:right w:val="single" w:sz="1" w:space="0" w:color="AAAAAA"/>
-            </w:tcBorders>
-            <w:tcMar>
-              <w:top w:w="80" w:type="dxa"/>
-              <w:left w:w="120" w:type="dxa"/>
-              <w:bottom w:w="80" w:type="dxa"/>
-              <w:right w:w="120" w:type="dxa"/>
-            </w:tcMar>
-            <w:vAlign w:val="center"/>
-          </w:tcPr>
-          <w:p/>
-        </w:tc>
-        <w:tc>
-          <w:tcPr>
-            <w:tcW w:w="1559" w:type="dxa"/>
-            <w:tcBorders>
-              <w:top w:val="single" w:sz="1" w:space="0" w:color="AAAAAA"/>
-              <w:left w:val="single" w:sz="1" w:space="0" w:color="AAAAAA"/>
-              <w:bottom w:val="single" w:sz="1" w:space="0" w:color="AAAAAA"/>
-              <w:right w:val="single" w:sz="1" w:space="0" w:color="AAAAAA"/>
-            </w:tcBorders>
-            <w:tcMar>
-              <w:top w:w="80" w:type="dxa"/>
-              <w:left w:w="120" w:type="dxa"/>
-              <w:bottom w:w="80" w:type="dxa"/>
-              <w:right w:w="120" w:type="dxa"/>
-            </w:tcMar>
-            <w:vAlign w:val="center"/>
-          </w:tcPr>
-          <w:p/>
-        </w:tc>
-      </w:tr>
-      <w:tr>
-        <w:tc>
-          <w:tcPr>
-            <w:tcW w:w="500" w:type="dxa"/>
-            <w:tcBorders>
-              <w:top w:val="single" w:sz="1" w:space="0" w:color="AAAAAA"/>
-              <w:left w:val="single" w:sz="1" w:space="0" w:color="AAAAAA"/>
-              <w:bottom w:val="single" w:sz="1" w:space="0" w:color="AAAAAA"/>
-              <w:right w:val="single" w:sz="1" w:space="0" w:color="AAAAAA"/>
-            </w:tcBorders>
-            <w:tcMar>
-              <w:top w:w="80" w:type="dxa"/>
-              <w:left w:w="120" w:type="dxa"/>
-              <w:bottom w:w="80" w:type="dxa"/>
-              <w:right w:w="120" w:type="dxa"/>
-            </w:tcMar>
-            <w:vAlign w:val="center"/>
-          </w:tcPr>
-          <w:p>
-            <w:r>
-              <w:rPr>
-                <w:color w:val="000000"/>
-                <w:sz w:val="22"/>
-                <w:szCs w:val="22"/>
-              </w:rPr>
-              <w:t>5</w:t>
-            </w:r>
-          </w:p>
-        </w:tc>
-        <w:tc>
-          <w:tcPr>
-            <w:tcW w:w="7012" w:type="dxa"/>
-            <w:tcBorders>
-              <w:top w:val="single" w:sz="1" w:space="0" w:color="AAAAAA"/>
-              <w:left w:val="single" w:sz="1" w:space="0" w:color="AAAAAA"/>
-              <w:bottom w:val="single" w:sz="1" w:space="0" w:color="AAAAAA"/>
-              <w:right w:val="single" w:sz="1" w:space="0" w:color="AAAAAA"/>
-            </w:tcBorders>
-            <w:tcMar>
-              <w:top w:w="80" w:type="dxa"/>
-              <w:left w:w="120" w:type="dxa"/>
-              <w:bottom w:w="80" w:type="dxa"/>
-              <w:right w:w="120" w:type="dxa"/>
-            </w:tcMar>
-            <w:vAlign w:val="center"/>
-          </w:tcPr>
-          <w:p/>
-        </w:tc>
-        <w:tc>
-          <w:tcPr>
-            <w:tcW w:w="1701" w:type="dxa"/>
-            <w:tcBorders>
-              <w:top w:val="single" w:sz="1" w:space="0" w:color="AAAAAA"/>
-              <w:left w:val="single" w:sz="1" w:space="0" w:color="AAAAAA"/>
-              <w:bottom w:val="single" w:sz="1" w:space="0" w:color="AAAAAA"/>
-              <w:right w:val="single" w:sz="1" w:space="0" w:color="AAAAAA"/>
-            </w:tcBorders>
-            <w:tcMar>
-              <w:top w:w="80" w:type="dxa"/>
-              <w:left w:w="120" w:type="dxa"/>
-              <w:bottom w:w="80" w:type="dxa"/>
-              <w:right w:w="120" w:type="dxa"/>
-            </w:tcMar>
-            <w:vAlign w:val="center"/>
-          </w:tcPr>
-          <w:p/>
-        </w:tc>
-        <w:tc>
-          <w:tcPr>
-            <w:tcW w:w="1559" w:type="dxa"/>
-            <w:tcBorders>
-              <w:top w:val="single" w:sz="1" w:space="0" w:color="AAAAAA"/>
-              <w:left w:val="single" w:sz="1" w:space="0" w:color="AAAAAA"/>
-              <w:bottom w:val="single" w:sz="1" w:space="0" w:color="AAAAAA"/>
-              <w:right w:val="single" w:sz="1" w:space="0" w:color="AAAAAA"/>
-            </w:tcBorders>
-            <w:tcMar>
-              <w:top w:w="80" w:type="dxa"/>
-              <w:left w:w="120" w:type="dxa"/>
-              <w:bottom w:w="80" w:type="dxa"/>
-              <w:right w:w="120" w:type="dxa"/>
-            </w:tcMar>
-            <w:vAlign w:val="center"/>
-          </w:tcPr>
-          <w:p/>
-        </w:tc>
-      </w:tr>
-    </w:tbl>
-    <w:p>
-      <w:pPr>
-        <w:spacing w:before="160"/>
       </w:pPr>
     </w:p>
     <w:sectPr>
@@ -3125,7 +2551,43 @@
         <w:sz w:val="18"/>
         <w:szCs w:val="18"/>
       </w:rPr>
-      <w:t xml:space="preserve">Marketing Department  |  Marketing Kickoff Meeting Summary  |  Page </w:t>
+      <w:t xml:space="preserve">Marketing </w:t>
+    </w:r>
+    <w:proofErr w:type="gramStart"/>
+    <w:r>
+      <w:rPr>
+        <w:color w:val="888888"/>
+        <w:sz w:val="18"/>
+        <w:szCs w:val="18"/>
+      </w:rPr>
+      <w:t>Department  |</w:t>
+    </w:r>
+    <w:proofErr w:type="gramEnd"/>
+    <w:r>
+      <w:rPr>
+        <w:color w:val="888888"/>
+        <w:sz w:val="18"/>
+        <w:szCs w:val="18"/>
+      </w:rPr>
+      <w:t xml:space="preserve">  Marketing Kickoff Meeting </w:t>
+    </w:r>
+    <w:proofErr w:type="gramStart"/>
+    <w:r>
+      <w:rPr>
+        <w:color w:val="888888"/>
+        <w:sz w:val="18"/>
+        <w:szCs w:val="18"/>
+      </w:rPr>
+      <w:t>Summary  |</w:t>
+    </w:r>
+    <w:proofErr w:type="gramEnd"/>
+    <w:r>
+      <w:rPr>
+        <w:color w:val="888888"/>
+        <w:sz w:val="18"/>
+        <w:szCs w:val="18"/>
+      </w:rPr>
+      <w:t xml:space="preserve">  Page </w:t>
     </w:r>
     <w:r>
       <w:rPr>

</xml_diff>

<commit_message>
Fix logical child crash, Monday CRM export, update email body content
</commit_message>
<xml_diff>
--- a/bin/Debug/net10.0-windows/Marketing_Meeting_Summary_Template.docx
+++ b/bin/Debug/net10.0-windows/Marketing_Meeting_Summary_Template.docx
@@ -21,7 +21,7 @@
           <w:noProof/>
         </w:rPr>
         <w:drawing>
-          <wp:anchor distT="0" distB="0" distL="114300" distR="114300" simplePos="0" relativeHeight="251658240" behindDoc="0" locked="0" layoutInCell="1" allowOverlap="1" wp14:anchorId="4606FF2F" wp14:editId="6B3A193E">
+          <wp:anchor distT="0" distB="0" distL="114300" distR="114300" simplePos="0" relativeHeight="251658240" behindDoc="0" locked="0" layoutInCell="1" allowOverlap="1" wp14:anchorId="4606FF2F" wp14:editId="0D650733">
             <wp:simplePos x="0" y="0"/>
             <wp:positionH relativeFrom="margin">
               <wp:align>left</wp:align>
@@ -479,7 +479,7 @@
     </w:p>
     <w:tbl>
       <w:tblPr>
-        <w:tblW w:w="10772" w:type="dxa"/>
+        <w:tblW w:w="10770" w:type="dxa"/>
         <w:tblBorders>
           <w:top w:val="single" w:sz="4" w:space="0" w:color="auto"/>
           <w:left w:val="single" w:sz="4" w:space="0" w:color="auto"/>
@@ -495,14 +495,15 @@
         <w:tblLook w:val="04A0" w:firstRow="1" w:lastRow="0" w:firstColumn="1" w:lastColumn="0" w:noHBand="0" w:noVBand="1"/>
       </w:tblPr>
       <w:tblGrid>
-        <w:gridCol w:w="4677"/>
-        <w:gridCol w:w="6095"/>
+        <w:gridCol w:w="3685"/>
+        <w:gridCol w:w="3558"/>
+        <w:gridCol w:w="3527"/>
       </w:tblGrid>
       <w:tr>
         <w:tc>
           <w:tcPr>
-            <w:tcW w:w="10772" w:type="dxa"/>
-            <w:gridSpan w:val="2"/>
+            <w:tcW w:w="10770" w:type="dxa"/>
+            <w:gridSpan w:val="3"/>
             <w:tcBorders>
               <w:top w:val="single" w:sz="1" w:space="0" w:color="AAAAAA"/>
               <w:left w:val="single" w:sz="1" w:space="0" w:color="AAAAAA"/>
@@ -523,7 +524,7 @@
               <w:pStyle w:val="ListParagraph"/>
               <w:numPr>
                 <w:ilvl w:val="0"/>
-                <w:numId w:val="2"/>
+                <w:numId w:val="9"/>
               </w:numPr>
               <w:rPr>
                 <w:b/>
@@ -545,7 +546,7 @@
       <w:tr>
         <w:tc>
           <w:tcPr>
-            <w:tcW w:w="4677" w:type="dxa"/>
+            <w:tcW w:w="3685" w:type="dxa"/>
             <w:tcBorders>
               <w:top w:val="single" w:sz="4" w:space="0" w:color="auto"/>
               <w:left w:val="single" w:sz="4" w:space="0" w:color="auto"/>
@@ -576,31 +577,14 @@
                 <w:sz w:val="22"/>
                 <w:szCs w:val="22"/>
               </w:rPr>
-              <w:t>Selling Price</w:t>
-            </w:r>
-            <w:r>
-              <w:rPr>
-                <w:rFonts w:asciiTheme="minorHAnsi" w:hAnsiTheme="minorHAnsi"/>
-                <w:b/>
-                <w:bCs/>
-                <w:sz w:val="22"/>
-                <w:szCs w:val="22"/>
-              </w:rPr>
-              <w:t>:</w:t>
-            </w:r>
-            <w:r>
-              <w:rPr>
-                <w:sz w:val="22"/>
-                <w:szCs w:val="22"/>
-              </w:rPr>
-              <w:t xml:space="preserve"> </w:t>
-            </w:r>
-            <w:r>
-              <w:rPr>
-                <w:sz w:val="22"/>
-                <w:szCs w:val="22"/>
-              </w:rPr>
-              <w:t xml:space="preserve">        </w:t>
+              <w:t>Selling Price:</w:t>
+            </w:r>
+            <w:r>
+              <w:rPr>
+                <w:sz w:val="22"/>
+                <w:szCs w:val="22"/>
+              </w:rPr>
+              <w:t xml:space="preserve">         </w:t>
             </w:r>
             <w:r>
               <w:rPr>
@@ -633,7 +617,7 @@
         </w:tc>
         <w:tc>
           <w:tcPr>
-            <w:tcW w:w="6095" w:type="dxa"/>
+            <w:tcW w:w="3558" w:type="dxa"/>
             <w:tcBorders>
               <w:top w:val="single" w:sz="4" w:space="0" w:color="auto"/>
               <w:left w:val="single" w:sz="4" w:space="0" w:color="auto"/>
@@ -664,20 +648,113 @@
                 <w:sz w:val="22"/>
                 <w:szCs w:val="22"/>
               </w:rPr>
+              <w:t>Material Cost:</w:t>
+            </w:r>
+            <w:r>
+              <w:rPr>
+                <w:sz w:val="22"/>
+                <w:szCs w:val="22"/>
+              </w:rPr>
+              <w:t xml:space="preserve">   </w:t>
+            </w:r>
+            <w:r>
+              <w:rPr>
+                <w:b/>
+                <w:bCs/>
+                <w:color w:val="EE0000"/>
+                <w:sz w:val="22"/>
+                <w:szCs w:val="22"/>
+              </w:rPr>
               <w:t>Material Cost</w:t>
             </w:r>
             <w:r>
               <w:rPr>
+                <w:b/>
+                <w:bCs/>
+                <w:color w:val="EE0000"/>
+                <w:sz w:val="22"/>
+                <w:szCs w:val="22"/>
+              </w:rPr>
+              <w:t xml:space="preserve"> </w:t>
+            </w:r>
+            <w:r>
+              <w:rPr>
+                <w:sz w:val="22"/>
+                <w:szCs w:val="22"/>
+              </w:rPr>
+              <w:t>$</w:t>
+            </w:r>
+          </w:p>
+        </w:tc>
+        <w:tc>
+          <w:tcPr>
+            <w:tcW w:w="3527" w:type="dxa"/>
+            <w:tcBorders>
+              <w:top w:val="single" w:sz="4" w:space="0" w:color="auto"/>
+              <w:left w:val="single" w:sz="4" w:space="0" w:color="auto"/>
+              <w:bottom w:val="single" w:sz="2" w:space="0" w:color="AAAAAA"/>
+              <w:right w:val="single" w:sz="4" w:space="0" w:color="auto"/>
+            </w:tcBorders>
+            <w:shd w:val="clear" w:color="auto" w:fill="F7F7F7"/>
+          </w:tcPr>
+          <w:p>
+            <w:pPr>
+              <w:rPr>
                 <w:rFonts w:asciiTheme="minorHAnsi" w:hAnsiTheme="minorHAnsi"/>
                 <w:b/>
                 <w:bCs/>
                 <w:sz w:val="22"/>
                 <w:szCs w:val="22"/>
               </w:rPr>
-              <w:t>:</w:t>
-            </w:r>
-            <w:r>
-              <w:rPr>
+            </w:pPr>
+            <w:r>
+              <w:rPr>
+                <w:rFonts w:asciiTheme="minorHAnsi" w:hAnsiTheme="minorHAnsi"/>
+                <w:b/>
+                <w:bCs/>
+                <w:sz w:val="22"/>
+                <w:szCs w:val="22"/>
+              </w:rPr>
+              <w:t xml:space="preserve">   </w:t>
+            </w:r>
+            <w:proofErr w:type="gramStart"/>
+            <w:r>
+              <w:rPr>
+                <w:rFonts w:asciiTheme="minorHAnsi" w:hAnsiTheme="minorHAnsi"/>
+                <w:b/>
+                <w:bCs/>
+                <w:sz w:val="22"/>
+                <w:szCs w:val="22"/>
+              </w:rPr>
+              <w:t>Monday # (</w:t>
+            </w:r>
+            <w:proofErr w:type="gramEnd"/>
+            <w:r>
+              <w:rPr>
+                <w:rFonts w:asciiTheme="minorHAnsi" w:hAnsiTheme="minorHAnsi"/>
+                <w:b/>
+                <w:bCs/>
+                <w:sz w:val="22"/>
+                <w:szCs w:val="22"/>
+              </w:rPr>
+              <w:t>CRM)</w:t>
+            </w:r>
+            <w:proofErr w:type="gramStart"/>
+            <w:r>
+              <w:rPr>
+                <w:rFonts w:asciiTheme="minorHAnsi" w:hAnsiTheme="minorHAnsi"/>
+                <w:b/>
+                <w:bCs/>
+                <w:sz w:val="22"/>
+                <w:szCs w:val="22"/>
+              </w:rPr>
+              <w:t xml:space="preserve">: </w:t>
+            </w:r>
+            <w:r>
+              <w:rPr>
+                <w:rFonts w:asciiTheme="minorHAnsi" w:hAnsiTheme="minorHAnsi"/>
+                <w:b/>
+                <w:bCs/>
                 <w:sz w:val="22"/>
                 <w:szCs w:val="22"/>
               </w:rPr>
@@ -685,37 +762,26 @@
             </w:r>
             <w:r>
               <w:rPr>
-                <w:sz w:val="22"/>
-                <w:szCs w:val="22"/>
-              </w:rPr>
-              <w:t xml:space="preserve">  </w:t>
-            </w:r>
-            <w:r>
-              <w:rPr>
+                <w:rFonts w:asciiTheme="minorHAnsi" w:hAnsiTheme="minorHAnsi"/>
                 <w:b/>
                 <w:bCs/>
                 <w:color w:val="EE0000"/>
-                <w:sz w:val="22"/>
-                <w:szCs w:val="22"/>
-              </w:rPr>
-              <w:t>Material Cost</w:t>
-            </w:r>
-            <w:r>
-              <w:rPr>
+                <w:sz w:val="20"/>
+                <w:szCs w:val="20"/>
+              </w:rPr>
+              <w:t>Monday #</w:t>
+            </w:r>
+            <w:proofErr w:type="gramEnd"/>
+            <w:r>
+              <w:rPr>
+                <w:rFonts w:asciiTheme="minorHAnsi" w:hAnsiTheme="minorHAnsi"/>
                 <w:b/>
                 <w:bCs/>
                 <w:color w:val="EE0000"/>
-                <w:sz w:val="22"/>
-                <w:szCs w:val="22"/>
-              </w:rPr>
-              <w:t xml:space="preserve"> </w:t>
-            </w:r>
-            <w:r>
-              <w:rPr>
-                <w:sz w:val="22"/>
-                <w:szCs w:val="22"/>
-              </w:rPr>
-              <w:t>$</w:t>
+                <w:sz w:val="20"/>
+                <w:szCs w:val="20"/>
+              </w:rPr>
+              <w:t xml:space="preserve"> (CRM):</w:t>
             </w:r>
           </w:p>
         </w:tc>
@@ -723,7 +789,7 @@
       <w:tr>
         <w:tc>
           <w:tcPr>
-            <w:tcW w:w="4677" w:type="dxa"/>
+            <w:tcW w:w="3685" w:type="dxa"/>
             <w:tcBorders>
               <w:top w:val="single" w:sz="2" w:space="0" w:color="AAAAAA"/>
               <w:left w:val="single" w:sz="4" w:space="0" w:color="auto"/>
@@ -754,31 +820,14 @@
                 <w:sz w:val="22"/>
                 <w:szCs w:val="22"/>
               </w:rPr>
-              <w:t>Project Hours</w:t>
-            </w:r>
-            <w:r>
-              <w:rPr>
-                <w:rFonts w:asciiTheme="minorHAnsi" w:hAnsiTheme="minorHAnsi"/>
-                <w:b/>
-                <w:bCs/>
-                <w:sz w:val="22"/>
-                <w:szCs w:val="22"/>
-              </w:rPr>
-              <w:t>:</w:t>
-            </w:r>
-            <w:r>
-              <w:rPr>
-                <w:sz w:val="22"/>
-                <w:szCs w:val="22"/>
-              </w:rPr>
-              <w:t xml:space="preserve"> </w:t>
-            </w:r>
-            <w:r>
-              <w:rPr>
-                <w:sz w:val="22"/>
-                <w:szCs w:val="22"/>
-              </w:rPr>
-              <w:t xml:space="preserve">     </w:t>
+              <w:t>Project Hours:</w:t>
+            </w:r>
+            <w:r>
+              <w:rPr>
+                <w:sz w:val="22"/>
+                <w:szCs w:val="22"/>
+              </w:rPr>
+              <w:t xml:space="preserve">      </w:t>
             </w:r>
             <w:r>
               <w:rPr>
@@ -794,7 +843,7 @@
         </w:tc>
         <w:tc>
           <w:tcPr>
-            <w:tcW w:w="6095" w:type="dxa"/>
+            <w:tcW w:w="3558" w:type="dxa"/>
             <w:tcBorders>
               <w:top w:val="single" w:sz="2" w:space="0" w:color="AAAAAA"/>
               <w:left w:val="single" w:sz="4" w:space="0" w:color="auto"/>
@@ -834,7 +883,7 @@
                 <w:sz w:val="22"/>
                 <w:szCs w:val="22"/>
               </w:rPr>
-              <w:t xml:space="preserve">           </w:t>
+              <w:t xml:space="preserve">  </w:t>
             </w:r>
             <w:r>
               <w:rPr>
@@ -853,13 +902,36 @@
               </w:rPr>
               <w:t>Penalties</w:t>
             </w:r>
+          </w:p>
+        </w:tc>
+        <w:tc>
+          <w:tcPr>
+            <w:tcW w:w="3527" w:type="dxa"/>
+            <w:tcBorders>
+              <w:top w:val="single" w:sz="2" w:space="0" w:color="AAAAAA"/>
+              <w:left w:val="single" w:sz="4" w:space="0" w:color="auto"/>
+              <w:bottom w:val="single" w:sz="2" w:space="0" w:color="AAAAAA"/>
+              <w:right w:val="single" w:sz="4" w:space="0" w:color="auto"/>
+            </w:tcBorders>
+            <w:shd w:val="clear" w:color="auto" w:fill="F7F7F7"/>
+          </w:tcPr>
+          <w:p>
+            <w:pPr>
+              <w:rPr>
+                <w:rFonts w:asciiTheme="minorHAnsi" w:hAnsiTheme="minorHAnsi"/>
+                <w:b/>
+                <w:bCs/>
+                <w:sz w:val="22"/>
+                <w:szCs w:val="22"/>
+              </w:rPr>
+            </w:pPr>
           </w:p>
         </w:tc>
       </w:tr>
       <w:tr>
         <w:tc>
           <w:tcPr>
-            <w:tcW w:w="4677" w:type="dxa"/>
+            <w:tcW w:w="3685" w:type="dxa"/>
             <w:tcBorders>
               <w:top w:val="single" w:sz="2" w:space="0" w:color="AAAAAA"/>
               <w:left w:val="single" w:sz="4" w:space="0" w:color="auto"/>
@@ -913,7 +985,7 @@
         </w:tc>
         <w:tc>
           <w:tcPr>
-            <w:tcW w:w="6095" w:type="dxa"/>
+            <w:tcW w:w="3558" w:type="dxa"/>
             <w:tcBorders>
               <w:top w:val="single" w:sz="2" w:space="0" w:color="AAAAAA"/>
               <w:left w:val="single" w:sz="4" w:space="0" w:color="auto"/>
@@ -949,6 +1021,29 @@
               </w:rPr>
               <w:t xml:space="preserve">D.O Rated: </w:t>
             </w:r>
+          </w:p>
+        </w:tc>
+        <w:tc>
+          <w:tcPr>
+            <w:tcW w:w="3527" w:type="dxa"/>
+            <w:tcBorders>
+              <w:top w:val="single" w:sz="2" w:space="0" w:color="AAAAAA"/>
+              <w:left w:val="single" w:sz="4" w:space="0" w:color="auto"/>
+              <w:bottom w:val="single" w:sz="4" w:space="0" w:color="auto"/>
+              <w:right w:val="single" w:sz="4" w:space="0" w:color="auto"/>
+            </w:tcBorders>
+            <w:shd w:val="clear" w:color="auto" w:fill="F7F7F7"/>
+          </w:tcPr>
+          <w:p>
+            <w:pPr>
+              <w:rPr>
+                <w:rFonts w:asciiTheme="minorHAnsi" w:hAnsiTheme="minorHAnsi"/>
+                <w:b/>
+                <w:bCs/>
+                <w:sz w:val="22"/>
+                <w:szCs w:val="22"/>
+              </w:rPr>
+            </w:pPr>
           </w:p>
         </w:tc>
       </w:tr>
@@ -1005,7 +1100,7 @@
               <w:pStyle w:val="ListParagraph"/>
               <w:numPr>
                 <w:ilvl w:val="0"/>
-                <w:numId w:val="2"/>
+                <w:numId w:val="9"/>
               </w:numPr>
               <w:rPr>
                 <w:b/>
@@ -1280,7 +1375,7 @@
               <w:pStyle w:val="ListParagraph"/>
               <w:numPr>
                 <w:ilvl w:val="0"/>
-                <w:numId w:val="2"/>
+                <w:numId w:val="9"/>
               </w:numPr>
               <w:rPr>
                 <w:b/>
@@ -1694,6 +1789,16 @@
           <w:szCs w:val="26"/>
         </w:rPr>
         <w:t xml:space="preserve"> Questions</w:t>
+      </w:r>
+      <w:r>
+        <w:rPr>
+          <w:b/>
+          <w:bCs/>
+          <w:color w:val="1F4E79"/>
+          <w:sz w:val="26"/>
+          <w:szCs w:val="26"/>
+        </w:rPr>
+        <w:t>/Notes</w:t>
       </w:r>
     </w:p>
     <w:tbl>
@@ -1794,6 +1899,16 @@
               </w:rPr>
               <w:t>Question</w:t>
             </w:r>
+            <w:r>
+              <w:rPr>
+                <w:b/>
+                <w:bCs/>
+                <w:color w:val="FFFFFF"/>
+                <w:sz w:val="22"/>
+                <w:szCs w:val="22"/>
+              </w:rPr>
+              <w:t>s/Notes</w:t>
+            </w:r>
           </w:p>
         </w:tc>
       </w:tr>
@@ -1981,6 +2096,16 @@
               </w:rPr>
               <w:t>Question</w:t>
             </w:r>
+            <w:r>
+              <w:rPr>
+                <w:b/>
+                <w:bCs/>
+                <w:color w:val="FFFFFF"/>
+                <w:sz w:val="22"/>
+                <w:szCs w:val="22"/>
+              </w:rPr>
+              <w:t>s/Notes</w:t>
+            </w:r>
           </w:p>
         </w:tc>
       </w:tr>
@@ -2072,425 +2197,6 @@
                 <w:color w:val="EE0000"/>
               </w:rPr>
               <w:t xml:space="preserve"> from here!</w:t>
-            </w:r>
-          </w:p>
-        </w:tc>
-      </w:tr>
-    </w:tbl>
-    <w:p>
-      <w:pPr>
-        <w:pBdr>
-          <w:bottom w:val="single" w:sz="10" w:space="4" w:color="1F4E79"/>
-        </w:pBdr>
-        <w:spacing w:before="320" w:after="160"/>
-        <w:rPr>
-          <w:b/>
-          <w:bCs/>
-          <w:color w:val="1F4E79"/>
-          <w:sz w:val="26"/>
-          <w:szCs w:val="26"/>
-        </w:rPr>
-      </w:pPr>
-    </w:p>
-    <w:p>
-      <w:pPr>
-        <w:pBdr>
-          <w:bottom w:val="single" w:sz="10" w:space="4" w:color="1F4E79"/>
-        </w:pBdr>
-        <w:spacing w:before="320" w:after="160"/>
-      </w:pPr>
-      <w:r>
-        <w:rPr>
-          <w:b/>
-          <w:bCs/>
-          <w:color w:val="1F4E79"/>
-          <w:sz w:val="26"/>
-          <w:szCs w:val="26"/>
-        </w:rPr>
-        <w:t>5</w:t>
-      </w:r>
-      <w:proofErr w:type="gramStart"/>
-      <w:r>
-        <w:rPr>
-          <w:b/>
-          <w:bCs/>
-          <w:color w:val="1F4E79"/>
-          <w:sz w:val="26"/>
-          <w:szCs w:val="26"/>
-        </w:rPr>
-        <w:t>.  Meeting</w:t>
-      </w:r>
-      <w:proofErr w:type="gramEnd"/>
-      <w:r>
-        <w:rPr>
-          <w:b/>
-          <w:bCs/>
-          <w:color w:val="1F4E79"/>
-          <w:sz w:val="26"/>
-          <w:szCs w:val="26"/>
-        </w:rPr>
-        <w:t xml:space="preserve"> Notes</w:t>
-      </w:r>
-    </w:p>
-    <w:tbl>
-      <w:tblPr>
-        <w:tblW w:w="10772" w:type="dxa"/>
-        <w:tblBorders>
-          <w:top w:val="single" w:sz="4" w:space="0" w:color="auto"/>
-          <w:left w:val="single" w:sz="4" w:space="0" w:color="auto"/>
-          <w:bottom w:val="single" w:sz="4" w:space="0" w:color="auto"/>
-          <w:right w:val="single" w:sz="4" w:space="0" w:color="auto"/>
-          <w:insideH w:val="single" w:sz="4" w:space="0" w:color="auto"/>
-          <w:insideV w:val="single" w:sz="4" w:space="0" w:color="auto"/>
-        </w:tblBorders>
-        <w:tblCellMar>
-          <w:left w:w="10" w:type="dxa"/>
-          <w:right w:w="10" w:type="dxa"/>
-        </w:tblCellMar>
-        <w:tblLook w:val="04A0" w:firstRow="1" w:lastRow="0" w:firstColumn="1" w:lastColumn="0" w:noHBand="0" w:noVBand="1"/>
-      </w:tblPr>
-      <w:tblGrid>
-        <w:gridCol w:w="500"/>
-        <w:gridCol w:w="10272"/>
-      </w:tblGrid>
-      <w:tr>
-        <w:tc>
-          <w:tcPr>
-            <w:tcW w:w="500" w:type="dxa"/>
-            <w:tcBorders>
-              <w:top w:val="single" w:sz="1" w:space="0" w:color="AAAAAA"/>
-              <w:left w:val="single" w:sz="1" w:space="0" w:color="AAAAAA"/>
-              <w:bottom w:val="single" w:sz="1" w:space="0" w:color="AAAAAA"/>
-              <w:right w:val="single" w:sz="1" w:space="0" w:color="AAAAAA"/>
-            </w:tcBorders>
-            <w:shd w:val="clear" w:color="auto" w:fill="1F4E79"/>
-            <w:tcMar>
-              <w:top w:w="80" w:type="dxa"/>
-              <w:left w:w="120" w:type="dxa"/>
-              <w:bottom w:w="80" w:type="dxa"/>
-              <w:right w:w="120" w:type="dxa"/>
-            </w:tcMar>
-            <w:vAlign w:val="center"/>
-          </w:tcPr>
-          <w:p>
-            <w:pPr>
-              <w:jc w:val="center"/>
-            </w:pPr>
-            <w:r>
-              <w:rPr>
-                <w:b/>
-                <w:bCs/>
-                <w:color w:val="FFFFFF"/>
-                <w:sz w:val="22"/>
-                <w:szCs w:val="22"/>
-              </w:rPr>
-              <w:t>#</w:t>
-            </w:r>
-          </w:p>
-        </w:tc>
-        <w:tc>
-          <w:tcPr>
-            <w:tcW w:w="10272" w:type="dxa"/>
-            <w:tcBorders>
-              <w:top w:val="single" w:sz="1" w:space="0" w:color="AAAAAA"/>
-              <w:left w:val="single" w:sz="1" w:space="0" w:color="AAAAAA"/>
-              <w:bottom w:val="single" w:sz="1" w:space="0" w:color="AAAAAA"/>
-              <w:right w:val="single" w:sz="1" w:space="0" w:color="AAAAAA"/>
-            </w:tcBorders>
-            <w:shd w:val="clear" w:color="auto" w:fill="1F4E79"/>
-            <w:tcMar>
-              <w:top w:w="80" w:type="dxa"/>
-              <w:left w:w="120" w:type="dxa"/>
-              <w:bottom w:w="80" w:type="dxa"/>
-              <w:right w:w="120" w:type="dxa"/>
-            </w:tcMar>
-            <w:vAlign w:val="center"/>
-          </w:tcPr>
-          <w:p>
-            <w:pPr>
-              <w:jc w:val="center"/>
-            </w:pPr>
-            <w:r>
-              <w:rPr>
-                <w:b/>
-                <w:bCs/>
-                <w:color w:val="FFFFFF"/>
-                <w:sz w:val="22"/>
-                <w:szCs w:val="22"/>
-              </w:rPr>
-              <w:t>PM Notes</w:t>
-            </w:r>
-          </w:p>
-        </w:tc>
-      </w:tr>
-      <w:tr>
-        <w:tc>
-          <w:tcPr>
-            <w:tcW w:w="500" w:type="dxa"/>
-            <w:tcBorders>
-              <w:top w:val="single" w:sz="1" w:space="0" w:color="AAAAAA"/>
-              <w:left w:val="single" w:sz="1" w:space="0" w:color="AAAAAA"/>
-              <w:bottom w:val="single" w:sz="1" w:space="0" w:color="AAAAAA"/>
-              <w:right w:val="single" w:sz="1" w:space="0" w:color="AAAAAA"/>
-            </w:tcBorders>
-            <w:shd w:val="clear" w:color="auto" w:fill="F2F2F2" w:themeFill="background1" w:themeFillShade="F2"/>
-            <w:tcMar>
-              <w:top w:w="80" w:type="dxa"/>
-              <w:left w:w="120" w:type="dxa"/>
-              <w:bottom w:w="80" w:type="dxa"/>
-              <w:right w:w="120" w:type="dxa"/>
-            </w:tcMar>
-            <w:vAlign w:val="center"/>
-          </w:tcPr>
-          <w:p>
-            <w:r>
-              <w:rPr>
-                <w:color w:val="000000"/>
-                <w:sz w:val="22"/>
-                <w:szCs w:val="22"/>
-              </w:rPr>
-              <w:t>1</w:t>
-            </w:r>
-          </w:p>
-        </w:tc>
-        <w:tc>
-          <w:tcPr>
-            <w:tcW w:w="10272" w:type="dxa"/>
-            <w:tcBorders>
-              <w:top w:val="single" w:sz="1" w:space="0" w:color="AAAAAA"/>
-              <w:left w:val="single" w:sz="1" w:space="0" w:color="AAAAAA"/>
-              <w:bottom w:val="single" w:sz="1" w:space="0" w:color="AAAAAA"/>
-              <w:right w:val="single" w:sz="1" w:space="0" w:color="AAAAAA"/>
-            </w:tcBorders>
-            <w:shd w:val="clear" w:color="auto" w:fill="F2F2F2" w:themeFill="background1" w:themeFillShade="F2"/>
-            <w:tcMar>
-              <w:top w:w="80" w:type="dxa"/>
-              <w:left w:w="120" w:type="dxa"/>
-              <w:bottom w:w="80" w:type="dxa"/>
-              <w:right w:w="120" w:type="dxa"/>
-            </w:tcMar>
-            <w:vAlign w:val="center"/>
-          </w:tcPr>
-          <w:p>
-            <w:r>
-              <w:rPr>
-                <w:b/>
-                <w:bCs/>
-                <w:color w:val="EE0000"/>
-              </w:rPr>
-              <w:t xml:space="preserve">Start inserting </w:t>
-            </w:r>
-            <w:r>
-              <w:rPr>
-                <w:b/>
-                <w:bCs/>
-                <w:color w:val="EE0000"/>
-              </w:rPr>
-              <w:t>PM</w:t>
-            </w:r>
-            <w:r>
-              <w:rPr>
-                <w:b/>
-                <w:bCs/>
-                <w:color w:val="EE0000"/>
-              </w:rPr>
-              <w:t xml:space="preserve"> notes from here!</w:t>
-            </w:r>
-          </w:p>
-        </w:tc>
-      </w:tr>
-    </w:tbl>
-    <w:p>
-      <w:pPr>
-        <w:spacing w:before="160" w:after="80"/>
-      </w:pPr>
-    </w:p>
-    <w:tbl>
-      <w:tblPr>
-        <w:tblW w:w="10772" w:type="dxa"/>
-        <w:tblBorders>
-          <w:top w:val="single" w:sz="4" w:space="0" w:color="auto"/>
-          <w:left w:val="single" w:sz="4" w:space="0" w:color="auto"/>
-          <w:bottom w:val="single" w:sz="4" w:space="0" w:color="auto"/>
-          <w:right w:val="single" w:sz="4" w:space="0" w:color="auto"/>
-          <w:insideH w:val="single" w:sz="4" w:space="0" w:color="auto"/>
-          <w:insideV w:val="single" w:sz="4" w:space="0" w:color="auto"/>
-        </w:tblBorders>
-        <w:tblCellMar>
-          <w:left w:w="10" w:type="dxa"/>
-          <w:right w:w="10" w:type="dxa"/>
-        </w:tblCellMar>
-        <w:tblLook w:val="04A0" w:firstRow="1" w:lastRow="0" w:firstColumn="1" w:lastColumn="0" w:noHBand="0" w:noVBand="1"/>
-      </w:tblPr>
-      <w:tblGrid>
-        <w:gridCol w:w="500"/>
-        <w:gridCol w:w="10272"/>
-      </w:tblGrid>
-      <w:tr>
-        <w:tc>
-          <w:tcPr>
-            <w:tcW w:w="500" w:type="dxa"/>
-            <w:tcBorders>
-              <w:top w:val="single" w:sz="1" w:space="0" w:color="AAAAAA"/>
-              <w:left w:val="single" w:sz="1" w:space="0" w:color="AAAAAA"/>
-              <w:bottom w:val="single" w:sz="1" w:space="0" w:color="AAAAAA"/>
-              <w:right w:val="single" w:sz="1" w:space="0" w:color="AAAAAA"/>
-            </w:tcBorders>
-            <w:shd w:val="clear" w:color="auto" w:fill="1F4E79"/>
-            <w:tcMar>
-              <w:top w:w="80" w:type="dxa"/>
-              <w:left w:w="120" w:type="dxa"/>
-              <w:bottom w:w="80" w:type="dxa"/>
-              <w:right w:w="120" w:type="dxa"/>
-            </w:tcMar>
-            <w:vAlign w:val="center"/>
-          </w:tcPr>
-          <w:p>
-            <w:pPr>
-              <w:jc w:val="center"/>
-            </w:pPr>
-            <w:r>
-              <w:rPr>
-                <w:b/>
-                <w:bCs/>
-                <w:color w:val="FFFFFF"/>
-                <w:sz w:val="22"/>
-                <w:szCs w:val="22"/>
-              </w:rPr>
-              <w:t>#</w:t>
-            </w:r>
-          </w:p>
-        </w:tc>
-        <w:tc>
-          <w:tcPr>
-            <w:tcW w:w="10272" w:type="dxa"/>
-            <w:tcBorders>
-              <w:top w:val="single" w:sz="1" w:space="0" w:color="AAAAAA"/>
-              <w:left w:val="single" w:sz="1" w:space="0" w:color="AAAAAA"/>
-              <w:bottom w:val="single" w:sz="1" w:space="0" w:color="AAAAAA"/>
-              <w:right w:val="single" w:sz="1" w:space="0" w:color="AAAAAA"/>
-            </w:tcBorders>
-            <w:shd w:val="clear" w:color="auto" w:fill="1F4E79"/>
-            <w:tcMar>
-              <w:top w:w="80" w:type="dxa"/>
-              <w:left w:w="120" w:type="dxa"/>
-              <w:bottom w:w="80" w:type="dxa"/>
-              <w:right w:w="120" w:type="dxa"/>
-            </w:tcMar>
-            <w:vAlign w:val="center"/>
-          </w:tcPr>
-          <w:p>
-            <w:pPr>
-              <w:jc w:val="center"/>
-            </w:pPr>
-            <w:r>
-              <w:rPr>
-                <w:b/>
-                <w:bCs/>
-                <w:color w:val="FFFFFF"/>
-                <w:sz w:val="22"/>
-                <w:szCs w:val="22"/>
-              </w:rPr>
-              <w:t>Marketing Notes</w:t>
-            </w:r>
-          </w:p>
-        </w:tc>
-      </w:tr>
-      <w:tr>
-        <w:tc>
-          <w:tcPr>
-            <w:tcW w:w="500" w:type="dxa"/>
-            <w:tcBorders>
-              <w:top w:val="single" w:sz="1" w:space="0" w:color="AAAAAA"/>
-              <w:left w:val="single" w:sz="1" w:space="0" w:color="AAAAAA"/>
-              <w:bottom w:val="single" w:sz="1" w:space="0" w:color="AAAAAA"/>
-              <w:right w:val="single" w:sz="1" w:space="0" w:color="AAAAAA"/>
-            </w:tcBorders>
-            <w:shd w:val="clear" w:color="auto" w:fill="F2F2F2" w:themeFill="background1" w:themeFillShade="F2"/>
-            <w:tcMar>
-              <w:top w:w="80" w:type="dxa"/>
-              <w:left w:w="120" w:type="dxa"/>
-              <w:bottom w:w="80" w:type="dxa"/>
-              <w:right w:w="120" w:type="dxa"/>
-            </w:tcMar>
-            <w:vAlign w:val="center"/>
-          </w:tcPr>
-          <w:p>
-            <w:r>
-              <w:rPr>
-                <w:color w:val="000000"/>
-                <w:sz w:val="22"/>
-                <w:szCs w:val="22"/>
-              </w:rPr>
-              <w:t>1</w:t>
-            </w:r>
-          </w:p>
-        </w:tc>
-        <w:tc>
-          <w:tcPr>
-            <w:tcW w:w="10272" w:type="dxa"/>
-            <w:tcBorders>
-              <w:top w:val="single" w:sz="1" w:space="0" w:color="AAAAAA"/>
-              <w:left w:val="single" w:sz="1" w:space="0" w:color="AAAAAA"/>
-              <w:bottom w:val="single" w:sz="1" w:space="0" w:color="AAAAAA"/>
-              <w:right w:val="single" w:sz="1" w:space="0" w:color="AAAAAA"/>
-            </w:tcBorders>
-            <w:shd w:val="clear" w:color="auto" w:fill="F2F2F2" w:themeFill="background1" w:themeFillShade="F2"/>
-            <w:tcMar>
-              <w:top w:w="80" w:type="dxa"/>
-              <w:left w:w="120" w:type="dxa"/>
-              <w:bottom w:w="80" w:type="dxa"/>
-              <w:right w:w="120" w:type="dxa"/>
-            </w:tcMar>
-            <w:vAlign w:val="center"/>
-          </w:tcPr>
-          <w:p>
-            <w:pPr>
-              <w:rPr>
-                <w:b/>
-                <w:bCs/>
-                <w:color w:val="EE0000"/>
-              </w:rPr>
-            </w:pPr>
-            <w:r>
-              <w:rPr>
-                <w:b/>
-                <w:bCs/>
-                <w:color w:val="EE0000"/>
-              </w:rPr>
-              <w:t xml:space="preserve">Start inserting </w:t>
-            </w:r>
-            <w:r>
-              <w:rPr>
-                <w:b/>
-                <w:bCs/>
-                <w:color w:val="EE0000"/>
-              </w:rPr>
-              <w:t>M</w:t>
-            </w:r>
-            <w:r>
-              <w:rPr>
-                <w:b/>
-                <w:bCs/>
-                <w:color w:val="EE0000"/>
-              </w:rPr>
-              <w:t>a</w:t>
-            </w:r>
-            <w:r>
-              <w:rPr>
-                <w:b/>
-                <w:bCs/>
-                <w:color w:val="EE0000"/>
-              </w:rPr>
-              <w:t>rketing</w:t>
-            </w:r>
-            <w:r>
-              <w:rPr>
-                <w:b/>
-                <w:bCs/>
-                <w:color w:val="EE0000"/>
-              </w:rPr>
-              <w:t xml:space="preserve"> notes from here!</w:t>
             </w:r>
           </w:p>
         </w:tc>
@@ -3115,6 +2821,95 @@
     </w:lvl>
   </w:abstractNum>
   <w:abstractNum w:abstractNumId="3" w15:restartNumberingAfterBreak="0">
+    <w:nsid w:val="3C7770B6"/>
+    <w:multiLevelType w:val="hybridMultilevel"/>
+    <w:tmpl w:val="A672D6C4"/>
+    <w:lvl w:ilvl="0" w:tplc="0409000F">
+      <w:start w:val="1"/>
+      <w:numFmt w:val="decimal"/>
+      <w:lvlText w:val="%1."/>
+      <w:lvlJc w:val="left"/>
+      <w:pPr>
+        <w:ind w:left="720" w:hanging="360"/>
+      </w:pPr>
+      <w:rPr>
+        <w:rFonts w:hint="default"/>
+      </w:rPr>
+    </w:lvl>
+    <w:lvl w:ilvl="1" w:tplc="04090019" w:tentative="1">
+      <w:start w:val="1"/>
+      <w:numFmt w:val="lowerLetter"/>
+      <w:lvlText w:val="%2."/>
+      <w:lvlJc w:val="left"/>
+      <w:pPr>
+        <w:ind w:left="1440" w:hanging="360"/>
+      </w:pPr>
+    </w:lvl>
+    <w:lvl w:ilvl="2" w:tplc="0409001B" w:tentative="1">
+      <w:start w:val="1"/>
+      <w:numFmt w:val="lowerRoman"/>
+      <w:lvlText w:val="%3."/>
+      <w:lvlJc w:val="right"/>
+      <w:pPr>
+        <w:ind w:left="2160" w:hanging="180"/>
+      </w:pPr>
+    </w:lvl>
+    <w:lvl w:ilvl="3" w:tplc="0409000F" w:tentative="1">
+      <w:start w:val="1"/>
+      <w:numFmt w:val="decimal"/>
+      <w:lvlText w:val="%4."/>
+      <w:lvlJc w:val="left"/>
+      <w:pPr>
+        <w:ind w:left="2880" w:hanging="360"/>
+      </w:pPr>
+    </w:lvl>
+    <w:lvl w:ilvl="4" w:tplc="04090019" w:tentative="1">
+      <w:start w:val="1"/>
+      <w:numFmt w:val="lowerLetter"/>
+      <w:lvlText w:val="%5."/>
+      <w:lvlJc w:val="left"/>
+      <w:pPr>
+        <w:ind w:left="3600" w:hanging="360"/>
+      </w:pPr>
+    </w:lvl>
+    <w:lvl w:ilvl="5" w:tplc="0409001B" w:tentative="1">
+      <w:start w:val="1"/>
+      <w:numFmt w:val="lowerRoman"/>
+      <w:lvlText w:val="%6."/>
+      <w:lvlJc w:val="right"/>
+      <w:pPr>
+        <w:ind w:left="4320" w:hanging="180"/>
+      </w:pPr>
+    </w:lvl>
+    <w:lvl w:ilvl="6" w:tplc="0409000F" w:tentative="1">
+      <w:start w:val="1"/>
+      <w:numFmt w:val="decimal"/>
+      <w:lvlText w:val="%7."/>
+      <w:lvlJc w:val="left"/>
+      <w:pPr>
+        <w:ind w:left="5040" w:hanging="360"/>
+      </w:pPr>
+    </w:lvl>
+    <w:lvl w:ilvl="7" w:tplc="04090019" w:tentative="1">
+      <w:start w:val="1"/>
+      <w:numFmt w:val="lowerLetter"/>
+      <w:lvlText w:val="%8."/>
+      <w:lvlJc w:val="left"/>
+      <w:pPr>
+        <w:ind w:left="5760" w:hanging="360"/>
+      </w:pPr>
+    </w:lvl>
+    <w:lvl w:ilvl="8" w:tplc="0409001B" w:tentative="1">
+      <w:start w:val="1"/>
+      <w:numFmt w:val="lowerRoman"/>
+      <w:lvlText w:val="%9."/>
+      <w:lvlJc w:val="right"/>
+      <w:pPr>
+        <w:ind w:left="6480" w:hanging="180"/>
+      </w:pPr>
+    </w:lvl>
+  </w:abstractNum>
+  <w:abstractNum w:abstractNumId="4" w15:restartNumberingAfterBreak="0">
     <w:nsid w:val="3F5032C7"/>
     <w:multiLevelType w:val="hybridMultilevel"/>
     <w:tmpl w:val="D2325450"/>
@@ -3200,7 +2995,7 @@
       </w:pPr>
     </w:lvl>
   </w:abstractNum>
-  <w:abstractNum w:abstractNumId="4" w15:restartNumberingAfterBreak="0">
+  <w:abstractNum w:abstractNumId="5" w15:restartNumberingAfterBreak="0">
     <w:nsid w:val="5E2906DD"/>
     <w:multiLevelType w:val="hybridMultilevel"/>
     <w:tmpl w:val="BE147C00"/>
@@ -3289,7 +3084,7 @@
       </w:pPr>
     </w:lvl>
   </w:abstractNum>
-  <w:abstractNum w:abstractNumId="5" w15:restartNumberingAfterBreak="0">
+  <w:abstractNum w:abstractNumId="6" w15:restartNumberingAfterBreak="0">
     <w:nsid w:val="5E890285"/>
     <w:multiLevelType w:val="hybridMultilevel"/>
     <w:tmpl w:val="BE147C00"/>
@@ -3378,7 +3173,96 @@
       </w:pPr>
     </w:lvl>
   </w:abstractNum>
-  <w:abstractNum w:abstractNumId="6" w15:restartNumberingAfterBreak="0">
+  <w:abstractNum w:abstractNumId="7" w15:restartNumberingAfterBreak="0">
+    <w:nsid w:val="5FF2080F"/>
+    <w:multiLevelType w:val="hybridMultilevel"/>
+    <w:tmpl w:val="4588D7BE"/>
+    <w:lvl w:ilvl="0" w:tplc="A42E1440">
+      <w:start w:val="1"/>
+      <w:numFmt w:val="decimal"/>
+      <w:lvlText w:val="%1."/>
+      <w:lvlJc w:val="left"/>
+      <w:pPr>
+        <w:ind w:left="1080" w:hanging="360"/>
+      </w:pPr>
+      <w:rPr>
+        <w:rFonts w:hint="default"/>
+      </w:rPr>
+    </w:lvl>
+    <w:lvl w:ilvl="1" w:tplc="04090019" w:tentative="1">
+      <w:start w:val="1"/>
+      <w:numFmt w:val="lowerLetter"/>
+      <w:lvlText w:val="%2."/>
+      <w:lvlJc w:val="left"/>
+      <w:pPr>
+        <w:ind w:left="1800" w:hanging="360"/>
+      </w:pPr>
+    </w:lvl>
+    <w:lvl w:ilvl="2" w:tplc="0409001B" w:tentative="1">
+      <w:start w:val="1"/>
+      <w:numFmt w:val="lowerRoman"/>
+      <w:lvlText w:val="%3."/>
+      <w:lvlJc w:val="right"/>
+      <w:pPr>
+        <w:ind w:left="2520" w:hanging="180"/>
+      </w:pPr>
+    </w:lvl>
+    <w:lvl w:ilvl="3" w:tplc="0409000F" w:tentative="1">
+      <w:start w:val="1"/>
+      <w:numFmt w:val="decimal"/>
+      <w:lvlText w:val="%4."/>
+      <w:lvlJc w:val="left"/>
+      <w:pPr>
+        <w:ind w:left="3240" w:hanging="360"/>
+      </w:pPr>
+    </w:lvl>
+    <w:lvl w:ilvl="4" w:tplc="04090019" w:tentative="1">
+      <w:start w:val="1"/>
+      <w:numFmt w:val="lowerLetter"/>
+      <w:lvlText w:val="%5."/>
+      <w:lvlJc w:val="left"/>
+      <w:pPr>
+        <w:ind w:left="3960" w:hanging="360"/>
+      </w:pPr>
+    </w:lvl>
+    <w:lvl w:ilvl="5" w:tplc="0409001B" w:tentative="1">
+      <w:start w:val="1"/>
+      <w:numFmt w:val="lowerRoman"/>
+      <w:lvlText w:val="%6."/>
+      <w:lvlJc w:val="right"/>
+      <w:pPr>
+        <w:ind w:left="4680" w:hanging="180"/>
+      </w:pPr>
+    </w:lvl>
+    <w:lvl w:ilvl="6" w:tplc="0409000F" w:tentative="1">
+      <w:start w:val="1"/>
+      <w:numFmt w:val="decimal"/>
+      <w:lvlText w:val="%7."/>
+      <w:lvlJc w:val="left"/>
+      <w:pPr>
+        <w:ind w:left="5400" w:hanging="360"/>
+      </w:pPr>
+    </w:lvl>
+    <w:lvl w:ilvl="7" w:tplc="04090019" w:tentative="1">
+      <w:start w:val="1"/>
+      <w:numFmt w:val="lowerLetter"/>
+      <w:lvlText w:val="%8."/>
+      <w:lvlJc w:val="left"/>
+      <w:pPr>
+        <w:ind w:left="6120" w:hanging="360"/>
+      </w:pPr>
+    </w:lvl>
+    <w:lvl w:ilvl="8" w:tplc="0409001B" w:tentative="1">
+      <w:start w:val="1"/>
+      <w:numFmt w:val="lowerRoman"/>
+      <w:lvlText w:val="%9."/>
+      <w:lvlJc w:val="right"/>
+      <w:pPr>
+        <w:ind w:left="6840" w:hanging="180"/>
+      </w:pPr>
+    </w:lvl>
+  </w:abstractNum>
+  <w:abstractNum w:abstractNumId="8" w15:restartNumberingAfterBreak="0">
     <w:nsid w:val="66231478"/>
     <w:multiLevelType w:val="hybridMultilevel"/>
     <w:tmpl w:val="BE147C00"/>
@@ -3468,7 +3352,7 @@
     </w:lvl>
   </w:abstractNum>
   <w:num w:numId="1" w16cid:durableId="588584409">
-    <w:abstractNumId w:val="3"/>
+    <w:abstractNumId w:val="4"/>
     <w:lvlOverride w:ilvl="0">
       <w:startOverride w:val="1"/>
     </w:lvlOverride>
@@ -3480,16 +3364,22 @@
     <w:abstractNumId w:val="0"/>
   </w:num>
   <w:num w:numId="4" w16cid:durableId="2141070922">
-    <w:abstractNumId w:val="6"/>
+    <w:abstractNumId w:val="8"/>
   </w:num>
   <w:num w:numId="5" w16cid:durableId="2091460640">
-    <w:abstractNumId w:val="4"/>
+    <w:abstractNumId w:val="5"/>
   </w:num>
   <w:num w:numId="6" w16cid:durableId="1263949884">
-    <w:abstractNumId w:val="5"/>
+    <w:abstractNumId w:val="6"/>
   </w:num>
   <w:num w:numId="7" w16cid:durableId="707334887">
     <w:abstractNumId w:val="1"/>
+  </w:num>
+  <w:num w:numId="8" w16cid:durableId="1612591766">
+    <w:abstractNumId w:val="7"/>
+  </w:num>
+  <w:num w:numId="9" w16cid:durableId="308705817">
+    <w:abstractNumId w:val="3"/>
   </w:num>
 </w:numbering>
 </file>

</xml_diff>

<commit_message>
Inject block diagram canvas as image into Word template at APPLY THE SKETCH HERE placeholder
</commit_message>
<xml_diff>
--- a/bin/Debug/net10.0-windows/Marketing_Meeting_Summary_Template.docx
+++ b/bin/Debug/net10.0-windows/Marketing_Meeting_Summary_Template.docx
@@ -21,7 +21,7 @@
           <w:noProof/>
         </w:rPr>
         <w:drawing>
-          <wp:anchor distT="0" distB="0" distL="114300" distR="114300" simplePos="0" relativeHeight="251658240" behindDoc="0" locked="0" layoutInCell="1" allowOverlap="1" wp14:anchorId="4606FF2F" wp14:editId="0D650733">
+          <wp:anchor distT="0" distB="0" distL="114300" distR="114300" simplePos="0" relativeHeight="251658240" behindDoc="0" locked="0" layoutInCell="1" allowOverlap="1" wp14:anchorId="4606FF2F" wp14:editId="43071350">
             <wp:simplePos x="0" y="0"/>
             <wp:positionH relativeFrom="margin">
               <wp:align>left</wp:align>
@@ -715,40 +715,7 @@
                 <w:sz w:val="22"/>
                 <w:szCs w:val="22"/>
               </w:rPr>
-              <w:t xml:space="preserve">   </w:t>
-            </w:r>
-            <w:proofErr w:type="gramStart"/>
-            <w:r>
-              <w:rPr>
-                <w:rFonts w:asciiTheme="minorHAnsi" w:hAnsiTheme="minorHAnsi"/>
-                <w:b/>
-                <w:bCs/>
-                <w:sz w:val="22"/>
-                <w:szCs w:val="22"/>
-              </w:rPr>
-              <w:t>Monday # (</w:t>
-            </w:r>
-            <w:proofErr w:type="gramEnd"/>
-            <w:r>
-              <w:rPr>
-                <w:rFonts w:asciiTheme="minorHAnsi" w:hAnsiTheme="minorHAnsi"/>
-                <w:b/>
-                <w:bCs/>
-                <w:sz w:val="22"/>
-                <w:szCs w:val="22"/>
-              </w:rPr>
-              <w:t>CRM)</w:t>
-            </w:r>
-            <w:proofErr w:type="gramStart"/>
-            <w:r>
-              <w:rPr>
-                <w:rFonts w:asciiTheme="minorHAnsi" w:hAnsiTheme="minorHAnsi"/>
-                <w:b/>
-                <w:bCs/>
-                <w:sz w:val="22"/>
-                <w:szCs w:val="22"/>
-              </w:rPr>
-              <w:t xml:space="preserve">: </w:t>
+              <w:t xml:space="preserve">   Monday # (CRM): </w:t>
             </w:r>
             <w:r>
               <w:rPr>
@@ -769,19 +736,7 @@
                 <w:sz w:val="20"/>
                 <w:szCs w:val="20"/>
               </w:rPr>
-              <w:t>Monday #</w:t>
-            </w:r>
-            <w:proofErr w:type="gramEnd"/>
-            <w:r>
-              <w:rPr>
-                <w:rFonts w:asciiTheme="minorHAnsi" w:hAnsiTheme="minorHAnsi"/>
-                <w:b/>
-                <w:bCs/>
-                <w:color w:val="EE0000"/>
-                <w:sz w:val="20"/>
-                <w:szCs w:val="20"/>
-              </w:rPr>
-              <w:t xml:space="preserve"> (CRM):</w:t>
+              <w:t>Monday # (CRM):</w:t>
             </w:r>
           </w:p>
         </w:tc>
@@ -1320,6 +1275,32 @@
           <w:bottom w:val="single" w:sz="10" w:space="0" w:color="1F4E79"/>
         </w:pBdr>
         <w:spacing w:before="320" w:after="160"/>
+        <w:jc w:val="center"/>
+        <w:rPr>
+          <w:b/>
+          <w:bCs/>
+          <w:color w:val="EE0000"/>
+          <w:sz w:val="28"/>
+          <w:szCs w:val="28"/>
+        </w:rPr>
+      </w:pPr>
+      <w:r>
+        <w:rPr>
+          <w:b/>
+          <w:bCs/>
+          <w:color w:val="EE0000"/>
+          <w:sz w:val="28"/>
+          <w:szCs w:val="28"/>
+        </w:rPr>
+        <w:t>APPLY THE SKETCH HERE!</w:t>
+      </w:r>
+    </w:p>
+    <w:p>
+      <w:pPr>
+        <w:pBdr>
+          <w:bottom w:val="single" w:sz="10" w:space="0" w:color="1F4E79"/>
+        </w:pBdr>
+        <w:spacing w:before="320" w:after="160"/>
         <w:rPr>
           <w:b/>
           <w:bCs/>
@@ -1765,10 +1746,8 @@
           <w:sz w:val="26"/>
           <w:szCs w:val="26"/>
         </w:rPr>
-        <w:lastRenderedPageBreak/>
         <w:t>4</w:t>
       </w:r>
-      <w:proofErr w:type="gramStart"/>
       <w:r>
         <w:rPr>
           <w:b/>
@@ -1777,18 +1756,7 @@
           <w:sz w:val="26"/>
           <w:szCs w:val="26"/>
         </w:rPr>
-        <w:t>.  Meeting</w:t>
-      </w:r>
-      <w:proofErr w:type="gramEnd"/>
-      <w:r>
-        <w:rPr>
-          <w:b/>
-          <w:bCs/>
-          <w:color w:val="1F4E79"/>
-          <w:sz w:val="26"/>
-          <w:szCs w:val="26"/>
-        </w:rPr>
-        <w:t xml:space="preserve"> Questions</w:t>
+        <w:t>.  Meeting Questions</w:t>
       </w:r>
       <w:r>
         <w:rPr>
@@ -2257,43 +2225,7 @@
         <w:sz w:val="18"/>
         <w:szCs w:val="18"/>
       </w:rPr>
-      <w:t xml:space="preserve">Marketing </w:t>
-    </w:r>
-    <w:proofErr w:type="gramStart"/>
-    <w:r>
-      <w:rPr>
-        <w:color w:val="888888"/>
-        <w:sz w:val="18"/>
-        <w:szCs w:val="18"/>
-      </w:rPr>
-      <w:t>Department  |</w:t>
-    </w:r>
-    <w:proofErr w:type="gramEnd"/>
-    <w:r>
-      <w:rPr>
-        <w:color w:val="888888"/>
-        <w:sz w:val="18"/>
-        <w:szCs w:val="18"/>
-      </w:rPr>
-      <w:t xml:space="preserve">  Marketing Kickoff Meeting </w:t>
-    </w:r>
-    <w:proofErr w:type="gramStart"/>
-    <w:r>
-      <w:rPr>
-        <w:color w:val="888888"/>
-        <w:sz w:val="18"/>
-        <w:szCs w:val="18"/>
-      </w:rPr>
-      <w:t>Summary  |</w:t>
-    </w:r>
-    <w:proofErr w:type="gramEnd"/>
-    <w:r>
-      <w:rPr>
-        <w:color w:val="888888"/>
-        <w:sz w:val="18"/>
-        <w:szCs w:val="18"/>
-      </w:rPr>
-      <w:t xml:space="preserve">  Page </w:t>
+      <w:t xml:space="preserve">Marketing Department  |  Marketing Kickoff Meeting Summary  |  Page </w:t>
     </w:r>
     <w:r>
       <w:rPr>

</xml_diff>

<commit_message>
Add CC autocomplete, fix template load data loss, sidebar version label, button layout updates
</commit_message>
<xml_diff>
--- a/bin/Debug/net10.0-windows/Marketing_Meeting_Summary_Template.docx
+++ b/bin/Debug/net10.0-windows/Marketing_Meeting_Summary_Template.docx
@@ -21,7 +21,7 @@
           <w:noProof/>
         </w:rPr>
         <w:drawing>
-          <wp:anchor distT="0" distB="0" distL="114300" distR="114300" simplePos="0" relativeHeight="251658240" behindDoc="0" locked="0" layoutInCell="1" allowOverlap="1" wp14:anchorId="4606FF2F" wp14:editId="43071350">
+          <wp:anchor distT="0" distB="0" distL="114300" distR="114300" simplePos="0" relativeHeight="251658240" behindDoc="0" locked="0" layoutInCell="1" allowOverlap="1" wp14:anchorId="4606FF2F" wp14:editId="31F0AC69">
             <wp:simplePos x="0" y="0"/>
             <wp:positionH relativeFrom="margin">
               <wp:align>left</wp:align>
@@ -95,8 +95,8 @@
           <w:b/>
           <w:bCs/>
           <w:color w:val="082B4D"/>
-          <w:sz w:val="40"/>
-          <w:szCs w:val="40"/>
+          <w:sz w:val="48"/>
+          <w:szCs w:val="48"/>
         </w:rPr>
       </w:pPr>
       <w:r>
@@ -106,13 +106,13 @@
           <w:bCs/>
           <w:noProof/>
           <w:color w:val="082B4D"/>
-          <w:sz w:val="40"/>
-          <w:szCs w:val="40"/>
+          <w:sz w:val="48"/>
+          <w:szCs w:val="48"/>
         </w:rPr>
         <mc:AlternateContent>
           <mc:Choice Requires="wps">
             <w:drawing>
-              <wp:anchor distT="0" distB="0" distL="114300" distR="114300" simplePos="0" relativeHeight="251659264" behindDoc="0" locked="0" layoutInCell="1" allowOverlap="1" wp14:anchorId="5AE5E609" wp14:editId="4AFDE11E">
+              <wp:anchor distT="0" distB="0" distL="114300" distR="114300" simplePos="0" relativeHeight="251659264" behindDoc="0" locked="0" layoutInCell="1" allowOverlap="1" wp14:anchorId="5AE5E609" wp14:editId="47FDF346">
                 <wp:simplePos x="0" y="0"/>
                 <wp:positionH relativeFrom="column">
                   <wp:posOffset>-10189</wp:posOffset>
@@ -161,7 +161,7 @@
           </mc:Choice>
           <mc:Fallback>
             <w:pict>
-              <v:line w14:anchorId="6C297FC2" id="Straight Connector 5" o:spid="_x0000_s1026" style="position:absolute;z-index:251659264;visibility:visible;mso-wrap-style:square;mso-wrap-distance-left:9pt;mso-wrap-distance-top:0;mso-wrap-distance-right:9pt;mso-wrap-distance-bottom:0;mso-position-horizontal:absolute;mso-position-horizontal-relative:text;mso-position-vertical:absolute;mso-position-vertical-relative:text" from="-.8pt,24.4pt" to="319.15pt,24.4pt" o:gfxdata="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" strokecolor="#156082 [3204]" strokeweight="1.5pt">
+              <v:line w14:anchorId="51FBCC62" id="Straight Connector 5" o:spid="_x0000_s1026" style="position:absolute;z-index:251659264;visibility:visible;mso-wrap-style:square;mso-wrap-distance-left:9pt;mso-wrap-distance-top:0;mso-wrap-distance-right:9pt;mso-wrap-distance-bottom:0;mso-position-horizontal:absolute;mso-position-horizontal-relative:text;mso-position-vertical:absolute;mso-position-vertical-relative:text" from="-.8pt,24.4pt" to="319.15pt,24.4pt" o:gfxdata="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" strokecolor="#156082 [3204]" strokeweight="1.5pt">
                 <v:stroke joinstyle="miter"/>
               </v:line>
             </w:pict>
@@ -174,8 +174,8 @@
           <w:b/>
           <w:bCs/>
           <w:color w:val="082B4D"/>
-          <w:sz w:val="40"/>
-          <w:szCs w:val="40"/>
+          <w:sz w:val="48"/>
+          <w:szCs w:val="48"/>
         </w:rPr>
         <w:t xml:space="preserve">Marketing Kickoff Meeting Summary </w:t>
       </w:r>
@@ -238,7 +238,7 @@
           <w:sz w:val="22"/>
           <w:szCs w:val="22"/>
         </w:rPr>
-        <w:t xml:space="preserve">  </w:t>
+        <w:t xml:space="preserve">   </w:t>
       </w:r>
       <w:r>
         <w:rPr>
@@ -248,7 +248,7 @@
           <w:sz w:val="22"/>
           <w:szCs w:val="22"/>
         </w:rPr>
-        <w:t xml:space="preserve">  | </w:t>
+        <w:t xml:space="preserve">  </w:t>
       </w:r>
       <w:r>
         <w:rPr>
@@ -258,7 +258,7 @@
           <w:sz w:val="22"/>
           <w:szCs w:val="22"/>
         </w:rPr>
-        <w:t xml:space="preserve">  </w:t>
+        <w:t xml:space="preserve">  | </w:t>
       </w:r>
       <w:r>
         <w:rPr>
@@ -268,7 +268,7 @@
           <w:sz w:val="22"/>
           <w:szCs w:val="22"/>
         </w:rPr>
-        <w:t xml:space="preserve"> </w:t>
+        <w:t xml:space="preserve">   </w:t>
       </w:r>
       <w:r>
         <w:rPr>
@@ -282,6 +282,26 @@
       </w:r>
       <w:r>
         <w:rPr>
+          <w:b/>
+          <w:bCs/>
+          <w:color w:val="EE0000"/>
+          <w:sz w:val="22"/>
+          <w:szCs w:val="22"/>
+        </w:rPr>
+        <w:t xml:space="preserve"> </w:t>
+      </w:r>
+      <w:r>
+        <w:rPr>
+          <w:b/>
+          <w:bCs/>
+          <w:color w:val="EE0000"/>
+          <w:sz w:val="22"/>
+          <w:szCs w:val="22"/>
+        </w:rPr>
+        <w:t xml:space="preserve">  </w:t>
+      </w:r>
+      <w:r>
+        <w:rPr>
           <w:rFonts w:asciiTheme="minorHAnsi" w:hAnsiTheme="minorHAnsi"/>
           <w:b/>
           <w:bCs/>
@@ -337,7 +357,27 @@
           <w:sz w:val="22"/>
           <w:szCs w:val="22"/>
         </w:rPr>
-        <w:t xml:space="preserve">  </w:t>
+        <w:t xml:space="preserve"> </w:t>
+      </w:r>
+      <w:r>
+        <w:rPr>
+          <w:b/>
+          <w:bCs/>
+          <w:color w:val="EE0000"/>
+          <w:sz w:val="22"/>
+          <w:szCs w:val="22"/>
+        </w:rPr>
+        <w:t xml:space="preserve">   </w:t>
+      </w:r>
+      <w:r>
+        <w:rPr>
+          <w:b/>
+          <w:bCs/>
+          <w:color w:val="EE0000"/>
+          <w:sz w:val="22"/>
+          <w:szCs w:val="22"/>
+        </w:rPr>
+        <w:t xml:space="preserve"> </w:t>
       </w:r>
       <w:r>
         <w:rPr>
@@ -379,7 +419,29 @@
           <w:sz w:val="22"/>
           <w:szCs w:val="22"/>
         </w:rPr>
-        <w:t xml:space="preserve">  </w:t>
+        <w:t xml:space="preserve"> </w:t>
+      </w:r>
+      <w:r>
+        <w:rPr>
+          <w:rFonts w:asciiTheme="minorHAnsi" w:hAnsiTheme="minorHAnsi"/>
+          <w:b/>
+          <w:bCs/>
+          <w:color w:val="EE0000"/>
+          <w:sz w:val="22"/>
+          <w:szCs w:val="22"/>
+        </w:rPr>
+        <w:t xml:space="preserve">   </w:t>
+      </w:r>
+      <w:r>
+        <w:rPr>
+          <w:rFonts w:asciiTheme="minorHAnsi" w:hAnsiTheme="minorHAnsi"/>
+          <w:b/>
+          <w:bCs/>
+          <w:color w:val="EE0000"/>
+          <w:sz w:val="22"/>
+          <w:szCs w:val="22"/>
+        </w:rPr>
+        <w:t xml:space="preserve"> </w:t>
       </w:r>
       <w:r>
         <w:rPr>
@@ -510,7 +572,7 @@
               <w:bottom w:val="single" w:sz="1" w:space="0" w:color="AAAAAA"/>
               <w:right w:val="single" w:sz="1" w:space="0" w:color="AAAAAA"/>
             </w:tcBorders>
-            <w:shd w:val="clear" w:color="auto" w:fill="1F4E79"/>
+            <w:shd w:val="clear" w:color="auto" w:fill="153D63" w:themeFill="text2" w:themeFillTint="E6"/>
             <w:tcMar>
               <w:top w:w="80" w:type="dxa"/>
               <w:left w:w="120" w:type="dxa"/>
@@ -536,6 +598,99 @@
               <w:rPr>
                 <w:b/>
                 <w:bCs/>
+                <w:noProof/>
+                <w:color w:val="FFFFFF" w:themeColor="background1"/>
+              </w:rPr>
+              <mc:AlternateContent>
+                <mc:Choice Requires="wps">
+                  <w:drawing>
+                    <wp:anchor distT="0" distB="0" distL="114300" distR="114300" simplePos="0" relativeHeight="251664384" behindDoc="0" locked="0" layoutInCell="1" allowOverlap="1" wp14:anchorId="78237EF1" wp14:editId="721473FE">
+                      <wp:simplePos x="0" y="0"/>
+                      <wp:positionH relativeFrom="column">
+                        <wp:posOffset>154305</wp:posOffset>
+                      </wp:positionH>
+                      <wp:positionV relativeFrom="paragraph">
+                        <wp:posOffset>-15240</wp:posOffset>
+                      </wp:positionV>
+                      <wp:extent cx="238125" cy="214630"/>
+                      <wp:effectExtent l="0" t="0" r="28575" b="13970"/>
+                      <wp:wrapNone/>
+                      <wp:docPr id="207887628" name="Rectangle: Rounded Corners 2"/>
+                      <wp:cNvGraphicFramePr/>
+                      <a:graphic xmlns:a="http://schemas.openxmlformats.org/drawingml/2006/main">
+                        <a:graphicData uri="http://schemas.microsoft.com/office/word/2010/wordprocessingShape">
+                          <wps:wsp>
+                            <wps:cNvSpPr/>
+                            <wps:spPr>
+                              <a:xfrm>
+                                <a:off x="0" y="0"/>
+                                <a:ext cx="238125" cy="214630"/>
+                              </a:xfrm>
+                              <a:prstGeom prst="roundRect">
+                                <a:avLst/>
+                              </a:prstGeom>
+                              <a:noFill/>
+                              <a:ln w="9525" cap="flat" cmpd="sng" algn="ctr">
+                                <a:solidFill>
+                                  <a:schemeClr val="bg1"/>
+                                </a:solidFill>
+                                <a:prstDash val="solid"/>
+                                <a:round/>
+                                <a:headEnd type="none" w="med" len="med"/>
+                                <a:tailEnd type="none" w="med" len="med"/>
+                              </a:ln>
+                            </wps:spPr>
+                            <wps:style>
+                              <a:lnRef idx="0">
+                                <a:scrgbClr r="0" g="0" b="0"/>
+                              </a:lnRef>
+                              <a:fillRef idx="0">
+                                <a:scrgbClr r="0" g="0" b="0"/>
+                              </a:fillRef>
+                              <a:effectRef idx="0">
+                                <a:scrgbClr r="0" g="0" b="0"/>
+                              </a:effectRef>
+                              <a:fontRef idx="minor">
+                                <a:schemeClr val="accent2"/>
+                              </a:fontRef>
+                            </wps:style>
+                            <wps:bodyPr rot="0" spcFirstLastPara="0" vertOverflow="overflow" horzOverflow="overflow" vert="horz" wrap="square" lIns="91440" tIns="45720" rIns="91440" bIns="45720" numCol="1" spcCol="0" rtlCol="0" fromWordArt="0" anchor="ctr" anchorCtr="0" forceAA="0" compatLnSpc="1">
+                              <a:prstTxWarp prst="textNoShape">
+                                <a:avLst/>
+                              </a:prstTxWarp>
+                              <a:noAutofit/>
+                            </wps:bodyPr>
+                          </wps:wsp>
+                        </a:graphicData>
+                      </a:graphic>
+                      <wp14:sizeRelH relativeFrom="margin">
+                        <wp14:pctWidth>0</wp14:pctWidth>
+                      </wp14:sizeRelH>
+                      <wp14:sizeRelV relativeFrom="margin">
+                        <wp14:pctHeight>0</wp14:pctHeight>
+                      </wp14:sizeRelV>
+                    </wp:anchor>
+                  </w:drawing>
+                </mc:Choice>
+                <mc:Fallback>
+                  <w:pict>
+                    <v:roundrect w14:anchorId="14011226" id="Rectangle: Rounded Corners 2" o:spid="_x0000_s1026" style="position:absolute;margin-left:12.15pt;margin-top:-1.2pt;width:18.75pt;height:16.9pt;z-index:251664384;visibility:visible;mso-wrap-style:square;mso-width-percent:0;mso-height-percent:0;mso-wrap-distance-left:9pt;mso-wrap-distance-top:0;mso-wrap-distance-right:9pt;mso-wrap-distance-bottom:0;mso-position-horizontal:absolute;mso-position-horizontal-relative:text;mso-position-vertical:absolute;mso-position-vertical-relative:text;mso-width-percent:0;mso-height-percent:0;mso-width-relative:margin;mso-height-relative:margin;v-text-anchor:middle" arcsize="10923f" o:gfxdata="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" filled="f" strokecolor="white [3212]"/>
+                  </w:pict>
+                </mc:Fallback>
+              </mc:AlternateContent>
+            </w:r>
+            <w:r>
+              <w:rPr>
+                <w:b/>
+                <w:bCs/>
+                <w:color w:val="FFFFFF" w:themeColor="background1"/>
+              </w:rPr>
+              <w:t xml:space="preserve">   </w:t>
+            </w:r>
+            <w:r>
+              <w:rPr>
+                <w:b/>
+                <w:bCs/>
                 <w:color w:val="FFFFFF" w:themeColor="background1"/>
               </w:rPr>
               <w:t>Marketing Overview</w:t>
@@ -553,7 +708,7 @@
               <w:bottom w:val="single" w:sz="2" w:space="0" w:color="AAAAAA"/>
               <w:right w:val="single" w:sz="4" w:space="0" w:color="auto"/>
             </w:tcBorders>
-            <w:shd w:val="clear" w:color="auto" w:fill="F7F7F7"/>
+            <w:shd w:val="clear" w:color="auto" w:fill="FFFFFF" w:themeFill="background1"/>
             <w:tcMar>
               <w:top w:w="80" w:type="dxa"/>
               <w:left w:w="120" w:type="dxa"/>
@@ -624,7 +779,7 @@
               <w:bottom w:val="single" w:sz="2" w:space="0" w:color="AAAAAA"/>
               <w:right w:val="single" w:sz="4" w:space="0" w:color="auto"/>
             </w:tcBorders>
-            <w:shd w:val="clear" w:color="auto" w:fill="F7F7F7"/>
+            <w:shd w:val="clear" w:color="auto" w:fill="FFFFFF" w:themeFill="background1"/>
             <w:tcMar>
               <w:top w:w="80" w:type="dxa"/>
               <w:left w:w="120" w:type="dxa"/>
@@ -695,7 +850,7 @@
               <w:bottom w:val="single" w:sz="2" w:space="0" w:color="AAAAAA"/>
               <w:right w:val="single" w:sz="4" w:space="0" w:color="auto"/>
             </w:tcBorders>
-            <w:shd w:val="clear" w:color="auto" w:fill="F7F7F7"/>
+            <w:shd w:val="clear" w:color="auto" w:fill="FFFFFF" w:themeFill="background1"/>
           </w:tcPr>
           <w:p>
             <w:pPr>
@@ -751,7 +906,7 @@
               <w:bottom w:val="single" w:sz="2" w:space="0" w:color="AAAAAA"/>
               <w:right w:val="single" w:sz="4" w:space="0" w:color="auto"/>
             </w:tcBorders>
-            <w:shd w:val="clear" w:color="auto" w:fill="F7F7F7"/>
+            <w:shd w:val="clear" w:color="auto" w:fill="FFFFFF" w:themeFill="background1"/>
             <w:tcMar>
               <w:top w:w="80" w:type="dxa"/>
               <w:left w:w="120" w:type="dxa"/>
@@ -805,7 +960,7 @@
               <w:bottom w:val="single" w:sz="2" w:space="0" w:color="AAAAAA"/>
               <w:right w:val="single" w:sz="4" w:space="0" w:color="auto"/>
             </w:tcBorders>
-            <w:shd w:val="clear" w:color="auto" w:fill="F7F7F7"/>
+            <w:shd w:val="clear" w:color="auto" w:fill="FFFFFF" w:themeFill="background1"/>
             <w:tcMar>
               <w:top w:w="80" w:type="dxa"/>
               <w:left w:w="120" w:type="dxa"/>
@@ -868,7 +1023,7 @@
               <w:bottom w:val="single" w:sz="2" w:space="0" w:color="AAAAAA"/>
               <w:right w:val="single" w:sz="4" w:space="0" w:color="auto"/>
             </w:tcBorders>
-            <w:shd w:val="clear" w:color="auto" w:fill="F7F7F7"/>
+            <w:shd w:val="clear" w:color="auto" w:fill="FFFFFF" w:themeFill="background1"/>
           </w:tcPr>
           <w:p>
             <w:pPr>
@@ -893,7 +1048,7 @@
               <w:bottom w:val="single" w:sz="4" w:space="0" w:color="auto"/>
               <w:right w:val="single" w:sz="4" w:space="0" w:color="auto"/>
             </w:tcBorders>
-            <w:shd w:val="clear" w:color="auto" w:fill="F7F7F7"/>
+            <w:shd w:val="clear" w:color="auto" w:fill="FFFFFF" w:themeFill="background1"/>
             <w:tcMar>
               <w:top w:w="80" w:type="dxa"/>
               <w:left w:w="120" w:type="dxa"/>
@@ -947,7 +1102,7 @@
               <w:bottom w:val="single" w:sz="4" w:space="0" w:color="auto"/>
               <w:right w:val="single" w:sz="4" w:space="0" w:color="auto"/>
             </w:tcBorders>
-            <w:shd w:val="clear" w:color="auto" w:fill="F7F7F7"/>
+            <w:shd w:val="clear" w:color="auto" w:fill="FFFFFF" w:themeFill="background1"/>
             <w:tcMar>
               <w:top w:w="80" w:type="dxa"/>
               <w:left w:w="120" w:type="dxa"/>
@@ -987,7 +1142,7 @@
               <w:bottom w:val="single" w:sz="4" w:space="0" w:color="auto"/>
               <w:right w:val="single" w:sz="4" w:space="0" w:color="auto"/>
             </w:tcBorders>
-            <w:shd w:val="clear" w:color="auto" w:fill="F7F7F7"/>
+            <w:shd w:val="clear" w:color="auto" w:fill="FFFFFF" w:themeFill="background1"/>
           </w:tcPr>
           <w:p>
             <w:pPr>
@@ -1010,7 +1165,7 @@
     </w:p>
     <w:tbl>
       <w:tblPr>
-        <w:tblW w:w="10488" w:type="dxa"/>
+        <w:tblW w:w="10772" w:type="dxa"/>
         <w:tblBorders>
           <w:top w:val="single" w:sz="4" w:space="0" w:color="auto"/>
           <w:left w:val="single" w:sz="4" w:space="0" w:color="auto"/>
@@ -1028,12 +1183,12 @@
       <w:tblGrid>
         <w:gridCol w:w="2551"/>
         <w:gridCol w:w="4252"/>
-        <w:gridCol w:w="3685"/>
+        <w:gridCol w:w="3969"/>
       </w:tblGrid>
       <w:tr>
         <w:tc>
           <w:tcPr>
-            <w:tcW w:w="10488" w:type="dxa"/>
+            <w:tcW w:w="10772" w:type="dxa"/>
             <w:gridSpan w:val="3"/>
             <w:tcBorders>
               <w:top w:val="single" w:sz="1" w:space="0" w:color="AAAAAA"/>
@@ -1041,7 +1196,7 @@
               <w:bottom w:val="single" w:sz="1" w:space="0" w:color="AAAAAA"/>
               <w:right w:val="single" w:sz="1" w:space="0" w:color="AAAAAA"/>
             </w:tcBorders>
-            <w:shd w:val="clear" w:color="auto" w:fill="1F4E79"/>
+            <w:shd w:val="clear" w:color="auto" w:fill="153D63" w:themeFill="text2" w:themeFillTint="E6"/>
             <w:tcMar>
               <w:top w:w="80" w:type="dxa"/>
               <w:left w:w="120" w:type="dxa"/>
@@ -1067,6 +1222,107 @@
               <w:rPr>
                 <w:b/>
                 <w:bCs/>
+                <w:noProof/>
+                <w:color w:val="FFFFFF" w:themeColor="background1"/>
+              </w:rPr>
+              <mc:AlternateContent>
+                <mc:Choice Requires="wps">
+                  <w:drawing>
+                    <wp:anchor distT="0" distB="0" distL="114300" distR="114300" simplePos="0" relativeHeight="251665408" behindDoc="0" locked="0" layoutInCell="1" allowOverlap="1" wp14:anchorId="626909C7" wp14:editId="6C112389">
+                      <wp:simplePos x="0" y="0"/>
+                      <wp:positionH relativeFrom="column">
+                        <wp:posOffset>167640</wp:posOffset>
+                      </wp:positionH>
+                      <wp:positionV relativeFrom="paragraph">
+                        <wp:posOffset>-3175</wp:posOffset>
+                      </wp:positionV>
+                      <wp:extent cx="238125" cy="222250"/>
+                      <wp:effectExtent l="0" t="0" r="28575" b="25400"/>
+                      <wp:wrapNone/>
+                      <wp:docPr id="2030743491" name="Rectangle: Rounded Corners 3"/>
+                      <wp:cNvGraphicFramePr/>
+                      <a:graphic xmlns:a="http://schemas.openxmlformats.org/drawingml/2006/main">
+                        <a:graphicData uri="http://schemas.microsoft.com/office/word/2010/wordprocessingShape">
+                          <wps:wsp>
+                            <wps:cNvSpPr/>
+                            <wps:spPr>
+                              <a:xfrm>
+                                <a:off x="0" y="0"/>
+                                <a:ext cx="238125" cy="222250"/>
+                              </a:xfrm>
+                              <a:prstGeom prst="roundRect">
+                                <a:avLst/>
+                              </a:prstGeom>
+                              <a:noFill/>
+                              <a:ln w="9525" cap="flat" cmpd="sng" algn="ctr">
+                                <a:solidFill>
+                                  <a:schemeClr val="bg1"/>
+                                </a:solidFill>
+                                <a:prstDash val="solid"/>
+                                <a:round/>
+                                <a:headEnd type="none" w="med" len="med"/>
+                                <a:tailEnd type="none" w="med" len="med"/>
+                              </a:ln>
+                            </wps:spPr>
+                            <wps:style>
+                              <a:lnRef idx="0">
+                                <a:scrgbClr r="0" g="0" b="0"/>
+                              </a:lnRef>
+                              <a:fillRef idx="0">
+                                <a:scrgbClr r="0" g="0" b="0"/>
+                              </a:fillRef>
+                              <a:effectRef idx="0">
+                                <a:scrgbClr r="0" g="0" b="0"/>
+                              </a:effectRef>
+                              <a:fontRef idx="minor">
+                                <a:schemeClr val="accent2"/>
+                              </a:fontRef>
+                            </wps:style>
+                            <wps:bodyPr rot="0" spcFirstLastPara="0" vertOverflow="overflow" horzOverflow="overflow" vert="horz" wrap="square" lIns="91440" tIns="45720" rIns="91440" bIns="45720" numCol="1" spcCol="0" rtlCol="0" fromWordArt="0" anchor="ctr" anchorCtr="0" forceAA="0" compatLnSpc="1">
+                              <a:prstTxWarp prst="textNoShape">
+                                <a:avLst/>
+                              </a:prstTxWarp>
+                              <a:noAutofit/>
+                            </wps:bodyPr>
+                          </wps:wsp>
+                        </a:graphicData>
+                      </a:graphic>
+                      <wp14:sizeRelH relativeFrom="margin">
+                        <wp14:pctWidth>0</wp14:pctWidth>
+                      </wp14:sizeRelH>
+                      <wp14:sizeRelV relativeFrom="margin">
+                        <wp14:pctHeight>0</wp14:pctHeight>
+                      </wp14:sizeRelV>
+                    </wp:anchor>
+                  </w:drawing>
+                </mc:Choice>
+                <mc:Fallback>
+                  <w:pict>
+                    <v:roundrect w14:anchorId="0117FB92" id="Rectangle: Rounded Corners 3" o:spid="_x0000_s1026" style="position:absolute;margin-left:13.2pt;margin-top:-.25pt;width:18.75pt;height:17.5pt;z-index:251665408;visibility:visible;mso-wrap-style:square;mso-width-percent:0;mso-height-percent:0;mso-wrap-distance-left:9pt;mso-wrap-distance-top:0;mso-wrap-distance-right:9pt;mso-wrap-distance-bottom:0;mso-position-horizontal:absolute;mso-position-horizontal-relative:text;mso-position-vertical:absolute;mso-position-vertical-relative:text;mso-width-percent:0;mso-height-percent:0;mso-width-relative:margin;mso-height-relative:margin;v-text-anchor:middle" arcsize="10923f" o:gfxdata="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" filled="f" strokecolor="white [3212]"/>
+                  </w:pict>
+                </mc:Fallback>
+              </mc:AlternateContent>
+            </w:r>
+            <w:r>
+              <w:rPr>
+                <w:b/>
+                <w:bCs/>
+                <w:color w:val="FFFFFF" w:themeColor="background1"/>
+              </w:rPr>
+              <w:t xml:space="preserve">    </w:t>
+            </w:r>
+            <w:r>
+              <w:rPr>
+                <w:b/>
+                <w:bCs/>
+                <w:color w:val="FFFFFF" w:themeColor="background1"/>
+              </w:rPr>
+              <w:t xml:space="preserve">System </w:t>
+            </w:r>
+            <w:r>
+              <w:rPr>
+                <w:b/>
+                <w:bCs/>
                 <w:color w:val="FFFFFF" w:themeColor="background1"/>
               </w:rPr>
               <w:t>Configuration</w:t>
@@ -1084,7 +1340,7 @@
               <w:bottom w:val="single" w:sz="2" w:space="0" w:color="AAAAAA"/>
               <w:right w:val="single" w:sz="4" w:space="0" w:color="auto"/>
             </w:tcBorders>
-            <w:shd w:val="clear" w:color="auto" w:fill="D9D9D9" w:themeFill="background1" w:themeFillShade="D9"/>
+            <w:shd w:val="clear" w:color="auto" w:fill="F2F2F2" w:themeFill="background1" w:themeFillShade="F2"/>
             <w:tcMar>
               <w:top w:w="80" w:type="dxa"/>
               <w:left w:w="120" w:type="dxa"/>
@@ -1121,7 +1377,7 @@
               <w:bottom w:val="single" w:sz="2" w:space="0" w:color="AAAAAA"/>
               <w:right w:val="single" w:sz="4" w:space="0" w:color="auto"/>
             </w:tcBorders>
-            <w:shd w:val="clear" w:color="auto" w:fill="D9D9D9" w:themeFill="background1" w:themeFillShade="D9"/>
+            <w:shd w:val="clear" w:color="auto" w:fill="F2F2F2" w:themeFill="background1" w:themeFillShade="F2"/>
             <w:tcMar>
               <w:top w:w="80" w:type="dxa"/>
               <w:left w:w="120" w:type="dxa"/>
@@ -1151,14 +1407,14 @@
         </w:tc>
         <w:tc>
           <w:tcPr>
-            <w:tcW w:w="3685" w:type="dxa"/>
+            <w:tcW w:w="3969" w:type="dxa"/>
             <w:tcBorders>
               <w:top w:val="single" w:sz="4" w:space="0" w:color="auto"/>
               <w:left w:val="single" w:sz="4" w:space="0" w:color="auto"/>
               <w:bottom w:val="single" w:sz="2" w:space="0" w:color="AAAAAA"/>
               <w:right w:val="single" w:sz="4" w:space="0" w:color="auto"/>
             </w:tcBorders>
-            <w:shd w:val="clear" w:color="auto" w:fill="D9D9D9" w:themeFill="background1" w:themeFillShade="D9"/>
+            <w:shd w:val="clear" w:color="auto" w:fill="F2F2F2" w:themeFill="background1" w:themeFillShade="F2"/>
           </w:tcPr>
           <w:p>
             <w:pPr>
@@ -1190,7 +1446,7 @@
               <w:bottom w:val="single" w:sz="2" w:space="0" w:color="AAAAAA"/>
               <w:right w:val="single" w:sz="4" w:space="0" w:color="auto"/>
             </w:tcBorders>
-            <w:shd w:val="clear" w:color="auto" w:fill="F7F7F7"/>
+            <w:shd w:val="clear" w:color="auto" w:fill="FFFFFF" w:themeFill="background1"/>
             <w:tcMar>
               <w:top w:w="80" w:type="dxa"/>
               <w:left w:w="120" w:type="dxa"/>
@@ -1229,7 +1485,7 @@
               <w:bottom w:val="single" w:sz="2" w:space="0" w:color="AAAAAA"/>
               <w:right w:val="single" w:sz="4" w:space="0" w:color="auto"/>
             </w:tcBorders>
-            <w:shd w:val="clear" w:color="auto" w:fill="F7F7F7"/>
+            <w:shd w:val="clear" w:color="auto" w:fill="FFFFFF" w:themeFill="background1"/>
             <w:tcMar>
               <w:top w:w="80" w:type="dxa"/>
               <w:left w:w="120" w:type="dxa"/>
@@ -1249,14 +1505,14 @@
         </w:tc>
         <w:tc>
           <w:tcPr>
-            <w:tcW w:w="3685" w:type="dxa"/>
+            <w:tcW w:w="3969" w:type="dxa"/>
             <w:tcBorders>
               <w:top w:val="single" w:sz="2" w:space="0" w:color="AAAAAA"/>
               <w:left w:val="single" w:sz="4" w:space="0" w:color="auto"/>
               <w:bottom w:val="single" w:sz="2" w:space="0" w:color="AAAAAA"/>
               <w:right w:val="single" w:sz="4" w:space="0" w:color="auto"/>
             </w:tcBorders>
-            <w:shd w:val="clear" w:color="auto" w:fill="F7F7F7"/>
+            <w:shd w:val="clear" w:color="auto" w:fill="FFFFFF" w:themeFill="background1"/>
           </w:tcPr>
           <w:p>
             <w:pPr>
@@ -1343,7 +1599,7 @@
               <w:bottom w:val="single" w:sz="1" w:space="0" w:color="AAAAAA"/>
               <w:right w:val="single" w:sz="1" w:space="0" w:color="AAAAAA"/>
             </w:tcBorders>
-            <w:shd w:val="clear" w:color="auto" w:fill="1F4E79"/>
+            <w:shd w:val="clear" w:color="auto" w:fill="153D63" w:themeFill="text2" w:themeFillTint="E6"/>
             <w:tcMar>
               <w:top w:w="80" w:type="dxa"/>
               <w:left w:w="120" w:type="dxa"/>
@@ -1368,6 +1624,93 @@
               <w:rPr>
                 <w:b/>
                 <w:bCs/>
+                <w:noProof/>
+                <w:color w:val="FFFFFF" w:themeColor="background1"/>
+              </w:rPr>
+              <mc:AlternateContent>
+                <mc:Choice Requires="wps">
+                  <w:drawing>
+                    <wp:anchor distT="0" distB="0" distL="114300" distR="114300" simplePos="0" relativeHeight="251666432" behindDoc="0" locked="0" layoutInCell="1" allowOverlap="1" wp14:anchorId="767EFC3B" wp14:editId="6334E9C0">
+                      <wp:simplePos x="0" y="0"/>
+                      <wp:positionH relativeFrom="column">
+                        <wp:posOffset>158695</wp:posOffset>
+                      </wp:positionH>
+                      <wp:positionV relativeFrom="paragraph">
+                        <wp:posOffset>-16538</wp:posOffset>
+                      </wp:positionV>
+                      <wp:extent cx="230588" cy="222637"/>
+                      <wp:effectExtent l="0" t="0" r="17145" b="25400"/>
+                      <wp:wrapNone/>
+                      <wp:docPr id="194960915" name="Rectangle: Rounded Corners 4"/>
+                      <wp:cNvGraphicFramePr/>
+                      <a:graphic xmlns:a="http://schemas.openxmlformats.org/drawingml/2006/main">
+                        <a:graphicData uri="http://schemas.microsoft.com/office/word/2010/wordprocessingShape">
+                          <wps:wsp>
+                            <wps:cNvSpPr/>
+                            <wps:spPr>
+                              <a:xfrm>
+                                <a:off x="0" y="0"/>
+                                <a:ext cx="230588" cy="222637"/>
+                              </a:xfrm>
+                              <a:prstGeom prst="roundRect">
+                                <a:avLst/>
+                              </a:prstGeom>
+                              <a:noFill/>
+                              <a:ln w="9525" cap="flat" cmpd="sng" algn="ctr">
+                                <a:solidFill>
+                                  <a:schemeClr val="bg1"/>
+                                </a:solidFill>
+                                <a:prstDash val="solid"/>
+                                <a:round/>
+                                <a:headEnd type="none" w="med" len="med"/>
+                                <a:tailEnd type="none" w="med" len="med"/>
+                              </a:ln>
+                            </wps:spPr>
+                            <wps:style>
+                              <a:lnRef idx="0">
+                                <a:scrgbClr r="0" g="0" b="0"/>
+                              </a:lnRef>
+                              <a:fillRef idx="0">
+                                <a:scrgbClr r="0" g="0" b="0"/>
+                              </a:fillRef>
+                              <a:effectRef idx="0">
+                                <a:scrgbClr r="0" g="0" b="0"/>
+                              </a:effectRef>
+                              <a:fontRef idx="minor">
+                                <a:schemeClr val="accent2"/>
+                              </a:fontRef>
+                            </wps:style>
+                            <wps:bodyPr rot="0" spcFirstLastPara="0" vertOverflow="overflow" horzOverflow="overflow" vert="horz" wrap="square" lIns="91440" tIns="45720" rIns="91440" bIns="45720" numCol="1" spcCol="0" rtlCol="0" fromWordArt="0" anchor="ctr" anchorCtr="0" forceAA="0" compatLnSpc="1">
+                              <a:prstTxWarp prst="textNoShape">
+                                <a:avLst/>
+                              </a:prstTxWarp>
+                              <a:noAutofit/>
+                            </wps:bodyPr>
+                          </wps:wsp>
+                        </a:graphicData>
+                      </a:graphic>
+                    </wp:anchor>
+                  </w:drawing>
+                </mc:Choice>
+                <mc:Fallback>
+                  <w:pict>
+                    <v:roundrect w14:anchorId="60C9F4A5" id="Rectangle: Rounded Corners 4" o:spid="_x0000_s1026" style="position:absolute;margin-left:12.5pt;margin-top:-1.3pt;width:18.15pt;height:17.55pt;z-index:251666432;visibility:visible;mso-wrap-style:square;mso-wrap-distance-left:9pt;mso-wrap-distance-top:0;mso-wrap-distance-right:9pt;mso-wrap-distance-bottom:0;mso-position-horizontal:absolute;mso-position-horizontal-relative:text;mso-position-vertical:absolute;mso-position-vertical-relative:text;v-text-anchor:middle" arcsize="10923f" o:gfxdata="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" filled="f" strokecolor="white [3212]"/>
+                  </w:pict>
+                </mc:Fallback>
+              </mc:AlternateContent>
+            </w:r>
+            <w:r>
+              <w:rPr>
+                <w:b/>
+                <w:bCs/>
+                <w:color w:val="FFFFFF" w:themeColor="background1"/>
+              </w:rPr>
+              <w:t xml:space="preserve">    </w:t>
+            </w:r>
+            <w:r>
+              <w:rPr>
+                <w:b/>
+                <w:bCs/>
                 <w:color w:val="FFFFFF" w:themeColor="background1"/>
               </w:rPr>
               <w:t>Targets List</w:t>
@@ -1385,7 +1728,7 @@
               <w:bottom w:val="single" w:sz="2" w:space="0" w:color="AAAAAA"/>
               <w:right w:val="single" w:sz="4" w:space="0" w:color="auto"/>
             </w:tcBorders>
-            <w:shd w:val="clear" w:color="auto" w:fill="D9D9D9" w:themeFill="background1" w:themeFillShade="D9"/>
+            <w:shd w:val="clear" w:color="auto" w:fill="F2F2F2" w:themeFill="background1" w:themeFillShade="F2"/>
             <w:tcMar>
               <w:top w:w="80" w:type="dxa"/>
               <w:left w:w="120" w:type="dxa"/>
@@ -1417,7 +1760,7 @@
               <w:bottom w:val="single" w:sz="2" w:space="0" w:color="AAAAAA"/>
               <w:right w:val="single" w:sz="4" w:space="0" w:color="auto"/>
             </w:tcBorders>
-            <w:shd w:val="clear" w:color="auto" w:fill="D9D9D9" w:themeFill="background1" w:themeFillShade="D9"/>
+            <w:shd w:val="clear" w:color="auto" w:fill="F2F2F2" w:themeFill="background1" w:themeFillShade="F2"/>
             <w:tcMar>
               <w:top w:w="80" w:type="dxa"/>
               <w:left w:w="120" w:type="dxa"/>
@@ -1448,7 +1791,7 @@
               <w:bottom w:val="single" w:sz="2" w:space="0" w:color="AAAAAA"/>
               <w:right w:val="single" w:sz="4" w:space="0" w:color="auto"/>
             </w:tcBorders>
-            <w:shd w:val="clear" w:color="auto" w:fill="D9D9D9" w:themeFill="background1" w:themeFillShade="D9"/>
+            <w:shd w:val="clear" w:color="auto" w:fill="F2F2F2" w:themeFill="background1" w:themeFillShade="F2"/>
             <w:vAlign w:val="center"/>
           </w:tcPr>
           <w:p>
@@ -1476,7 +1819,7 @@
               <w:bottom w:val="single" w:sz="2" w:space="0" w:color="AAAAAA"/>
               <w:right w:val="single" w:sz="4" w:space="0" w:color="auto"/>
             </w:tcBorders>
-            <w:shd w:val="clear" w:color="auto" w:fill="F7F7F7"/>
+            <w:shd w:val="clear" w:color="auto" w:fill="FFFFFF" w:themeFill="background1"/>
             <w:tcMar>
               <w:top w:w="80" w:type="dxa"/>
               <w:left w:w="120" w:type="dxa"/>
@@ -1515,7 +1858,7 @@
               <w:bottom w:val="single" w:sz="2" w:space="0" w:color="AAAAAA"/>
               <w:right w:val="single" w:sz="4" w:space="0" w:color="auto"/>
             </w:tcBorders>
-            <w:shd w:val="clear" w:color="auto" w:fill="F7F7F7"/>
+            <w:shd w:val="clear" w:color="auto" w:fill="FFFFFF" w:themeFill="background1"/>
             <w:tcMar>
               <w:top w:w="80" w:type="dxa"/>
               <w:left w:w="120" w:type="dxa"/>
@@ -1555,7 +1898,7 @@
               <w:bottom w:val="single" w:sz="2" w:space="0" w:color="AAAAAA"/>
               <w:right w:val="single" w:sz="4" w:space="0" w:color="auto"/>
             </w:tcBorders>
-            <w:shd w:val="clear" w:color="auto" w:fill="F7F7F7"/>
+            <w:shd w:val="clear" w:color="auto" w:fill="FFFFFF" w:themeFill="background1"/>
           </w:tcPr>
           <w:p>
             <w:pPr>
@@ -1581,141 +1924,6 @@
         </w:tc>
       </w:tr>
     </w:tbl>
-    <w:p>
-      <w:pPr>
-        <w:pBdr>
-          <w:bottom w:val="single" w:sz="10" w:space="4" w:color="1F4E79"/>
-        </w:pBdr>
-        <w:spacing w:before="320" w:after="160"/>
-        <w:rPr>
-          <w:b/>
-          <w:bCs/>
-          <w:color w:val="1F4E79"/>
-          <w:sz w:val="26"/>
-          <w:szCs w:val="26"/>
-        </w:rPr>
-      </w:pPr>
-    </w:p>
-    <w:p>
-      <w:pPr>
-        <w:pBdr>
-          <w:bottom w:val="single" w:sz="10" w:space="4" w:color="1F4E79"/>
-        </w:pBdr>
-        <w:spacing w:before="320" w:after="160"/>
-        <w:rPr>
-          <w:b/>
-          <w:bCs/>
-          <w:color w:val="1F4E79"/>
-          <w:sz w:val="26"/>
-          <w:szCs w:val="26"/>
-        </w:rPr>
-      </w:pPr>
-    </w:p>
-    <w:p>
-      <w:pPr>
-        <w:pBdr>
-          <w:bottom w:val="single" w:sz="10" w:space="4" w:color="1F4E79"/>
-        </w:pBdr>
-        <w:spacing w:before="320" w:after="160"/>
-        <w:rPr>
-          <w:b/>
-          <w:bCs/>
-          <w:color w:val="1F4E79"/>
-          <w:sz w:val="26"/>
-          <w:szCs w:val="26"/>
-        </w:rPr>
-      </w:pPr>
-    </w:p>
-    <w:p>
-      <w:pPr>
-        <w:pBdr>
-          <w:bottom w:val="single" w:sz="10" w:space="4" w:color="1F4E79"/>
-        </w:pBdr>
-        <w:spacing w:before="320" w:after="160"/>
-        <w:rPr>
-          <w:b/>
-          <w:bCs/>
-          <w:color w:val="1F4E79"/>
-          <w:sz w:val="26"/>
-          <w:szCs w:val="26"/>
-        </w:rPr>
-      </w:pPr>
-    </w:p>
-    <w:p>
-      <w:pPr>
-        <w:pBdr>
-          <w:bottom w:val="single" w:sz="10" w:space="4" w:color="1F4E79"/>
-        </w:pBdr>
-        <w:spacing w:before="320" w:after="160"/>
-        <w:rPr>
-          <w:b/>
-          <w:bCs/>
-          <w:color w:val="1F4E79"/>
-          <w:sz w:val="26"/>
-          <w:szCs w:val="26"/>
-        </w:rPr>
-      </w:pPr>
-    </w:p>
-    <w:p>
-      <w:pPr>
-        <w:pBdr>
-          <w:bottom w:val="single" w:sz="10" w:space="4" w:color="1F4E79"/>
-        </w:pBdr>
-        <w:spacing w:before="320" w:after="160"/>
-        <w:rPr>
-          <w:b/>
-          <w:bCs/>
-          <w:color w:val="1F4E79"/>
-          <w:sz w:val="26"/>
-          <w:szCs w:val="26"/>
-        </w:rPr>
-      </w:pPr>
-    </w:p>
-    <w:p>
-      <w:pPr>
-        <w:pBdr>
-          <w:bottom w:val="single" w:sz="10" w:space="4" w:color="1F4E79"/>
-        </w:pBdr>
-        <w:spacing w:before="320" w:after="160"/>
-        <w:rPr>
-          <w:b/>
-          <w:bCs/>
-          <w:color w:val="1F4E79"/>
-          <w:sz w:val="26"/>
-          <w:szCs w:val="26"/>
-        </w:rPr>
-      </w:pPr>
-    </w:p>
-    <w:p>
-      <w:pPr>
-        <w:pBdr>
-          <w:bottom w:val="single" w:sz="10" w:space="4" w:color="1F4E79"/>
-        </w:pBdr>
-        <w:spacing w:before="320" w:after="160"/>
-        <w:rPr>
-          <w:b/>
-          <w:bCs/>
-          <w:color w:val="1F4E79"/>
-          <w:sz w:val="26"/>
-          <w:szCs w:val="26"/>
-        </w:rPr>
-      </w:pPr>
-    </w:p>
-    <w:p>
-      <w:pPr>
-        <w:pBdr>
-          <w:bottom w:val="single" w:sz="10" w:space="4" w:color="1F4E79"/>
-        </w:pBdr>
-        <w:spacing w:before="320" w:after="160"/>
-        <w:rPr>
-          <w:b/>
-          <w:bCs/>
-          <w:color w:val="1F4E79"/>
-          <w:sz w:val="26"/>
-          <w:szCs w:val="26"/>
-        </w:rPr>
-      </w:pPr>
-    </w:p>
     <w:p>
       <w:pPr>
         <w:pBdr>
@@ -1800,7 +2008,7 @@
               <w:bottom w:val="single" w:sz="1" w:space="0" w:color="AAAAAA"/>
               <w:right w:val="single" w:sz="1" w:space="0" w:color="AAAAAA"/>
             </w:tcBorders>
-            <w:shd w:val="clear" w:color="auto" w:fill="1F4E79"/>
+            <w:shd w:val="clear" w:color="auto" w:fill="153D63" w:themeFill="text2" w:themeFillTint="E6"/>
             <w:tcMar>
               <w:top w:w="80" w:type="dxa"/>
               <w:left w:w="120" w:type="dxa"/>
@@ -1834,7 +2042,7 @@
               <w:bottom w:val="single" w:sz="1" w:space="0" w:color="AAAAAA"/>
               <w:right w:val="single" w:sz="1" w:space="0" w:color="AAAAAA"/>
             </w:tcBorders>
-            <w:shd w:val="clear" w:color="auto" w:fill="1F4E79"/>
+            <w:shd w:val="clear" w:color="auto" w:fill="153D63" w:themeFill="text2" w:themeFillTint="E6"/>
             <w:tcMar>
               <w:top w:w="80" w:type="dxa"/>
               <w:left w:w="120" w:type="dxa"/>
@@ -1890,7 +2098,7 @@
               <w:bottom w:val="single" w:sz="1" w:space="0" w:color="AAAAAA"/>
               <w:right w:val="single" w:sz="1" w:space="0" w:color="AAAAAA"/>
             </w:tcBorders>
-            <w:shd w:val="clear" w:color="auto" w:fill="F2F2F2" w:themeFill="background1" w:themeFillShade="F2"/>
+            <w:shd w:val="clear" w:color="auto" w:fill="FFFFFF" w:themeFill="background1"/>
             <w:tcMar>
               <w:top w:w="80" w:type="dxa"/>
               <w:left w:w="120" w:type="dxa"/>
@@ -1919,7 +2127,7 @@
               <w:bottom w:val="single" w:sz="1" w:space="0" w:color="AAAAAA"/>
               <w:right w:val="single" w:sz="1" w:space="0" w:color="AAAAAA"/>
             </w:tcBorders>
-            <w:shd w:val="clear" w:color="auto" w:fill="F2F2F2" w:themeFill="background1" w:themeFillShade="F2"/>
+            <w:shd w:val="clear" w:color="auto" w:fill="FFFFFF" w:themeFill="background1"/>
             <w:tcMar>
               <w:top w:w="80" w:type="dxa"/>
               <w:left w:w="120" w:type="dxa"/>
@@ -1997,7 +2205,7 @@
               <w:bottom w:val="single" w:sz="1" w:space="0" w:color="AAAAAA"/>
               <w:right w:val="single" w:sz="1" w:space="0" w:color="AAAAAA"/>
             </w:tcBorders>
-            <w:shd w:val="clear" w:color="auto" w:fill="1F4E79"/>
+            <w:shd w:val="clear" w:color="auto" w:fill="153D63" w:themeFill="text2" w:themeFillTint="E6"/>
             <w:tcMar>
               <w:top w:w="80" w:type="dxa"/>
               <w:left w:w="120" w:type="dxa"/>
@@ -2031,7 +2239,7 @@
               <w:bottom w:val="single" w:sz="1" w:space="0" w:color="AAAAAA"/>
               <w:right w:val="single" w:sz="1" w:space="0" w:color="AAAAAA"/>
             </w:tcBorders>
-            <w:shd w:val="clear" w:color="auto" w:fill="1F4E79"/>
+            <w:shd w:val="clear" w:color="auto" w:fill="153D63" w:themeFill="text2" w:themeFillTint="E6"/>
             <w:tcMar>
               <w:top w:w="80" w:type="dxa"/>
               <w:left w:w="120" w:type="dxa"/>
@@ -2087,7 +2295,7 @@
               <w:bottom w:val="single" w:sz="1" w:space="0" w:color="AAAAAA"/>
               <w:right w:val="single" w:sz="1" w:space="0" w:color="AAAAAA"/>
             </w:tcBorders>
-            <w:shd w:val="clear" w:color="auto" w:fill="F2F2F2" w:themeFill="background1" w:themeFillShade="F2"/>
+            <w:shd w:val="clear" w:color="auto" w:fill="FFFFFF" w:themeFill="background1"/>
             <w:tcMar>
               <w:top w:w="80" w:type="dxa"/>
               <w:left w:w="120" w:type="dxa"/>
@@ -2116,7 +2324,7 @@
               <w:bottom w:val="single" w:sz="1" w:space="0" w:color="AAAAAA"/>
               <w:right w:val="single" w:sz="1" w:space="0" w:color="AAAAAA"/>
             </w:tcBorders>
-            <w:shd w:val="clear" w:color="auto" w:fill="F2F2F2" w:themeFill="background1" w:themeFillShade="F2"/>
+            <w:shd w:val="clear" w:color="auto" w:fill="FFFFFF" w:themeFill="background1"/>
             <w:tcMar>
               <w:top w:w="80" w:type="dxa"/>
               <w:left w:w="120" w:type="dxa"/>

</xml_diff>